<commit_message>
Lab 1 checkpoint: analysis reports logs and tools
</commit_message>
<xml_diff>
--- a/DM2026-Lab1-Master-Questions.docx
+++ b/DM2026-Lab1-Master-Questions.docx
@@ -1,6 +1,6 @@
 
 <file path=word/document.xml><?xml version="1.0" encoding="utf-8"?>
-<w:document xmlns:wpc="http://schemas.microsoft.com/office/word/2010/wordprocessingCanvas" xmlns:cx="http://schemas.microsoft.com/office/drawing/2014/chartex" xmlns:cx1="http://schemas.microsoft.com/office/drawing/2015/9/8/chartex" xmlns:cx2="http://schemas.microsoft.com/office/drawing/2015/10/21/chartex" xmlns:cx3="http://schemas.microsoft.com/office/drawing/2016/5/9/chartex" xmlns:cx4="http://schemas.microsoft.com/office/drawing/2016/5/10/chartex" xmlns:cx5="http://schemas.microsoft.com/office/drawing/2016/5/11/chartex" xmlns:cx6="http://schemas.microsoft.com/office/drawing/2016/5/12/chartex" xmlns:cx7="http://schemas.microsoft.com/office/drawing/2016/5/13/chartex" xmlns:cx8="http://schemas.microsoft.com/office/drawing/2016/5/14/chartex" xmlns:mc="http://schemas.openxmlformats.org/markup-compatibility/2006" xmlns:aink="http://schemas.microsoft.com/office/drawing/2016/ink" xmlns:am3d="http://schemas.microsoft.com/office/drawing/2017/model3d" xmlns:o="urn:schemas-microsoft-com:office:office" xmlns:oel="http://schemas.microsoft.com/office/2019/extlst" xmlns:r="http://schemas.openxmlformats.org/officeDocument/2006/relationships" xmlns:m="http://schemas.openxmlformats.org/officeDocument/2006/math" xmlns:v="urn:schemas-microsoft-com:vml" xmlns:wp14="http://schemas.microsoft.com/office/word/2010/wordprocessingDrawing" xmlns:wp="http://schemas.openxmlformats.org/drawingml/2006/wordprocessingDrawing" xmlns:w10="urn:schemas-microsoft-com:office:word" xmlns:w="http://schemas.openxmlformats.org/wordprocessingml/2006/main" xmlns:w14="http://schemas.microsoft.com/office/word/2010/wordml" xmlns:w15="http://schemas.microsoft.com/office/word/2012/wordml" xmlns:w16cex="http://schemas.microsoft.com/office/word/2018/wordml/cex" xmlns:w16cid="http://schemas.microsoft.com/office/word/2016/wordml/cid" xmlns:w16="http://schemas.microsoft.com/office/word/2018/wordml" xmlns:w16du="http://schemas.microsoft.com/office/word/2023/wordml/word16du" xmlns:w16sdtdh="http://schemas.microsoft.com/office/word/2020/wordml/sdtdatahash" xmlns:w16sdtfl="http://schemas.microsoft.com/office/word/2024/wordml/sdtformatlock" xmlns:w16se="http://schemas.microsoft.com/office/word/2015/wordml/symex" xmlns:wpg="http://schemas.microsoft.com/office/word/2010/wordprocessingGroup" xmlns:wpi="http://schemas.microsoft.com/office/word/2010/wordprocessingInk" xmlns:wne="http://schemas.microsoft.com/office/word/2006/wordml" xmlns:wps="http://schemas.microsoft.com/office/word/2010/wordprocessingShape" mc:Ignorable="w14 w15 w16se w16cid w16 w16cex w16sdtdh w16sdtfl w16du wp14">
+<w:document xmlns:wpc="http://schemas.microsoft.com/office/word/2010/wordprocessingCanvas" xmlns:cx="http://schemas.microsoft.com/office/drawing/2014/chartex" xmlns:cx1="http://schemas.microsoft.com/office/drawing/2015/9/8/chartex" xmlns:cx2="http://schemas.microsoft.com/office/drawing/2015/10/21/chartex" xmlns:cx3="http://schemas.microsoft.com/office/drawing/2016/5/9/chartex" xmlns:cx4="http://schemas.microsoft.com/office/drawing/2016/5/10/chartex" xmlns:cx5="http://schemas.microsoft.com/office/drawing/2016/5/11/chartex" xmlns:cx6="http://schemas.microsoft.com/office/drawing/2016/5/12/chartex" xmlns:cx7="http://schemas.microsoft.com/office/drawing/2016/5/13/chartex" xmlns:cx8="http://schemas.microsoft.com/office/drawing/2016/5/14/chartex" xmlns:mc="http://schemas.openxmlformats.org/markup-compatibility/2006" xmlns:m="http://schemas.openxmlformats.org/officeDocument/2006/math" xmlns:aink="http://schemas.microsoft.com/office/drawing/2016/ink" xmlns:am3d="http://schemas.microsoft.com/office/drawing/2017/model3d" xmlns:oel="http://schemas.microsoft.com/office/2019/extlst" xmlns:r="http://schemas.openxmlformats.org/officeDocument/2006/relationships" xmlns:wp14="http://schemas.microsoft.com/office/word/2010/wordprocessingDrawing" xmlns:wp="http://schemas.openxmlformats.org/drawingml/2006/wordprocessingDrawing" xmlns:wpg="http://schemas.microsoft.com/office/word/2010/wordprocessingGroup" xmlns:wpi="http://schemas.microsoft.com/office/word/2010/wordprocessingInk" xmlns:wps="http://schemas.microsoft.com/office/word/2010/wordprocessingShape" xmlns:o="urn:schemas-microsoft-com:office:office" xmlns:v="urn:schemas-microsoft-com:vml" xmlns:w10="urn:schemas-microsoft-com:office:word" xmlns:w="http://schemas.openxmlformats.org/wordprocessingml/2006/main" xmlns:w14="http://schemas.microsoft.com/office/word/2010/wordml" xmlns:w15="http://schemas.microsoft.com/office/word/2012/wordml" xmlns:w16cex="http://schemas.microsoft.com/office/word/2018/wordml/cex" xmlns:w16cid="http://schemas.microsoft.com/office/word/2016/wordml/cid" xmlns:w16="http://schemas.microsoft.com/office/word/2018/wordml" xmlns:w16sdtdh="http://schemas.microsoft.com/office/word/2020/wordml/sdtdatahash" xmlns:w16sdtfl="http://schemas.microsoft.com/office/word/2024/wordml/sdtformatlock" xmlns:w16se="http://schemas.microsoft.com/office/word/2015/wordml/symex" xmlns:w16du="http://schemas.microsoft.com/office/word/2023/wordml/word16du" xmlns:wne="http://schemas.microsoft.com/office/word/2006/wordml" mc:Ignorable="w14 w15 w16se w16cid w16 w16cex w16sdtdh w16sdtfl w16du wp14">
   <w:body>
     <w:p>
       <w:pPr>
@@ -95,10 +95,15 @@
       </w:pPr>
       <w:r>
         <w:rPr>
-          <w:rFonts w:ascii="Century Schoolbook" w:hAnsi="Century Schoolbook"/>
-        </w:rPr>
-        <w:pict w14:anchorId="12157EBA">
-          <v:rect id="_x0000_i1025" style="width:0;height:1.5pt" o:hralign="center" o:hrstd="t" o:hr="t" fillcolor="#a0a0a0" stroked="f"/>
+          <w:noProof/>
+        </w:rPr>
+      </w:r>
+      <w:r>
+        <w:pict w14:anchorId="115DBB5C">
+          <v:rect id="Horizontal Line 1" o:spid="_x0000_s2062" style="width:451.3pt;height:1.1pt;visibility:visible;mso-wrap-style:square;mso-left-percent:-10001;mso-top-percent:-10001;mso-position-horizontal:absolute;mso-position-horizontal-relative:char;mso-position-vertical:absolute;mso-position-vertical-relative:line;mso-left-percent:-10001;mso-top-percent:-10001;v-text-anchor:top" o:gfxdata="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" filled="f">
+            <o:lock v:ext="edit" rotation="t" aspectratio="t" verticies="t" text="t" shapetype="t"/>
+            <w10:anchorlock/>
+          </v:rect>
         </w:pict>
       </w:r>
     </w:p>
@@ -195,6 +200,22 @@
         </w:rPr>
         <w:t>English Name:</w:t>
       </w:r>
+      <w:r>
+        <w:rPr>
+          <w:rFonts w:ascii="Century Schoolbook" w:hAnsi="Century Schoolbook" w:hint="eastAsia"/>
+          <w:b/>
+          <w:bCs/>
+        </w:rPr>
+        <w:t xml:space="preserve"> </w:t>
+      </w:r>
+      <w:r>
+        <w:rPr>
+          <w:rFonts w:ascii="Century Schoolbook" w:hAnsi="Century Schoolbook"/>
+          <w:b/>
+          <w:bCs/>
+        </w:rPr>
+        <w:t>Shao Chien,Chang</w:t>
+      </w:r>
     </w:p>
     <w:p>
       <w:pPr>
@@ -215,6 +236,14 @@
         </w:rPr>
         <w:t>Chinese Name:</w:t>
       </w:r>
+      <w:r>
+        <w:rPr>
+          <w:rFonts w:ascii="Century Schoolbook" w:hAnsi="Century Schoolbook" w:hint="eastAsia"/>
+          <w:b/>
+          <w:bCs/>
+        </w:rPr>
+        <w:t>張劭謙</w:t>
+      </w:r>
     </w:p>
     <w:p>
       <w:pPr>
@@ -224,7 +253,7 @@
         </w:numPr>
         <w:jc w:val="both"/>
         <w:rPr>
-          <w:rFonts w:ascii="Century Schoolbook" w:hAnsi="Century Schoolbook"/>
+          <w:rFonts w:ascii="Century Schoolbook" w:hAnsi="Century Schoolbook" w:hint="eastAsia"/>
         </w:rPr>
       </w:pPr>
       <w:r>
@@ -234,6 +263,22 @@
           <w:bCs/>
         </w:rPr>
         <w:t>Email:</w:t>
+      </w:r>
+      <w:r>
+        <w:rPr>
+          <w:rFonts w:ascii="Century Schoolbook" w:hAnsi="Century Schoolbook" w:hint="eastAsia"/>
+          <w:b/>
+          <w:bCs/>
+        </w:rPr>
+        <w:t xml:space="preserve"> </w:t>
+      </w:r>
+      <w:r>
+        <w:rPr>
+          <w:rFonts w:ascii="Century Schoolbook" w:hAnsi="Century Schoolbook"/>
+          <w:b/>
+          <w:bCs/>
+        </w:rPr>
+        <w:t>s1234560108@gmail.com</w:t>
       </w:r>
     </w:p>
     <w:p>
@@ -255,6 +300,14 @@
         </w:rPr>
         <w:t>Student ID:</w:t>
       </w:r>
+      <w:r>
+        <w:rPr>
+          <w:rFonts w:ascii="Century Schoolbook" w:hAnsi="Century Schoolbook"/>
+          <w:b/>
+          <w:bCs/>
+        </w:rPr>
+        <w:t>114024514</w:t>
+      </w:r>
     </w:p>
     <w:p>
       <w:pPr>
@@ -275,20 +328,33 @@
         </w:rPr>
         <w:t>University:</w:t>
       </w:r>
-    </w:p>
-    <w:p>
-      <w:pPr>
-        <w:jc w:val="both"/>
-        <w:rPr>
-          <w:rFonts w:ascii="Century Schoolbook" w:hAnsi="Century Schoolbook"/>
-        </w:rPr>
-      </w:pPr>
-      <w:r>
-        <w:rPr>
-          <w:rFonts w:ascii="Century Schoolbook" w:hAnsi="Century Schoolbook"/>
-        </w:rPr>
-        <w:pict w14:anchorId="5DAB6F00">
-          <v:rect id="_x0000_i1026" style="width:0;height:1.5pt" o:hralign="center" o:hrstd="t" o:hr="t" fillcolor="#a0a0a0" stroked="f"/>
+      <w:r>
+        <w:rPr>
+          <w:rFonts w:ascii="Century Schoolbook" w:hAnsi="Century Schoolbook"/>
+          <w:b/>
+          <w:bCs/>
+        </w:rPr>
+        <w:t xml:space="preserve"> NTHU</w:t>
+      </w:r>
+    </w:p>
+    <w:p>
+      <w:pPr>
+        <w:jc w:val="both"/>
+        <w:rPr>
+          <w:rFonts w:ascii="Century Schoolbook" w:hAnsi="Century Schoolbook"/>
+        </w:rPr>
+      </w:pPr>
+      <w:r>
+        <w:rPr>
+          <w:noProof/>
+        </w:rPr>
+      </w:r>
+      <w:r>
+        <w:pict w14:anchorId="0DCC8012">
+          <v:rect id="Horizontal Line 2" o:spid="_x0000_s2061" style="width:451.3pt;height:1.1pt;visibility:visible;mso-wrap-style:square;mso-left-percent:-10001;mso-top-percent:-10001;mso-position-horizontal:absolute;mso-position-horizontal-relative:char;mso-position-vertical:absolute;mso-position-vertical-relative:line;mso-left-percent:-10001;mso-top-percent:-10001;v-text-anchor:top" o:gfxdata="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" filled="f">
+            <o:lock v:ext="edit" rotation="t" aspectratio="t" verticies="t" text="t" shapetype="t"/>
+            <w10:anchorlock/>
+          </v:rect>
         </w:pict>
       </w:r>
     </w:p>
@@ -449,35 +515,7 @@
         <w:rPr>
           <w:rFonts w:ascii="Century Schoolbook" w:hAnsi="Century Schoolbook"/>
         </w:rPr>
-        <w:t xml:space="preserve">Read the task; change parameters when asked (e.g. </w:t>
-      </w:r>
-      <w:proofErr w:type="spellStart"/>
-      <w:r>
-        <w:rPr>
-          <w:rFonts w:ascii="Century Schoolbook" w:hAnsi="Century Schoolbook"/>
-        </w:rPr>
-        <w:t>stop_words</w:t>
-      </w:r>
-      <w:proofErr w:type="spellEnd"/>
-      <w:r>
-        <w:rPr>
-          <w:rFonts w:ascii="Century Schoolbook" w:hAnsi="Century Schoolbook"/>
-        </w:rPr>
-        <w:t xml:space="preserve">, thresholds, k, </w:t>
-      </w:r>
-      <w:proofErr w:type="spellStart"/>
-      <w:r>
-        <w:rPr>
-          <w:rFonts w:ascii="Century Schoolbook" w:hAnsi="Century Schoolbook"/>
-        </w:rPr>
-        <w:t>minSup</w:t>
-      </w:r>
-      <w:proofErr w:type="spellEnd"/>
-      <w:r>
-        <w:rPr>
-          <w:rFonts w:ascii="Century Schoolbook" w:hAnsi="Century Schoolbook"/>
-        </w:rPr>
-        <w:t>).</w:t>
+        <w:t>Read the task; change parameters when asked (e.g. stop_words, thresholds, k, minSup).</w:t>
       </w:r>
     </w:p>
     <w:p>
@@ -937,7 +975,7 @@
     </w:p>
     <w:p>
       <w:pPr>
-        <w:pStyle w:val="ListParagraph"/>
+        <w:pStyle w:val="a9"/>
         <w:numPr>
           <w:ilvl w:val="0"/>
           <w:numId w:val="15"/>
@@ -978,16 +1016,16 @@
     </w:p>
     <w:p>
       <w:pPr>
-        <w:pStyle w:val="ListParagraph"/>
-        <w:jc w:val="both"/>
-        <w:rPr>
-          <w:rFonts w:ascii="Century Schoolbook" w:hAnsi="Century Schoolbook"/>
-        </w:rPr>
-      </w:pPr>
-    </w:p>
-    <w:p>
-      <w:pPr>
-        <w:pStyle w:val="ListParagraph"/>
+        <w:pStyle w:val="a9"/>
+        <w:jc w:val="both"/>
+        <w:rPr>
+          <w:rFonts w:ascii="Century Schoolbook" w:hAnsi="Century Schoolbook"/>
+        </w:rPr>
+      </w:pPr>
+    </w:p>
+    <w:p>
+      <w:pPr>
+        <w:pStyle w:val="a9"/>
         <w:numPr>
           <w:ilvl w:val="0"/>
           <w:numId w:val="15"/>
@@ -1042,16 +1080,16 @@
     </w:p>
     <w:p>
       <w:pPr>
-        <w:pStyle w:val="ListParagraph"/>
-        <w:jc w:val="both"/>
-        <w:rPr>
-          <w:rFonts w:ascii="Century Schoolbook" w:hAnsi="Century Schoolbook"/>
-        </w:rPr>
-      </w:pPr>
-    </w:p>
-    <w:p>
-      <w:pPr>
-        <w:pStyle w:val="ListParagraph"/>
+        <w:pStyle w:val="a9"/>
+        <w:jc w:val="both"/>
+        <w:rPr>
+          <w:rFonts w:ascii="Century Schoolbook" w:hAnsi="Century Schoolbook"/>
+        </w:rPr>
+      </w:pPr>
+    </w:p>
+    <w:p>
+      <w:pPr>
+        <w:pStyle w:val="a9"/>
         <w:numPr>
           <w:ilvl w:val="0"/>
           <w:numId w:val="15"/>
@@ -1087,21 +1125,7 @@
         <w:rPr>
           <w:rFonts w:ascii="Century Schoolbook" w:hAnsi="Century Schoolbook"/>
         </w:rPr>
-        <w:t xml:space="preserve"> or leave it blank only if you truly did not use AI for that question. References are still encouraged if you </w:t>
-      </w:r>
-      <w:proofErr w:type="gramStart"/>
-      <w:r>
-        <w:rPr>
-          <w:rFonts w:ascii="Century Schoolbook" w:hAnsi="Century Schoolbook"/>
-        </w:rPr>
-        <w:t>looked</w:t>
-      </w:r>
-      <w:proofErr w:type="gramEnd"/>
-      <w:r>
-        <w:rPr>
-          <w:rFonts w:ascii="Century Schoolbook" w:hAnsi="Century Schoolbook"/>
-        </w:rPr>
-        <w:t xml:space="preserve"> anything up.</w:t>
+        <w:t xml:space="preserve"> or leave it blank only if you truly did not use AI for that question. References are still encouraged if you looked anything up.</w:t>
       </w:r>
     </w:p>
     <w:p>
@@ -1291,11 +1315,15 @@
       </w:pPr>
       <w:r>
         <w:rPr>
-          <w:rFonts w:ascii="Century Schoolbook" w:hAnsi="Century Schoolbook"/>
-        </w:rPr>
-        <w:lastRenderedPageBreak/>
-        <w:pict w14:anchorId="14CE2D24">
-          <v:rect id="_x0000_i1027" style="width:0;height:1.5pt" o:hralign="center" o:hrstd="t" o:hr="t" fillcolor="#a0a0a0" stroked="f"/>
+          <w:noProof/>
+        </w:rPr>
+      </w:r>
+      <w:r>
+        <w:pict w14:anchorId="2C28C526">
+          <v:rect id="Horizontal Line 3" o:spid="_x0000_s2060" style="width:451.3pt;height:1.1pt;visibility:visible;mso-wrap-style:square;mso-left-percent:-10001;mso-top-percent:-10001;mso-position-horizontal:absolute;mso-position-horizontal-relative:char;mso-position-vertical:absolute;mso-position-vertical-relative:line;mso-left-percent:-10001;mso-top-percent:-10001;v-text-anchor:top" o:gfxdata="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" filled="f">
+            <o:lock v:ext="edit" rotation="t" aspectratio="t" verticies="t" text="t" shapetype="t"/>
+            <w10:anchorlock/>
+          </v:rect>
         </w:pict>
       </w:r>
     </w:p>
@@ -1380,21 +1408,7 @@
         <w:rPr>
           <w:rFonts w:ascii="Century Schoolbook" w:hAnsi="Century Schoolbook"/>
         </w:rPr>
-        <w:t xml:space="preserve"> Filter the </w:t>
-      </w:r>
-      <w:proofErr w:type="spellStart"/>
-      <w:r>
-        <w:rPr>
-          <w:rFonts w:ascii="Century Schoolbook" w:hAnsi="Century Schoolbook"/>
-        </w:rPr>
-        <w:t>dataframe</w:t>
-      </w:r>
-      <w:proofErr w:type="spellEnd"/>
-      <w:r>
-        <w:rPr>
-          <w:rFonts w:ascii="Century Schoolbook" w:hAnsi="Century Schoolbook"/>
-        </w:rPr>
-        <w:t xml:space="preserve"> </w:t>
+        <w:t xml:space="preserve"> Filter the dataframe </w:t>
       </w:r>
       <w:r>
         <w:rPr>
@@ -1410,7 +1424,6 @@
         </w:rPr>
         <w:t xml:space="preserve"> for the category </w:t>
       </w:r>
-      <w:proofErr w:type="spellStart"/>
       <w:r>
         <w:rPr>
           <w:rFonts w:ascii="Century Schoolbook" w:hAnsi="Century Schoolbook"/>
@@ -1419,7 +1432,6 @@
         </w:rPr>
         <w:t>sci.med</w:t>
       </w:r>
-      <w:proofErr w:type="spellEnd"/>
       <w:r>
         <w:rPr>
           <w:rFonts w:ascii="Century Schoolbook" w:hAnsi="Century Schoolbook"/>
@@ -1489,9 +1501,12 @@
     </w:p>
     <w:p>
       <w:pPr>
-        <w:jc w:val="both"/>
-        <w:rPr>
-          <w:rFonts w:ascii="Century Schoolbook" w:hAnsi="Century Schoolbook"/>
+        <w:pStyle w:val="Web"/>
+        <w:rPr>
+          <w:rFonts w:ascii="Century Schoolbook" w:hAnsi="Century Schoolbook"/>
+          <w:b/>
+          <w:bCs/>
+          <w:lang w:eastAsia="zh-TW"/>
         </w:rPr>
       </w:pPr>
       <w:r>
@@ -1502,12 +1517,102 @@
         </w:rPr>
         <w:t>Answer:</w:t>
       </w:r>
-    </w:p>
-    <w:p>
-      <w:pPr>
-        <w:jc w:val="both"/>
-        <w:rPr>
-          <w:rFonts w:ascii="Century Schoolbook" w:hAnsi="Century Schoolbook"/>
+      <w:r>
+        <w:rPr>
+          <w:rFonts w:ascii="Century Schoolbook" w:hAnsi="Century Schoolbook" w:hint="eastAsia"/>
+          <w:b/>
+          <w:bCs/>
+        </w:rPr>
+        <w:t xml:space="preserve"> </w:t>
+      </w:r>
+    </w:p>
+    <w:p>
+      <w:pPr>
+        <w:pStyle w:val="Web"/>
+        <w:rPr>
+          <w:color w:val="000000"/>
+          <w:lang w:eastAsia="zh-TW"/>
+        </w:rPr>
+      </w:pPr>
+      <w:r>
+        <w:rPr>
+          <w:color w:val="000000"/>
+        </w:rPr>
+        <w:t>1.</w:t>
+      </w:r>
+      <w:r>
+        <w:rPr>
+          <w:color w:val="000000"/>
+        </w:rPr>
+        <w:t xml:space="preserve"> </w:t>
+      </w:r>
+      <w:r>
+        <w:rPr>
+          <w:color w:val="000000"/>
+        </w:rPr>
+        <w:t>594</w:t>
+      </w:r>
+      <w:r>
+        <w:rPr>
+          <w:rStyle w:val="apple-converted-space"/>
+          <w:color w:val="000000"/>
+        </w:rPr>
+        <w:t> </w:t>
+      </w:r>
+      <w:r>
+        <w:rPr>
+          <w:color w:val="000000"/>
+        </w:rPr>
+        <w:t>documents</w:t>
+      </w:r>
+      <w:r>
+        <w:rPr>
+          <w:color w:val="000000"/>
+        </w:rPr>
+        <w:t xml:space="preserve">, </w:t>
+      </w:r>
+    </w:p>
+    <w:p>
+      <w:pPr>
+        <w:pStyle w:val="Web"/>
+        <w:rPr>
+          <w:color w:val="000000"/>
+        </w:rPr>
+      </w:pPr>
+      <w:r>
+        <w:rPr>
+          <w:color w:val="000000"/>
+        </w:rPr>
+        <w:t>2.</w:t>
+      </w:r>
+      <w:r>
+        <w:rPr>
+          <w:color w:val="000000"/>
+        </w:rPr>
+        <w:t xml:space="preserve"> </w:t>
+      </w:r>
+      <w:r>
+        <w:rPr>
+          <w:color w:val="000000"/>
+        </w:rPr>
+        <w:t>Filtering the dataset by category helps frequent pattern mining focus on a specific topic. It reduces the influence of unrelated documents and prevents important medical terms from being overlooked when analyzing the entire dataset. As a result, the discovered patterns are more relevant and meaningful for medical-related research.</w:t>
+      </w:r>
+    </w:p>
+    <w:p>
+      <w:pPr>
+        <w:jc w:val="both"/>
+        <w:rPr>
+          <w:rFonts w:ascii="Century Schoolbook" w:hAnsi="Century Schoolbook" w:hint="eastAsia"/>
+        </w:rPr>
+      </w:pPr>
+    </w:p>
+    <w:p>
+      <w:pPr>
+        <w:jc w:val="both"/>
+        <w:rPr>
+          <w:rFonts w:ascii="Century Schoolbook" w:hAnsi="Century Schoolbook"/>
+          <w:b/>
+          <w:bCs/>
         </w:rPr>
       </w:pPr>
       <w:r>
@@ -1521,15 +1626,35 @@
       <w:r>
         <w:rPr>
           <w:rFonts w:ascii="Century Schoolbook" w:hAnsi="Century Schoolbook"/>
-        </w:rPr>
-        <w:t xml:space="preserve"> Yes / No </w:t>
-      </w:r>
-    </w:p>
-    <w:p>
-      <w:pPr>
-        <w:jc w:val="both"/>
-        <w:rPr>
-          <w:rFonts w:ascii="Century Schoolbook" w:hAnsi="Century Schoolbook"/>
+          <w:b/>
+          <w:bCs/>
+        </w:rPr>
+        <w:t xml:space="preserve"> </w:t>
+      </w:r>
+      <w:r>
+        <w:rPr>
+          <w:rFonts w:ascii="Century Schoolbook" w:hAnsi="Century Schoolbook"/>
+          <w:b/>
+          <w:bCs/>
+        </w:rPr>
+        <w:t>Yes</w:t>
+      </w:r>
+      <w:r>
+        <w:rPr>
+          <w:rFonts w:ascii="Century Schoolbook" w:hAnsi="Century Schoolbook" w:hint="eastAsia"/>
+          <w:b/>
+          <w:bCs/>
+        </w:rPr>
+        <w:t xml:space="preserve"> </w:t>
+      </w:r>
+    </w:p>
+    <w:p>
+      <w:pPr>
+        <w:jc w:val="both"/>
+        <w:rPr>
+          <w:rFonts w:ascii="Century Schoolbook" w:hAnsi="Century Schoolbook"/>
+          <w:b/>
+          <w:bCs/>
         </w:rPr>
       </w:pPr>
       <w:r>
@@ -1543,9 +1668,19 @@
       <w:r>
         <w:rPr>
           <w:rFonts w:ascii="Century Schoolbook" w:hAnsi="Century Schoolbook"/>
+          <w:b/>
+          <w:bCs/>
         </w:rPr>
         <w:t xml:space="preserve"> </w:t>
       </w:r>
+      <w:r>
+        <w:rPr>
+          <w:rFonts w:ascii="Century Schoolbook" w:hAnsi="Century Schoolbook"/>
+          <w:b/>
+          <w:bCs/>
+        </w:rPr>
+        <w:t>Concept explanation and English editing</w:t>
+      </w:r>
     </w:p>
     <w:p>
       <w:pPr>
@@ -1568,20 +1703,45 @@
         </w:rPr>
         <w:t xml:space="preserve"> </w:t>
       </w:r>
-    </w:p>
-    <w:p>
-      <w:pPr>
-        <w:jc w:val="both"/>
-        <w:rPr>
-          <w:rFonts w:ascii="Century Schoolbook" w:hAnsi="Century Schoolbook"/>
-        </w:rPr>
-      </w:pPr>
-      <w:r>
-        <w:rPr>
-          <w:rFonts w:ascii="Century Schoolbook" w:hAnsi="Century Schoolbook"/>
-        </w:rPr>
-        <w:pict w14:anchorId="44A68543">
-          <v:rect id="_x0000_i1028" style="width:0;height:1.5pt" o:hralign="center" o:hrstd="t" o:hr="t" fillcolor="#a0a0a0" stroked="f"/>
+      <w:r>
+        <w:rPr>
+          <w:rFonts w:ascii="Century Schoolbook" w:hAnsi="Century Schoolbook"/>
+        </w:rPr>
+        <w:t xml:space="preserve"> </w:t>
+      </w:r>
+    </w:p>
+    <w:p>
+      <w:pPr>
+        <w:jc w:val="both"/>
+        <w:rPr>
+          <w:rFonts w:ascii="Century Schoolbook" w:hAnsi="Century Schoolbook"/>
+        </w:rPr>
+      </w:pPr>
+      <w:r>
+        <w:rPr>
+          <w:rFonts w:ascii="Century Schoolbook" w:hAnsi="Century Schoolbook"/>
+        </w:rPr>
+        <w:t>https://scikit-learn.org/stable/datasets/real_world.html#the-20-newsgroups-text-dataset</w:t>
+      </w:r>
+    </w:p>
+    <w:p>
+      <w:pPr>
+        <w:jc w:val="both"/>
+        <w:rPr>
+          <w:rFonts w:ascii="Century Schoolbook" w:hAnsi="Century Schoolbook"/>
+        </w:rPr>
+      </w:pPr>
+      <w:r>
+        <w:rPr>
+          <w:noProof/>
+        </w:rPr>
+      </w:r>
+      <w:r>
+        <w:pict w14:anchorId="6FCB2187">
+          <v:rect id="Horizontal Line 4" o:spid="_x0000_s2059" style="width:451.3pt;height:1.1pt;visibility:visible;mso-wrap-style:square;mso-left-percent:-10001;mso-top-percent:-10001;mso-position-horizontal:absolute;mso-position-horizontal-relative:char;mso-position-vertical:absolute;mso-position-vertical-relative:line;mso-left-percent:-10001;mso-top-percent:-10001;v-text-anchor:top" o:gfxdata="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" filled="f">
+            <o:lock v:ext="edit" rotation="t" aspectratio="t" verticies="t" text="t" shapetype="t"/>
+            <w10:anchorlock/>
+          </v:rect>
         </w:pict>
       </w:r>
     </w:p>
@@ -1624,21 +1784,115 @@
         </w:rPr>
         <w:t xml:space="preserve"> Section 4.1 — Question 2 (take home) (after the </w:t>
       </w:r>
-      <w:proofErr w:type="gramStart"/>
-      <w:r>
-        <w:rPr>
-          <w:rFonts w:ascii="Century Schoolbook" w:hAnsi="Century Schoolbook"/>
-          <w:b/>
-          <w:bCs/>
-        </w:rPr>
-        <w:t>dropna(</w:t>
-      </w:r>
-      <w:proofErr w:type="gramEnd"/>
-      <w:r>
-        <w:rPr>
-          <w:rFonts w:ascii="Century Schoolbook" w:hAnsi="Century Schoolbook"/>
-          <w:b/>
-          <w:bCs/>
+      <w:r>
+        <w:rPr>
+          <w:rFonts w:ascii="Century Schoolbook" w:hAnsi="Century Schoolbook"/>
+          <w:b/>
+          <w:bCs/>
+        </w:rPr>
+        <w:t>dropna()</w:t>
+      </w:r>
+      <w:r>
+        <w:rPr>
+          <w:rFonts w:ascii="Century Schoolbook" w:hAnsi="Century Schoolbook"/>
+        </w:rPr>
+        <w:t xml:space="preserve"> demonstration)</w:t>
+      </w:r>
+    </w:p>
+    <w:p>
+      <w:pPr>
+        <w:jc w:val="both"/>
+        <w:rPr>
+          <w:rFonts w:ascii="Century Schoolbook" w:hAnsi="Century Schoolbook"/>
+        </w:rPr>
+      </w:pPr>
+      <w:r>
+        <w:rPr>
+          <w:rFonts w:ascii="Century Schoolbook" w:hAnsi="Century Schoolbook"/>
+          <w:b/>
+          <w:bCs/>
+        </w:rPr>
+        <w:t>Task:</w:t>
+      </w:r>
+      <w:r>
+        <w:rPr>
+          <w:rFonts w:ascii="Century Schoolbook" w:hAnsi="Century Schoolbook"/>
+        </w:rPr>
+        <w:t xml:space="preserve"> </w:t>
+      </w:r>
+      <w:r>
+        <w:rPr>
+          <w:rFonts w:ascii="Century Schoolbook" w:hAnsi="Century Schoolbook"/>
+        </w:rPr>
+        <w:t xml:space="preserve">In Section 4.1, a dummy record with a missing value is injected and then removed using the </w:t>
+      </w:r>
+      <w:r>
+        <w:rPr>
+          <w:rFonts w:ascii="Century Schoolbook" w:hAnsi="Century Schoolbook"/>
+          <w:b/>
+          <w:bCs/>
+        </w:rPr>
+        <w:t>dropna()</w:t>
+      </w:r>
+      <w:r>
+        <w:rPr>
+          <w:rFonts w:ascii="Century Schoolbook" w:hAnsi="Century Schoolbook"/>
+        </w:rPr>
+        <w:t xml:space="preserve"> function.</w:t>
+      </w:r>
+    </w:p>
+    <w:p>
+      <w:pPr>
+        <w:jc w:val="both"/>
+        <w:rPr>
+          <w:rFonts w:ascii="Century Schoolbook" w:hAnsi="Century Schoolbook"/>
+        </w:rPr>
+      </w:pPr>
+      <w:r>
+        <w:rPr>
+          <w:rFonts w:ascii="Century Schoolbook" w:hAnsi="Century Schoolbook"/>
+          <w:b/>
+          <w:bCs/>
+        </w:rPr>
+        <w:t>Question:</w:t>
+      </w:r>
+      <w:r>
+        <w:rPr>
+          <w:rFonts w:ascii="Century Schoolbook" w:hAnsi="Century Schoolbook"/>
+        </w:rPr>
+        <w:t xml:space="preserve"> If 40% of documents were missing the </w:t>
+      </w:r>
+      <w:r>
+        <w:rPr>
+          <w:rFonts w:ascii="Century Schoolbook" w:hAnsi="Century Schoolbook"/>
+          <w:b/>
+          <w:bCs/>
+        </w:rPr>
+        <w:t>category_name</w:t>
+      </w:r>
+      <w:r>
+        <w:rPr>
+          <w:rFonts w:ascii="Century Schoolbook" w:hAnsi="Century Schoolbook"/>
+        </w:rPr>
+        <w:t xml:space="preserve"> label, why would simply dropping these rows (</w:t>
+      </w:r>
+      <w:r>
+        <w:rPr>
+          <w:rFonts w:ascii="Century Schoolbook" w:hAnsi="Century Schoolbook"/>
+        </w:rPr>
+        <w:t xml:space="preserve">with </w:t>
+      </w:r>
+      <w:r>
+        <w:rPr>
+          <w:rFonts w:ascii="Century Schoolbook" w:hAnsi="Century Schoolbook"/>
+          <w:b/>
+          <w:bCs/>
+        </w:rPr>
+        <w:t>dropna()</w:t>
+      </w:r>
+      <w:r>
+        <w:rPr>
+          <w:rFonts w:ascii="Century Schoolbook" w:hAnsi="Century Schoolbook"/>
         </w:rPr>
         <w:t>)</w:t>
       </w:r>
@@ -1646,7 +1900,188 @@
         <w:rPr>
           <w:rFonts w:ascii="Century Schoolbook" w:hAnsi="Century Schoolbook"/>
         </w:rPr>
-        <w:t xml:space="preserve"> demonstration)</w:t>
+        <w:t xml:space="preserve"> be a flawed data mining strategy? Name one objective alternative so the text data can still be utilized.</w:t>
+      </w:r>
+    </w:p>
+    <w:p>
+      <w:pPr>
+        <w:pStyle w:val="Web"/>
+        <w:rPr>
+          <w:rFonts w:ascii="Century Schoolbook" w:hAnsi="Century Schoolbook" w:hint="eastAsia"/>
+          <w:lang w:eastAsia="zh-TW"/>
+        </w:rPr>
+      </w:pPr>
+      <w:r>
+        <w:rPr>
+          <w:rFonts w:ascii="Century Schoolbook" w:hAnsi="Century Schoolbook"/>
+          <w:b/>
+          <w:bCs/>
+        </w:rPr>
+        <w:t>Answer:</w:t>
+      </w:r>
+      <w:r>
+        <w:rPr>
+          <w:rFonts w:ascii="Century Schoolbook" w:hAnsi="Century Schoolbook" w:hint="eastAsia"/>
+          <w:b/>
+          <w:bCs/>
+        </w:rPr>
+        <w:t xml:space="preserve"> </w:t>
+      </w:r>
+      <w:r>
+        <w:rPr>
+          <w:rFonts w:ascii="Century Schoolbook" w:hAnsi="Century Schoolbook"/>
+        </w:rPr>
+        <w:t>Dropping 40% of the documents would result in a significant loss of useful text data. It could also introduce selection bias if the missing labels are related to certain characteristics of the documents. Instead of removing these records, we can use the existing numerical category labels to recover the missing category names, assuming those labels are available and reliable.</w:t>
+      </w:r>
+    </w:p>
+    <w:p>
+      <w:pPr>
+        <w:jc w:val="both"/>
+        <w:rPr>
+          <w:rFonts w:ascii="Century Schoolbook" w:hAnsi="Century Schoolbook"/>
+        </w:rPr>
+      </w:pPr>
+      <w:r>
+        <w:rPr>
+          <w:rFonts w:ascii="Century Schoolbook" w:hAnsi="Century Schoolbook"/>
+          <w:b/>
+          <w:bCs/>
+        </w:rPr>
+        <w:t>AI used for this answer:</w:t>
+      </w:r>
+      <w:r>
+        <w:rPr>
+          <w:rFonts w:ascii="Century Schoolbook" w:hAnsi="Century Schoolbook"/>
+        </w:rPr>
+        <w:t xml:space="preserve"> Yes  </w:t>
+      </w:r>
+    </w:p>
+    <w:p>
+      <w:pPr>
+        <w:jc w:val="both"/>
+        <w:rPr>
+          <w:rFonts w:ascii="Century Schoolbook" w:hAnsi="Century Schoolbook"/>
+        </w:rPr>
+      </w:pPr>
+      <w:r>
+        <w:rPr>
+          <w:rFonts w:ascii="Century Schoolbook" w:hAnsi="Century Schoolbook"/>
+          <w:b/>
+          <w:bCs/>
+        </w:rPr>
+        <w:lastRenderedPageBreak/>
+        <w:t>If yes, how:</w:t>
+      </w:r>
+      <w:r>
+        <w:rPr>
+          <w:rFonts w:ascii="Century Schoolbook" w:hAnsi="Century Schoolbook"/>
+        </w:rPr>
+        <w:t xml:space="preserve"> </w:t>
+      </w:r>
+      <w:r>
+        <w:rPr>
+          <w:rFonts w:ascii="Century Schoolbook" w:hAnsi="Century Schoolbook"/>
+          <w:b/>
+          <w:bCs/>
+        </w:rPr>
+        <w:t>Concept explanation and English editing</w:t>
+      </w:r>
+    </w:p>
+    <w:p>
+      <w:pPr>
+        <w:jc w:val="both"/>
+        <w:rPr>
+          <w:rFonts w:ascii="Century Schoolbook" w:hAnsi="Century Schoolbook"/>
+        </w:rPr>
+      </w:pPr>
+      <w:r>
+        <w:rPr>
+          <w:rFonts w:ascii="Century Schoolbook" w:hAnsi="Century Schoolbook"/>
+          <w:b/>
+          <w:bCs/>
+        </w:rPr>
+        <w:t>External references (links):</w:t>
+      </w:r>
+      <w:r>
+        <w:rPr>
+          <w:rFonts w:ascii="Century Schoolbook" w:hAnsi="Century Schoolbook"/>
+        </w:rPr>
+        <w:t xml:space="preserve"> </w:t>
+      </w:r>
+    </w:p>
+    <w:p>
+      <w:pPr>
+        <w:jc w:val="both"/>
+        <w:rPr>
+          <w:rFonts w:ascii="Century Schoolbook" w:hAnsi="Century Schoolbook" w:hint="eastAsia"/>
+        </w:rPr>
+      </w:pPr>
+      <w:r>
+        <w:rPr>
+          <w:rFonts w:ascii="Century Schoolbook" w:hAnsi="Century Schoolbook"/>
+        </w:rPr>
+        <w:t>https://rasbt.github.io/mlxtend/user_guide/frequent_patterns/apriori/</w:t>
+      </w:r>
+    </w:p>
+    <w:p>
+      <w:pPr>
+        <w:jc w:val="both"/>
+        <w:rPr>
+          <w:rFonts w:ascii="Century Schoolbook" w:hAnsi="Century Schoolbook"/>
+        </w:rPr>
+      </w:pPr>
+      <w:r>
+        <w:rPr>
+          <w:noProof/>
+        </w:rPr>
+      </w:r>
+      <w:r>
+        <w:pict w14:anchorId="24CE6CB8">
+          <v:rect id="Horizontal Line 5" o:spid="_x0000_s2058" style="width:451.3pt;height:1.1pt;visibility:visible;mso-wrap-style:square;mso-left-percent:-10001;mso-top-percent:-10001;mso-position-horizontal:absolute;mso-position-horizontal-relative:char;mso-position-vertical:absolute;mso-position-vertical-relative:line;mso-left-percent:-10001;mso-top-percent:-10001;v-text-anchor:top" o:gfxdata="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" filled="f">
+            <o:lock v:ext="edit" rotation="t" aspectratio="t" verticies="t" text="t" shapetype="t"/>
+            <w10:anchorlock/>
+          </v:rect>
+        </w:pict>
+      </w:r>
+    </w:p>
+    <w:p>
+      <w:pPr>
+        <w:jc w:val="both"/>
+        <w:rPr>
+          <w:rFonts w:ascii="Century Schoolbook" w:hAnsi="Century Schoolbook"/>
+          <w:b/>
+          <w:bCs/>
+        </w:rPr>
+      </w:pPr>
+      <w:r>
+        <w:rPr>
+          <w:rFonts w:ascii="Century Schoolbook" w:hAnsi="Century Schoolbook"/>
+          <w:b/>
+          <w:bCs/>
+        </w:rPr>
+        <w:t>Question 3: Data Sampling Risks</w:t>
+      </w:r>
+    </w:p>
+    <w:p>
+      <w:pPr>
+        <w:jc w:val="both"/>
+        <w:rPr>
+          <w:rFonts w:ascii="Century Schoolbook" w:hAnsi="Century Schoolbook"/>
+        </w:rPr>
+      </w:pPr>
+      <w:r>
+        <w:rPr>
+          <w:rFonts w:ascii="Century Schoolbook" w:hAnsi="Century Schoolbook"/>
+          <w:b/>
+          <w:bCs/>
+        </w:rPr>
+        <w:t>Notebook:</w:t>
+      </w:r>
+      <w:r>
+        <w:rPr>
+          <w:rFonts w:ascii="Century Schoolbook" w:hAnsi="Century Schoolbook"/>
+        </w:rPr>
+        <w:t xml:space="preserve"> Section 5.1 — Question 3 (take home)</w:t>
       </w:r>
     </w:p>
     <w:p>
@@ -1674,392 +2109,15 @@
         <w:rPr>
           <w:rFonts w:ascii="Century Schoolbook" w:hAnsi="Century Schoolbook"/>
         </w:rPr>
-        <w:t xml:space="preserve">In Section 4.1, a dummy record with a missing value is injected and then removed using the </w:t>
-      </w:r>
-      <w:proofErr w:type="spellStart"/>
-      <w:proofErr w:type="gramStart"/>
-      <w:r>
-        <w:rPr>
-          <w:rFonts w:ascii="Century Schoolbook" w:hAnsi="Century Schoolbook"/>
-          <w:b/>
-          <w:bCs/>
-        </w:rPr>
-        <w:t>dropna</w:t>
-      </w:r>
-      <w:proofErr w:type="spellEnd"/>
-      <w:r>
-        <w:rPr>
-          <w:rFonts w:ascii="Century Schoolbook" w:hAnsi="Century Schoolbook"/>
-          <w:b/>
-          <w:bCs/>
-        </w:rPr>
-        <w:t>(</w:t>
-      </w:r>
-      <w:proofErr w:type="gramEnd"/>
-      <w:r>
-        <w:rPr>
-          <w:rFonts w:ascii="Century Schoolbook" w:hAnsi="Century Schoolbook"/>
-          <w:b/>
-          <w:bCs/>
-        </w:rPr>
-        <w:t>)</w:t>
-      </w:r>
-      <w:r>
-        <w:rPr>
-          <w:rFonts w:ascii="Century Schoolbook" w:hAnsi="Century Schoolbook"/>
-        </w:rPr>
-        <w:t xml:space="preserve"> function.</w:t>
-      </w:r>
-    </w:p>
-    <w:p>
-      <w:pPr>
-        <w:jc w:val="both"/>
-        <w:rPr>
-          <w:rFonts w:ascii="Century Schoolbook" w:hAnsi="Century Schoolbook"/>
-        </w:rPr>
-      </w:pPr>
-      <w:r>
-        <w:rPr>
-          <w:rFonts w:ascii="Century Schoolbook" w:hAnsi="Century Schoolbook"/>
-          <w:b/>
-          <w:bCs/>
-        </w:rPr>
-        <w:t>Question:</w:t>
-      </w:r>
-      <w:r>
-        <w:rPr>
-          <w:rFonts w:ascii="Century Schoolbook" w:hAnsi="Century Schoolbook"/>
-        </w:rPr>
-        <w:t xml:space="preserve"> If 40% of documents were missing the </w:t>
-      </w:r>
-      <w:proofErr w:type="spellStart"/>
-      <w:r>
-        <w:rPr>
-          <w:rFonts w:ascii="Century Schoolbook" w:hAnsi="Century Schoolbook"/>
-          <w:b/>
-          <w:bCs/>
-        </w:rPr>
-        <w:t>category_name</w:t>
-      </w:r>
-      <w:proofErr w:type="spellEnd"/>
-      <w:r>
-        <w:rPr>
-          <w:rFonts w:ascii="Century Schoolbook" w:hAnsi="Century Schoolbook"/>
-        </w:rPr>
-        <w:t xml:space="preserve"> label, why would simply dropping these rows (</w:t>
-      </w:r>
-      <w:r>
-        <w:rPr>
-          <w:rFonts w:ascii="Century Schoolbook" w:hAnsi="Century Schoolbook"/>
-        </w:rPr>
-        <w:t xml:space="preserve">with </w:t>
-      </w:r>
-      <w:proofErr w:type="spellStart"/>
-      <w:proofErr w:type="gramStart"/>
-      <w:r>
-        <w:rPr>
-          <w:rFonts w:ascii="Century Schoolbook" w:hAnsi="Century Schoolbook"/>
-          <w:b/>
-          <w:bCs/>
-        </w:rPr>
-        <w:t>dropna</w:t>
-      </w:r>
-      <w:proofErr w:type="spellEnd"/>
-      <w:r>
-        <w:rPr>
-          <w:rFonts w:ascii="Century Schoolbook" w:hAnsi="Century Schoolbook"/>
-          <w:b/>
-          <w:bCs/>
-        </w:rPr>
-        <w:t>(</w:t>
-      </w:r>
-      <w:proofErr w:type="gramEnd"/>
-      <w:r>
-        <w:rPr>
-          <w:rFonts w:ascii="Century Schoolbook" w:hAnsi="Century Schoolbook"/>
-          <w:b/>
-          <w:bCs/>
-        </w:rPr>
-        <w:t>)</w:t>
-      </w:r>
-      <w:r>
-        <w:rPr>
-          <w:rFonts w:ascii="Century Schoolbook" w:hAnsi="Century Schoolbook"/>
-        </w:rPr>
-        <w:t>)</w:t>
-      </w:r>
-      <w:r>
-        <w:rPr>
-          <w:rFonts w:ascii="Century Schoolbook" w:hAnsi="Century Schoolbook"/>
-        </w:rPr>
-        <w:t xml:space="preserve"> be a flawed data mining strategy? Name one objective alternative so the text data can still be utilized.</w:t>
-      </w:r>
-    </w:p>
-    <w:p>
-      <w:pPr>
-        <w:jc w:val="both"/>
-        <w:rPr>
-          <w:rFonts w:ascii="Century Schoolbook" w:hAnsi="Century Schoolbook"/>
-        </w:rPr>
-      </w:pPr>
-      <w:r>
-        <w:rPr>
-          <w:rFonts w:ascii="Century Schoolbook" w:hAnsi="Century Schoolbook"/>
-          <w:b/>
-          <w:bCs/>
-        </w:rPr>
-        <w:t>Answer:</w:t>
-      </w:r>
-    </w:p>
-    <w:p>
-      <w:pPr>
-        <w:jc w:val="both"/>
-        <w:rPr>
-          <w:rFonts w:ascii="Century Schoolbook" w:hAnsi="Century Schoolbook"/>
-        </w:rPr>
-      </w:pPr>
-      <w:r>
-        <w:rPr>
-          <w:rFonts w:ascii="Century Schoolbook" w:hAnsi="Century Schoolbook"/>
-          <w:b/>
-          <w:bCs/>
-        </w:rPr>
-        <w:t>AI used for this answer:</w:t>
-      </w:r>
-      <w:r>
-        <w:rPr>
-          <w:rFonts w:ascii="Century Schoolbook" w:hAnsi="Century Schoolbook"/>
-        </w:rPr>
-        <w:t xml:space="preserve"> Yes / No </w:t>
-      </w:r>
-    </w:p>
-    <w:p>
-      <w:pPr>
-        <w:jc w:val="both"/>
-        <w:rPr>
-          <w:rFonts w:ascii="Century Schoolbook" w:hAnsi="Century Schoolbook"/>
-        </w:rPr>
-      </w:pPr>
-      <w:r>
-        <w:rPr>
-          <w:rFonts w:ascii="Century Schoolbook" w:hAnsi="Century Schoolbook"/>
-          <w:b/>
-          <w:bCs/>
-        </w:rPr>
-        <w:t>If yes, how:</w:t>
-      </w:r>
-      <w:r>
-        <w:rPr>
-          <w:rFonts w:ascii="Century Schoolbook" w:hAnsi="Century Schoolbook"/>
-        </w:rPr>
-        <w:t xml:space="preserve"> </w:t>
-      </w:r>
-    </w:p>
-    <w:p>
-      <w:pPr>
-        <w:jc w:val="both"/>
-        <w:rPr>
-          <w:rFonts w:ascii="Century Schoolbook" w:hAnsi="Century Schoolbook"/>
-        </w:rPr>
-      </w:pPr>
-      <w:r>
-        <w:rPr>
-          <w:rFonts w:ascii="Century Schoolbook" w:hAnsi="Century Schoolbook"/>
-          <w:b/>
-          <w:bCs/>
-        </w:rPr>
-        <w:t>External references (links):</w:t>
-      </w:r>
-      <w:r>
-        <w:rPr>
-          <w:rFonts w:ascii="Century Schoolbook" w:hAnsi="Century Schoolbook"/>
-        </w:rPr>
-        <w:t xml:space="preserve"> </w:t>
-      </w:r>
-    </w:p>
-    <w:p>
-      <w:pPr>
-        <w:jc w:val="both"/>
-        <w:rPr>
-          <w:rFonts w:ascii="Century Schoolbook" w:hAnsi="Century Schoolbook"/>
-        </w:rPr>
-      </w:pPr>
-    </w:p>
-    <w:p>
-      <w:pPr>
-        <w:jc w:val="both"/>
-        <w:rPr>
-          <w:rFonts w:ascii="Century Schoolbook" w:hAnsi="Century Schoolbook"/>
-        </w:rPr>
-      </w:pPr>
-    </w:p>
-    <w:p>
-      <w:pPr>
-        <w:jc w:val="both"/>
-        <w:rPr>
-          <w:rFonts w:ascii="Century Schoolbook" w:hAnsi="Century Schoolbook"/>
-        </w:rPr>
-      </w:pPr>
-    </w:p>
-    <w:p>
-      <w:pPr>
-        <w:jc w:val="both"/>
-        <w:rPr>
-          <w:rFonts w:ascii="Century Schoolbook" w:hAnsi="Century Schoolbook"/>
-        </w:rPr>
-      </w:pPr>
-    </w:p>
-    <w:p>
-      <w:pPr>
-        <w:jc w:val="both"/>
-        <w:rPr>
-          <w:rFonts w:ascii="Century Schoolbook" w:hAnsi="Century Schoolbook"/>
-        </w:rPr>
-      </w:pPr>
-    </w:p>
-    <w:p>
-      <w:pPr>
-        <w:jc w:val="both"/>
-        <w:rPr>
-          <w:rFonts w:ascii="Century Schoolbook" w:hAnsi="Century Schoolbook"/>
-        </w:rPr>
-      </w:pPr>
-    </w:p>
-    <w:p>
-      <w:pPr>
-        <w:jc w:val="both"/>
-        <w:rPr>
-          <w:rFonts w:ascii="Century Schoolbook" w:hAnsi="Century Schoolbook"/>
-        </w:rPr>
-      </w:pPr>
-    </w:p>
-    <w:p>
-      <w:pPr>
-        <w:jc w:val="both"/>
-        <w:rPr>
-          <w:rFonts w:ascii="Century Schoolbook" w:hAnsi="Century Schoolbook"/>
-        </w:rPr>
-      </w:pPr>
-    </w:p>
-    <w:p>
-      <w:pPr>
-        <w:jc w:val="both"/>
-        <w:rPr>
-          <w:rFonts w:ascii="Century Schoolbook" w:hAnsi="Century Schoolbook"/>
-        </w:rPr>
-      </w:pPr>
-      <w:r>
-        <w:rPr>
-          <w:rFonts w:ascii="Century Schoolbook" w:hAnsi="Century Schoolbook"/>
-        </w:rPr>
-        <w:lastRenderedPageBreak/>
-        <w:pict w14:anchorId="4353243F">
-          <v:rect id="_x0000_i1029" style="width:0;height:1.5pt" o:hralign="center" o:hrstd="t" o:hr="t" fillcolor="#a0a0a0" stroked="f"/>
-        </w:pict>
-      </w:r>
-    </w:p>
-    <w:p>
-      <w:pPr>
-        <w:jc w:val="both"/>
-        <w:rPr>
-          <w:rFonts w:ascii="Century Schoolbook" w:hAnsi="Century Schoolbook"/>
-          <w:b/>
-          <w:bCs/>
-        </w:rPr>
-      </w:pPr>
-      <w:r>
-        <w:rPr>
-          <w:rFonts w:ascii="Century Schoolbook" w:hAnsi="Century Schoolbook"/>
-          <w:b/>
-          <w:bCs/>
-        </w:rPr>
-        <w:t>Question 3: Data Sampling Risks</w:t>
-      </w:r>
-    </w:p>
-    <w:p>
-      <w:pPr>
-        <w:jc w:val="both"/>
-        <w:rPr>
-          <w:rFonts w:ascii="Century Schoolbook" w:hAnsi="Century Schoolbook"/>
-        </w:rPr>
-      </w:pPr>
-      <w:r>
-        <w:rPr>
-          <w:rFonts w:ascii="Century Schoolbook" w:hAnsi="Century Schoolbook"/>
-          <w:b/>
-          <w:bCs/>
-        </w:rPr>
-        <w:t>Notebook:</w:t>
-      </w:r>
-      <w:r>
-        <w:rPr>
-          <w:rFonts w:ascii="Century Schoolbook" w:hAnsi="Century Schoolbook"/>
-        </w:rPr>
-        <w:t xml:space="preserve"> Section 5.1 — Question 3 (take home)</w:t>
-      </w:r>
-    </w:p>
-    <w:p>
-      <w:pPr>
-        <w:jc w:val="both"/>
-        <w:rPr>
-          <w:rFonts w:ascii="Century Schoolbook" w:hAnsi="Century Schoolbook"/>
-        </w:rPr>
-      </w:pPr>
-      <w:r>
-        <w:rPr>
-          <w:rFonts w:ascii="Century Schoolbook" w:hAnsi="Century Schoolbook"/>
-          <w:b/>
-          <w:bCs/>
-        </w:rPr>
-        <w:t>Task:</w:t>
-      </w:r>
-      <w:r>
-        <w:rPr>
-          <w:rFonts w:ascii="Century Schoolbook" w:hAnsi="Century Schoolbook"/>
-        </w:rPr>
-        <w:t xml:space="preserve"> </w:t>
-      </w:r>
-      <w:r>
-        <w:rPr>
-          <w:rFonts w:ascii="Century Schoolbook" w:hAnsi="Century Schoolbook"/>
-        </w:rPr>
         <w:t xml:space="preserve">In Section 5.1, the code uses </w:t>
       </w:r>
-      <w:proofErr w:type="spellStart"/>
-      <w:r>
-        <w:rPr>
-          <w:rFonts w:ascii="Century Schoolbook" w:hAnsi="Century Schoolbook"/>
-          <w:b/>
-          <w:bCs/>
-        </w:rPr>
-        <w:t>X_sample</w:t>
-      </w:r>
-      <w:proofErr w:type="spellEnd"/>
-      <w:r>
-        <w:rPr>
-          <w:rFonts w:ascii="Century Schoolbook" w:hAnsi="Century Schoolbook"/>
-          <w:b/>
-          <w:bCs/>
-        </w:rPr>
-        <w:t xml:space="preserve"> = </w:t>
-      </w:r>
-      <w:proofErr w:type="spellStart"/>
-      <w:r>
-        <w:rPr>
-          <w:rFonts w:ascii="Century Schoolbook" w:hAnsi="Century Schoolbook"/>
-          <w:b/>
-          <w:bCs/>
-        </w:rPr>
-        <w:t>X.sample</w:t>
-      </w:r>
-      <w:proofErr w:type="spellEnd"/>
-      <w:r>
-        <w:rPr>
-          <w:rFonts w:ascii="Century Schoolbook" w:hAnsi="Century Schoolbook"/>
-          <w:b/>
-          <w:bCs/>
-        </w:rPr>
-        <w:t>(n=1000)</w:t>
+      <w:r>
+        <w:rPr>
+          <w:rFonts w:ascii="Century Schoolbook" w:hAnsi="Century Schoolbook"/>
+          <w:b/>
+          <w:bCs/>
+        </w:rPr>
+        <w:t>X_sample = X.sample(n=1000)</w:t>
       </w:r>
       <w:r>
         <w:rPr>
@@ -2124,9 +2182,12 @@
     </w:p>
     <w:p>
       <w:pPr>
-        <w:jc w:val="both"/>
-        <w:rPr>
-          <w:rFonts w:ascii="Century Schoolbook" w:hAnsi="Century Schoolbook"/>
+        <w:pStyle w:val="Web"/>
+        <w:rPr>
+          <w:rFonts w:ascii="Century Schoolbook" w:hAnsi="Century Schoolbook"/>
+          <w:b/>
+          <w:bCs/>
+          <w:lang w:eastAsia="zh-TW"/>
         </w:rPr>
       </w:pPr>
       <w:r>
@@ -2137,34 +2198,114 @@
         </w:rPr>
         <w:t>Answer:</w:t>
       </w:r>
-    </w:p>
-    <w:p>
-      <w:pPr>
-        <w:jc w:val="both"/>
-        <w:rPr>
-          <w:rFonts w:ascii="Century Schoolbook" w:hAnsi="Century Schoolbook"/>
-        </w:rPr>
-      </w:pPr>
-      <w:r>
-        <w:rPr>
-          <w:rFonts w:ascii="Century Schoolbook" w:hAnsi="Century Schoolbook"/>
-          <w:b/>
-          <w:bCs/>
-        </w:rPr>
-        <w:t>AI used for this answer:</w:t>
-      </w:r>
-      <w:r>
-        <w:rPr>
-          <w:rFonts w:ascii="Century Schoolbook" w:hAnsi="Century Schoolbook"/>
-        </w:rPr>
-        <w:t xml:space="preserve"> Yes / No </w:t>
-      </w:r>
-    </w:p>
-    <w:p>
-      <w:pPr>
-        <w:jc w:val="both"/>
-        <w:rPr>
-          <w:rFonts w:ascii="Century Schoolbook" w:hAnsi="Century Schoolbook"/>
+      <w:r>
+        <w:rPr>
+          <w:rFonts w:ascii="Century Schoolbook" w:hAnsi="Century Schoolbook" w:hint="eastAsia"/>
+          <w:b/>
+          <w:bCs/>
+        </w:rPr>
+        <w:t xml:space="preserve"> </w:t>
+      </w:r>
+    </w:p>
+    <w:p>
+      <w:pPr>
+        <w:pStyle w:val="Web"/>
+        <w:rPr>
+          <w:rFonts w:ascii="Century Schoolbook" w:hAnsi="Century Schoolbook"/>
+        </w:rPr>
+      </w:pPr>
+      <w:r>
+        <w:rPr>
+          <w:rFonts w:ascii="Century Schoolbook" w:hAnsi="Century Schoolbook"/>
+        </w:rPr>
+        <w:t>The category proportions in the sample do not exactly match those in the original dataset. For example, the proportion of comp.graphics increases from 25.88% to 27.80%, while soc.religion.christian decreases from 26.54% to 24.80%.</w:t>
+      </w:r>
+    </w:p>
+    <w:p>
+      <w:pPr>
+        <w:spacing w:before="100" w:beforeAutospacing="1" w:after="100" w:afterAutospacing="1" w:line="240" w:lineRule="auto"/>
+        <w:rPr>
+          <w:rFonts w:ascii="Century Schoolbook" w:eastAsia="Times New Roman" w:hAnsi="Century Schoolbook" w:cs="Times New Roman" w:hint="eastAsia"/>
+          <w:kern w:val="0"/>
+          <w:sz w:val="24"/>
+          <w:szCs w:val="24"/>
+          <w14:ligatures w14:val="none"/>
+        </w:rPr>
+      </w:pPr>
+      <w:r>
+        <w:rPr>
+          <w:rFonts w:ascii="Century Schoolbook" w:eastAsia="Times New Roman" w:hAnsi="Century Schoolbook" w:cs="Times New Roman"/>
+          <w:kern w:val="0"/>
+          <w:sz w:val="24"/>
+          <w:szCs w:val="24"/>
+          <w:lang w:eastAsia="zh-CN"/>
+          <w14:ligatures w14:val="none"/>
+        </w:rPr>
+        <w:t>For highly imbalanced datasets, simple random sampling may select too few documents from minority categories or even miss them entirely. This could make the sample less representative and affect the analysis results. Stratified sampling can help preserve the original category proportions.</w:t>
+      </w:r>
+    </w:p>
+    <w:p>
+      <w:pPr>
+        <w:jc w:val="both"/>
+        <w:rPr>
+          <w:rFonts w:ascii="Century Schoolbook" w:eastAsia="Times New Roman" w:hAnsi="Century Schoolbook" w:cs="Times New Roman"/>
+          <w:b/>
+          <w:bCs/>
+          <w:kern w:val="0"/>
+          <w:sz w:val="24"/>
+          <w:szCs w:val="24"/>
+          <w:lang w:eastAsia="zh-CN"/>
+          <w14:ligatures w14:val="none"/>
+        </w:rPr>
+      </w:pPr>
+      <w:r>
+        <w:rPr>
+          <w:rFonts w:ascii="Century Schoolbook" w:eastAsia="Times New Roman" w:hAnsi="Century Schoolbook" w:cs="Times New Roman"/>
+          <w:b/>
+          <w:bCs/>
+          <w:kern w:val="0"/>
+          <w:sz w:val="24"/>
+          <w:szCs w:val="24"/>
+          <w:lang w:eastAsia="zh-CN"/>
+          <w14:ligatures w14:val="none"/>
+        </w:rPr>
+        <w:t>AI used</w:t>
+      </w:r>
+      <w:r>
+        <w:rPr>
+          <w:rFonts w:ascii="Century Schoolbook" w:eastAsia="Times New Roman" w:hAnsi="Century Schoolbook" w:cs="Times New Roman"/>
+          <w:kern w:val="0"/>
+          <w:sz w:val="24"/>
+          <w:szCs w:val="24"/>
+          <w:lang w:eastAsia="zh-CN"/>
+          <w14:ligatures w14:val="none"/>
+        </w:rPr>
+        <w:t xml:space="preserve"> </w:t>
+      </w:r>
+      <w:r>
+        <w:rPr>
+          <w:rFonts w:ascii="Century Schoolbook" w:eastAsia="Times New Roman" w:hAnsi="Century Schoolbook" w:cs="Times New Roman"/>
+          <w:b/>
+          <w:bCs/>
+          <w:kern w:val="0"/>
+          <w:sz w:val="24"/>
+          <w:szCs w:val="24"/>
+          <w:lang w:eastAsia="zh-CN"/>
+          <w14:ligatures w14:val="none"/>
+        </w:rPr>
+        <w:t xml:space="preserve">for this answer: Yes </w:t>
+      </w:r>
+    </w:p>
+    <w:p>
+      <w:pPr>
+        <w:jc w:val="both"/>
+        <w:rPr>
+          <w:rFonts w:ascii="Century Schoolbook" w:eastAsia="Times New Roman" w:hAnsi="Century Schoolbook" w:cs="Times New Roman" w:hint="eastAsia"/>
+          <w:kern w:val="0"/>
+          <w:sz w:val="24"/>
+          <w:szCs w:val="24"/>
+          <w:lang w:eastAsia="zh-CN"/>
+          <w14:ligatures w14:val="none"/>
         </w:rPr>
       </w:pPr>
       <w:r>
@@ -2181,6 +2322,17 @@
         </w:rPr>
         <w:t xml:space="preserve"> </w:t>
       </w:r>
+      <w:r>
+        <w:rPr>
+          <w:rFonts w:ascii="Century Schoolbook" w:eastAsia="Times New Roman" w:hAnsi="Century Schoolbook" w:cs="Times New Roman"/>
+          <w:kern w:val="0"/>
+          <w:sz w:val="24"/>
+          <w:szCs w:val="24"/>
+          <w:lang w:eastAsia="zh-CN"/>
+          <w14:ligatures w14:val="none"/>
+        </w:rPr>
+        <w:t>Concept explanation and English editing.</w:t>
+      </w:r>
     </w:p>
     <w:p>
       <w:pPr>
@@ -2215,8 +2367,27 @@
         <w:rPr>
           <w:rFonts w:ascii="Century Schoolbook" w:hAnsi="Century Schoolbook"/>
         </w:rPr>
-        <w:pict w14:anchorId="67A2549C">
-          <v:rect id="_x0000_i1030" style="width:0;height:1.5pt" o:hralign="center" o:hrstd="t" o:hr="t" fillcolor="#a0a0a0" stroked="f"/>
+        <w:t>https://scikit-learn.org/stable/modules/generated/sklearn.model_selection.StratifiedShuffleSplit.html?utm_source=chatgpt.com</w:t>
+      </w:r>
+    </w:p>
+    <w:p>
+      <w:pPr>
+        <w:jc w:val="both"/>
+        <w:rPr>
+          <w:rFonts w:ascii="Century Schoolbook" w:hAnsi="Century Schoolbook"/>
+        </w:rPr>
+      </w:pPr>
+      <w:r>
+        <w:rPr>
+          <w:noProof/>
+        </w:rPr>
+      </w:r>
+      <w:r>
+        <w:pict w14:anchorId="05AB7E9D">
+          <v:rect id="Horizontal Line 6" o:spid="_x0000_s2057" style="width:451.3pt;height:1.1pt;visibility:visible;mso-wrap-style:square;mso-left-percent:-10001;mso-top-percent:-10001;mso-position-horizontal:absolute;mso-position-horizontal-relative:char;mso-position-vertical:absolute;mso-position-vertical-relative:line;mso-left-percent:-10001;mso-top-percent:-10001;v-text-anchor:top" o:gfxdata="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" filled="f">
+            <o:lock v:ext="edit" rotation="t" aspectratio="t" verticies="t" text="t" shapetype="t"/>
+            <w10:anchorlock/>
+          </v:rect>
         </w:pict>
       </w:r>
     </w:p>
@@ -2287,7 +2458,6 @@
         </w:rPr>
         <w:t xml:space="preserve">In Section 5.3, the </w:t>
       </w:r>
-      <w:proofErr w:type="spellStart"/>
       <w:r>
         <w:rPr>
           <w:rFonts w:ascii="Century Schoolbook" w:hAnsi="Century Schoolbook"/>
@@ -2296,48 +2466,19 @@
         </w:rPr>
         <w:t>CountVectorizer</w:t>
       </w:r>
-      <w:proofErr w:type="spellEnd"/>
       <w:r>
         <w:rPr>
           <w:rFonts w:ascii="Century Schoolbook" w:hAnsi="Century Schoolbook"/>
         </w:rPr>
         <w:t xml:space="preserve"> converts text into a document-term matrix using </w:t>
       </w:r>
-      <w:proofErr w:type="spellStart"/>
-      <w:r>
-        <w:rPr>
-          <w:rFonts w:ascii="Century Schoolbook" w:hAnsi="Century Schoolbook"/>
-          <w:b/>
-          <w:bCs/>
-        </w:rPr>
-        <w:t>stop_words</w:t>
-      </w:r>
-      <w:proofErr w:type="spellEnd"/>
-      <w:r>
-        <w:rPr>
-          <w:rFonts w:ascii="Century Schoolbook" w:hAnsi="Century Schoolbook"/>
-          <w:b/>
-          <w:bCs/>
-        </w:rPr>
-        <w:t>='</w:t>
-      </w:r>
-      <w:proofErr w:type="spellStart"/>
-      <w:r>
-        <w:rPr>
-          <w:rFonts w:ascii="Century Schoolbook" w:hAnsi="Century Schoolbook"/>
-          <w:b/>
-          <w:bCs/>
-        </w:rPr>
-        <w:t>english</w:t>
-      </w:r>
-      <w:proofErr w:type="spellEnd"/>
-      <w:r>
-        <w:rPr>
-          <w:rFonts w:ascii="Century Schoolbook" w:hAnsi="Century Schoolbook"/>
-          <w:b/>
-          <w:bCs/>
-        </w:rPr>
-        <w:t>’</w:t>
+      <w:r>
+        <w:rPr>
+          <w:rFonts w:ascii="Century Schoolbook" w:hAnsi="Century Schoolbook"/>
+          <w:b/>
+          <w:bCs/>
+        </w:rPr>
+        <w:t>stop_words='english’</w:t>
       </w:r>
       <w:r>
         <w:rPr>
@@ -2345,23 +2486,13 @@
         </w:rPr>
         <w:t xml:space="preserve">. Change this parameter to </w:t>
       </w:r>
-      <w:proofErr w:type="spellStart"/>
-      <w:r>
-        <w:rPr>
-          <w:rFonts w:ascii="Century Schoolbook" w:hAnsi="Century Schoolbook"/>
-          <w:b/>
-          <w:bCs/>
-        </w:rPr>
-        <w:t>stop_words</w:t>
-      </w:r>
-      <w:proofErr w:type="spellEnd"/>
-      <w:r>
-        <w:rPr>
-          <w:rFonts w:ascii="Century Schoolbook" w:hAnsi="Century Schoolbook"/>
-          <w:b/>
-          <w:bCs/>
-        </w:rPr>
-        <w:t>=None</w:t>
+      <w:r>
+        <w:rPr>
+          <w:rFonts w:ascii="Century Schoolbook" w:hAnsi="Century Schoolbook"/>
+          <w:b/>
+          <w:bCs/>
+        </w:rPr>
+        <w:t>stop_words=None</w:t>
       </w:r>
       <w:r>
         <w:rPr>
@@ -2369,7 +2500,6 @@
         </w:rPr>
         <w:t xml:space="preserve"> and re-run the cell to check the shape of </w:t>
       </w:r>
-      <w:proofErr w:type="spellStart"/>
       <w:r>
         <w:rPr>
           <w:rFonts w:ascii="Century Schoolbook" w:hAnsi="Century Schoolbook"/>
@@ -2378,7 +2508,6 @@
         </w:rPr>
         <w:t>X_counts</w:t>
       </w:r>
-      <w:proofErr w:type="spellEnd"/>
       <w:r>
         <w:rPr>
           <w:rFonts w:ascii="Century Schoolbook" w:hAnsi="Century Schoolbook"/>
@@ -2426,6 +2555,7 @@
         <w:rPr>
           <w:rFonts w:ascii="Century Schoolbook" w:hAnsi="Century Schoolbook"/>
         </w:rPr>
+        <w:lastRenderedPageBreak/>
         <w:t>Does the total number of features</w:t>
       </w:r>
       <w:r>
@@ -2457,28 +2587,16 @@
         <w:rPr>
           <w:rFonts w:ascii="Century Schoolbook" w:hAnsi="Century Schoolbook"/>
         </w:rPr>
-        <w:t xml:space="preserve">Since </w:t>
-      </w:r>
-      <w:proofErr w:type="spellStart"/>
-      <w:r>
-        <w:rPr>
-          <w:rFonts w:ascii="Century Schoolbook" w:hAnsi="Century Schoolbook"/>
-        </w:rPr>
-        <w:t>stopwords</w:t>
-      </w:r>
-      <w:proofErr w:type="spellEnd"/>
-      <w:r>
-        <w:rPr>
-          <w:rFonts w:ascii="Century Schoolbook" w:hAnsi="Century Schoolbook"/>
-        </w:rPr>
-        <w:t xml:space="preserve"> are highly common words that appear in almost all documents, what effect does adding them back have on the overall sparsity (the percentage of zeros) of the matrix?</w:t>
-      </w:r>
-    </w:p>
-    <w:p>
-      <w:pPr>
-        <w:jc w:val="both"/>
-        <w:rPr>
-          <w:rFonts w:ascii="Century Schoolbook" w:hAnsi="Century Schoolbook"/>
+        <w:t>Since stopwords are highly common words that appear in almost all documents, what effect does adding them back have on the overall sparsity (the percentage of zeros) of the matrix?</w:t>
+      </w:r>
+    </w:p>
+    <w:p>
+      <w:pPr>
+        <w:jc w:val="both"/>
+        <w:rPr>
+          <w:rFonts w:ascii="Century Schoolbook" w:hAnsi="Century Schoolbook"/>
+          <w:b/>
+          <w:bCs/>
         </w:rPr>
       </w:pPr>
       <w:r>
@@ -2492,6 +2610,42 @@
     </w:p>
     <w:p>
       <w:pPr>
+        <w:spacing w:before="100" w:beforeAutospacing="1" w:after="100" w:afterAutospacing="1" w:line="240" w:lineRule="auto"/>
+        <w:rPr>
+          <w:rFonts w:ascii="Century Schoolbook" w:hAnsi="Century Schoolbook"/>
+        </w:rPr>
+      </w:pPr>
+      <w:r>
+        <w:rPr>
+          <w:rFonts w:ascii="Century Schoolbook" w:hAnsi="Century Schoolbook"/>
+        </w:rPr>
+        <w:t>When changing stop_words='english' to stop_words=None, the number of features increased from 35,482 to 35,788 because common English stopwords were included.</w:t>
+      </w:r>
+    </w:p>
+    <w:p>
+      <w:pPr>
+        <w:spacing w:before="100" w:beforeAutospacing="1" w:after="100" w:afterAutospacing="1" w:line="240" w:lineRule="auto"/>
+        <w:rPr>
+          <w:rFonts w:ascii="Century Schoolbook" w:hAnsi="Century Schoolbook"/>
+        </w:rPr>
+      </w:pPr>
+      <w:r>
+        <w:rPr>
+          <w:rFonts w:ascii="Century Schoolbook" w:hAnsi="Century Schoolbook"/>
+        </w:rPr>
+        <w:t>The sparsity decreased slightly from 99.6772% to 99.5470%. This is because stopwords appear frequently across documents, adding more non-zero values to the document-term matrix and reducing the overall percentage of zeros.</w:t>
+      </w:r>
+    </w:p>
+    <w:p>
+      <w:pPr>
+        <w:jc w:val="both"/>
+        <w:rPr>
+          <w:rFonts w:ascii="Century Schoolbook" w:hAnsi="Century Schoolbook"/>
+        </w:rPr>
+      </w:pPr>
+    </w:p>
+    <w:p>
+      <w:pPr>
         <w:jc w:val="both"/>
         <w:rPr>
           <w:rFonts w:ascii="Century Schoolbook" w:hAnsi="Century Schoolbook"/>
@@ -2509,7 +2663,7 @@
         <w:rPr>
           <w:rFonts w:ascii="Century Schoolbook" w:hAnsi="Century Schoolbook"/>
         </w:rPr>
-        <w:t xml:space="preserve"> Yes / No </w:t>
+        <w:t xml:space="preserve"> Yes </w:t>
       </w:r>
     </w:p>
     <w:p>
@@ -2533,6 +2687,12 @@
         </w:rPr>
         <w:t xml:space="preserve"> </w:t>
       </w:r>
+      <w:r>
+        <w:rPr>
+          <w:rFonts w:ascii="Century Schoolbook" w:hAnsi="Century Schoolbook"/>
+        </w:rPr>
+        <w:t>Concept explanation and experimental result interpretation.</w:t>
+      </w:r>
     </w:p>
     <w:p>
       <w:pPr>
@@ -2560,64 +2720,42 @@
       <w:pPr>
         <w:jc w:val="both"/>
         <w:rPr>
-          <w:rFonts w:ascii="Century Schoolbook" w:hAnsi="Century Schoolbook"/>
-        </w:rPr>
-      </w:pPr>
-    </w:p>
-    <w:p>
-      <w:pPr>
-        <w:jc w:val="both"/>
-        <w:rPr>
-          <w:rFonts w:ascii="Century Schoolbook" w:hAnsi="Century Schoolbook"/>
-        </w:rPr>
-      </w:pPr>
-    </w:p>
-    <w:p>
-      <w:pPr>
-        <w:jc w:val="both"/>
-        <w:rPr>
-          <w:rFonts w:ascii="Century Schoolbook" w:hAnsi="Century Schoolbook"/>
-        </w:rPr>
-      </w:pPr>
-    </w:p>
-    <w:p>
-      <w:pPr>
-        <w:jc w:val="both"/>
-        <w:rPr>
-          <w:rFonts w:ascii="Century Schoolbook" w:hAnsi="Century Schoolbook"/>
-        </w:rPr>
-      </w:pPr>
-    </w:p>
-    <w:p>
-      <w:pPr>
-        <w:jc w:val="both"/>
-        <w:rPr>
-          <w:rFonts w:ascii="Century Schoolbook" w:hAnsi="Century Schoolbook"/>
-        </w:rPr>
-      </w:pPr>
-    </w:p>
-    <w:p>
-      <w:pPr>
-        <w:jc w:val="both"/>
-        <w:rPr>
-          <w:rFonts w:ascii="Century Schoolbook" w:hAnsi="Century Schoolbook"/>
-        </w:rPr>
-      </w:pPr>
-    </w:p>
-    <w:p>
-      <w:pPr>
-        <w:jc w:val="both"/>
-        <w:rPr>
-          <w:rFonts w:ascii="Century Schoolbook" w:hAnsi="Century Schoolbook"/>
-        </w:rPr>
-      </w:pPr>
-      <w:r>
-        <w:rPr>
-          <w:rFonts w:ascii="Century Schoolbook" w:hAnsi="Century Schoolbook"/>
-        </w:rPr>
-        <w:lastRenderedPageBreak/>
-        <w:pict w14:anchorId="5994C8B3">
-          <v:rect id="_x0000_i1031" style="width:0;height:1.5pt" o:hralign="center" o:hrstd="t" o:hr="t" fillcolor="#a0a0a0" stroked="f"/>
+          <w:rFonts w:ascii="Century Schoolbook" w:hAnsi="Century Schoolbook" w:hint="eastAsia"/>
+        </w:rPr>
+      </w:pPr>
+      <w:r>
+        <w:rPr>
+          <w:rFonts w:ascii="Century Schoolbook" w:hAnsi="Century Schoolbook"/>
+        </w:rPr>
+        <w:t>https://scikit-learn.org/stable/modules/generated/sklearn.feature_extraction.text.CountVectorizer.html?utm_source=chatgpt.com</w:t>
+      </w:r>
+    </w:p>
+    <w:p>
+      <w:pPr>
+        <w:jc w:val="both"/>
+        <w:rPr>
+          <w:rFonts w:ascii="Century Schoolbook" w:hAnsi="Century Schoolbook"/>
+        </w:rPr>
+      </w:pPr>
+    </w:p>
+    <w:p>
+      <w:pPr>
+        <w:jc w:val="both"/>
+        <w:rPr>
+          <w:rFonts w:ascii="Century Schoolbook" w:hAnsi="Century Schoolbook"/>
+        </w:rPr>
+      </w:pPr>
+      <w:r>
+        <w:rPr>
+          <w:noProof/>
+        </w:rPr>
+      </w:r>
+      <w:r>
+        <w:pict w14:anchorId="3A0574D8">
+          <v:rect id="Horizontal Line 7" o:spid="_x0000_s2056" style="width:451.3pt;height:1.1pt;visibility:visible;mso-wrap-style:square;mso-left-percent:-10001;mso-top-percent:-10001;mso-position-horizontal:absolute;mso-position-horizontal-relative:char;mso-position-vertical:absolute;mso-position-vertical-relative:line;mso-left-percent:-10001;mso-top-percent:-10001;v-text-anchor:top" o:gfxdata="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" filled="f">
+            <o:lock v:ext="edit" rotation="t" aspectratio="t" verticies="t" text="t" shapetype="t"/>
+            <w10:anchorlock/>
+          </v:rect>
         </w:pict>
       </w:r>
     </w:p>
@@ -2704,23 +2842,13 @@
         </w:rPr>
         <w:t xml:space="preserve">In the variance filtering section, re-run </w:t>
       </w:r>
-      <w:proofErr w:type="spellStart"/>
-      <w:r>
-        <w:rPr>
-          <w:rFonts w:ascii="Century Schoolbook" w:hAnsi="Century Schoolbook"/>
-          <w:b/>
-          <w:bCs/>
-        </w:rPr>
-        <w:t>variance_filter</w:t>
-      </w:r>
-      <w:proofErr w:type="spellEnd"/>
-      <w:r>
-        <w:rPr>
-          <w:rFonts w:ascii="Century Schoolbook" w:hAnsi="Century Schoolbook"/>
-          <w:b/>
-          <w:bCs/>
-        </w:rPr>
-        <w:t xml:space="preserve"> </w:t>
+      <w:r>
+        <w:rPr>
+          <w:rFonts w:ascii="Century Schoolbook" w:hAnsi="Century Schoolbook"/>
+          <w:b/>
+          <w:bCs/>
+        </w:rPr>
+        <w:t xml:space="preserve">variance_filter </w:t>
       </w:r>
       <w:r>
         <w:rPr>
@@ -2827,14 +2955,30 @@
         <w:rPr>
           <w:rFonts w:ascii="Century Schoolbook" w:hAnsi="Century Schoolbook"/>
         </w:rPr>
-        <w:t>Why is eliminating near-zero variance features considered a safe way to reduce dimensionality without harming model accuracy?</w:t>
-      </w:r>
-    </w:p>
-    <w:p>
-      <w:pPr>
-        <w:jc w:val="both"/>
-        <w:rPr>
-          <w:rFonts w:ascii="Century Schoolbook" w:hAnsi="Century Schoolbook"/>
+        <w:t>Why is eliminating near-zero variance features considered a safe way to reduce dimens</w:t>
+      </w:r>
+      <w:r>
+        <w:rPr>
+          <w:rFonts w:ascii="Century Schoolbook" w:hAnsi="Century Schoolbook"/>
+          <w:b/>
+          <w:bCs/>
+        </w:rPr>
+        <w:t>ionality wi</w:t>
+      </w:r>
+      <w:r>
+        <w:rPr>
+          <w:rFonts w:ascii="Century Schoolbook" w:hAnsi="Century Schoolbook"/>
+        </w:rPr>
+        <w:t>thout harming model accuracy?</w:t>
+      </w:r>
+    </w:p>
+    <w:p>
+      <w:pPr>
+        <w:jc w:val="both"/>
+        <w:rPr>
+          <w:rFonts w:ascii="Century Schoolbook" w:hAnsi="Century Schoolbook"/>
+          <w:b/>
+          <w:bCs/>
         </w:rPr>
       </w:pPr>
       <w:r>
@@ -2844,6 +2988,49 @@
           <w:bCs/>
         </w:rPr>
         <w:t>Answer:</w:t>
+      </w:r>
+    </w:p>
+    <w:p>
+      <w:pPr>
+        <w:spacing w:before="100" w:beforeAutospacing="1" w:after="100" w:afterAutospacing="1" w:line="240" w:lineRule="auto"/>
+        <w:rPr>
+          <w:rFonts w:ascii="Century Schoolbook" w:hAnsi="Century Schoolbook"/>
+        </w:rPr>
+      </w:pPr>
+      <w:r>
+        <w:rPr>
+          <w:rFonts w:ascii="Century Schoolbook" w:hAnsi="Century Schoolbook"/>
+        </w:rPr>
+        <w:t>As the variance threshold increases from 0.0 to 0.05, the number of retained features decreases significantly, from 35,482 to 1,491.</w:t>
+      </w:r>
+    </w:p>
+    <w:p>
+      <w:pPr>
+        <w:spacing w:before="100" w:beforeAutospacing="1" w:after="100" w:afterAutospacing="1" w:line="240" w:lineRule="auto"/>
+        <w:rPr>
+          <w:rFonts w:ascii="Century Schoolbook" w:hAnsi="Century Schoolbook"/>
+        </w:rPr>
+      </w:pPr>
+      <w:r>
+        <w:rPr>
+          <w:rFonts w:ascii="Century Schoolbook" w:hAnsi="Century Schoolbook"/>
+        </w:rPr>
+        <w:t>Words with near-zero variance are usually very rare words that appear in only a few documents, or words that occur with almost the same frequency across documents. These features are removed first because they show very little variation.</w:t>
+      </w:r>
+    </w:p>
+    <w:p>
+      <w:pPr>
+        <w:spacing w:before="100" w:beforeAutospacing="1" w:after="100" w:afterAutospacing="1" w:line="240" w:lineRule="auto"/>
+        <w:rPr>
+          <w:rFonts w:ascii="Century Schoolbook" w:hAnsi="Century Schoolbook" w:hint="eastAsia"/>
+        </w:rPr>
+      </w:pPr>
+      <w:r>
+        <w:rPr>
+          <w:rFonts w:ascii="Century Schoolbook" w:hAnsi="Century Schoolbook"/>
+        </w:rPr>
+        <w:lastRenderedPageBreak/>
+        <w:t>Removing low-variance features helps reduce dimensionality and computational costs, since these features usually provide limited information for distinguishing documents. However, it does not guarantee that model accuracy will always remain unchanged, because some rare words may still be useful for classification.</w:t>
       </w:r>
     </w:p>
     <w:tbl>
@@ -2860,7 +3047,7 @@
       </w:tblPr>
       <w:tblGrid>
         <w:gridCol w:w="1245"/>
-        <w:gridCol w:w="4307"/>
+        <w:gridCol w:w="5078"/>
       </w:tblGrid>
       <w:tr>
         <w:trPr>
@@ -2900,6 +3087,7 @@
           </w:tcPr>
           <w:p>
             <w:pPr>
+              <w:ind w:firstLineChars="350" w:firstLine="771"/>
               <w:jc w:val="both"/>
               <w:rPr>
                 <w:rFonts w:ascii="Century Schoolbook" w:hAnsi="Century Schoolbook"/>
@@ -2941,6 +3129,12 @@
               </w:rPr>
               <w:t>0.0</w:t>
             </w:r>
+            <w:r>
+              <w:rPr>
+                <w:rFonts w:ascii="Century Schoolbook" w:hAnsi="Century Schoolbook"/>
+              </w:rPr>
+              <w:t xml:space="preserve">  </w:t>
+            </w:r>
           </w:p>
         </w:tc>
         <w:tc>
@@ -2951,11 +3145,18 @@
           </w:tcPr>
           <w:p>
             <w:pPr>
+              <w:ind w:firstLineChars="350" w:firstLine="770"/>
               <w:jc w:val="both"/>
               <w:rPr>
                 <w:rFonts w:ascii="Century Schoolbook" w:hAnsi="Century Schoolbook"/>
               </w:rPr>
             </w:pPr>
+            <w:r>
+              <w:rPr>
+                <w:rFonts w:ascii="Century Schoolbook" w:hAnsi="Century Schoolbook"/>
+              </w:rPr>
+              <w:t>35482</w:t>
+            </w:r>
           </w:p>
         </w:tc>
       </w:tr>
@@ -2997,6 +3198,12 @@
                 <w:rFonts w:ascii="Century Schoolbook" w:hAnsi="Century Schoolbook"/>
               </w:rPr>
             </w:pPr>
+            <w:r>
+              <w:rPr>
+                <w:rFonts w:ascii="Century Schoolbook" w:hAnsi="Century Schoolbook"/>
+              </w:rPr>
+              <w:t xml:space="preserve">             5089</w:t>
+            </w:r>
           </w:p>
         </w:tc>
       </w:tr>
@@ -3038,6 +3245,12 @@
                 <w:rFonts w:ascii="Century Schoolbook" w:hAnsi="Century Schoolbook"/>
               </w:rPr>
             </w:pPr>
+            <w:r>
+              <w:rPr>
+                <w:rFonts w:ascii="Century Schoolbook" w:hAnsi="Century Schoolbook"/>
+              </w:rPr>
+              <w:t xml:space="preserve">             1491</w:t>
+            </w:r>
           </w:p>
         </w:tc>
       </w:tr>
@@ -3061,7 +3274,7 @@
         <w:rPr>
           <w:rFonts w:ascii="Century Schoolbook" w:hAnsi="Century Schoolbook"/>
         </w:rPr>
-        <w:t xml:space="preserve"> Yes / No </w:t>
+        <w:t xml:space="preserve"> Yes </w:t>
       </w:r>
     </w:p>
     <w:p>
@@ -3085,6 +3298,12 @@
         </w:rPr>
         <w:t xml:space="preserve"> </w:t>
       </w:r>
+      <w:r>
+        <w:rPr>
+          <w:rFonts w:ascii="Century Schoolbook" w:hAnsi="Century Schoolbook"/>
+        </w:rPr>
+        <w:t>Concept explanation and English editing.</w:t>
+      </w:r>
     </w:p>
     <w:p>
       <w:pPr>
@@ -3112,120 +3331,42 @@
       <w:pPr>
         <w:jc w:val="both"/>
         <w:rPr>
-          <w:rFonts w:ascii="Century Schoolbook" w:hAnsi="Century Schoolbook"/>
-        </w:rPr>
-      </w:pPr>
-    </w:p>
-    <w:p>
-      <w:pPr>
-        <w:jc w:val="both"/>
-        <w:rPr>
-          <w:rFonts w:ascii="Century Schoolbook" w:hAnsi="Century Schoolbook"/>
-        </w:rPr>
-      </w:pPr>
-    </w:p>
-    <w:p>
-      <w:pPr>
-        <w:jc w:val="both"/>
-        <w:rPr>
-          <w:rFonts w:ascii="Century Schoolbook" w:hAnsi="Century Schoolbook"/>
-        </w:rPr>
-      </w:pPr>
-    </w:p>
-    <w:p>
-      <w:pPr>
-        <w:jc w:val="both"/>
-        <w:rPr>
-          <w:rFonts w:ascii="Century Schoolbook" w:hAnsi="Century Schoolbook"/>
-        </w:rPr>
-      </w:pPr>
-    </w:p>
-    <w:p>
-      <w:pPr>
-        <w:jc w:val="both"/>
-        <w:rPr>
-          <w:rFonts w:ascii="Century Schoolbook" w:hAnsi="Century Schoolbook"/>
-        </w:rPr>
-      </w:pPr>
-    </w:p>
-    <w:p>
-      <w:pPr>
-        <w:jc w:val="both"/>
-        <w:rPr>
-          <w:rFonts w:ascii="Century Schoolbook" w:hAnsi="Century Schoolbook"/>
-        </w:rPr>
-      </w:pPr>
-    </w:p>
-    <w:p>
-      <w:pPr>
-        <w:jc w:val="both"/>
-        <w:rPr>
-          <w:rFonts w:ascii="Century Schoolbook" w:hAnsi="Century Schoolbook"/>
-        </w:rPr>
-      </w:pPr>
-    </w:p>
-    <w:p>
-      <w:pPr>
-        <w:jc w:val="both"/>
-        <w:rPr>
-          <w:rFonts w:ascii="Century Schoolbook" w:hAnsi="Century Schoolbook"/>
-        </w:rPr>
-      </w:pPr>
-    </w:p>
-    <w:p>
-      <w:pPr>
-        <w:jc w:val="both"/>
-        <w:rPr>
-          <w:rFonts w:ascii="Century Schoolbook" w:hAnsi="Century Schoolbook"/>
-        </w:rPr>
-      </w:pPr>
-    </w:p>
-    <w:p>
-      <w:pPr>
-        <w:jc w:val="both"/>
-        <w:rPr>
-          <w:rFonts w:ascii="Century Schoolbook" w:hAnsi="Century Schoolbook"/>
-        </w:rPr>
-      </w:pPr>
-    </w:p>
-    <w:p>
-      <w:pPr>
-        <w:jc w:val="both"/>
-        <w:rPr>
-          <w:rFonts w:ascii="Century Schoolbook" w:hAnsi="Century Schoolbook"/>
-        </w:rPr>
-      </w:pPr>
-    </w:p>
-    <w:p>
-      <w:pPr>
-        <w:jc w:val="both"/>
-        <w:rPr>
-          <w:rFonts w:ascii="Century Schoolbook" w:hAnsi="Century Schoolbook"/>
-        </w:rPr>
-      </w:pPr>
-    </w:p>
-    <w:p>
-      <w:pPr>
-        <w:jc w:val="both"/>
-        <w:rPr>
-          <w:rFonts w:ascii="Century Schoolbook" w:hAnsi="Century Schoolbook"/>
-        </w:rPr>
-      </w:pPr>
-    </w:p>
-    <w:p>
-      <w:pPr>
-        <w:jc w:val="both"/>
-        <w:rPr>
-          <w:rFonts w:ascii="Century Schoolbook" w:hAnsi="Century Schoolbook"/>
-        </w:rPr>
-      </w:pPr>
-      <w:r>
-        <w:rPr>
-          <w:rFonts w:ascii="Century Schoolbook" w:hAnsi="Century Schoolbook"/>
-        </w:rPr>
-        <w:lastRenderedPageBreak/>
-        <w:pict w14:anchorId="3BE467AD">
-          <v:rect id="_x0000_i1032" style="width:0;height:1.5pt" o:hralign="center" o:hrstd="t" o:hr="t" fillcolor="#a0a0a0" stroked="f"/>
+          <w:rFonts w:ascii="Century Schoolbook" w:hAnsi="Century Schoolbook" w:hint="eastAsia"/>
+        </w:rPr>
+      </w:pPr>
+      <w:r>
+        <w:rPr>
+          <w:rFonts w:ascii="Century Schoolbook" w:hAnsi="Century Schoolbook"/>
+        </w:rPr>
+        <w:t>https://scikit-learn.org/stable/modules/generated/sklearn.feature_selection.VarianceThreshold.html?utm_source=chatgpt.com</w:t>
+      </w:r>
+    </w:p>
+    <w:p>
+      <w:pPr>
+        <w:jc w:val="both"/>
+        <w:rPr>
+          <w:rFonts w:ascii="Century Schoolbook" w:hAnsi="Century Schoolbook"/>
+        </w:rPr>
+      </w:pPr>
+    </w:p>
+    <w:p>
+      <w:pPr>
+        <w:jc w:val="both"/>
+        <w:rPr>
+          <w:rFonts w:ascii="Century Schoolbook" w:hAnsi="Century Schoolbook"/>
+        </w:rPr>
+      </w:pPr>
+      <w:r>
+        <w:rPr>
+          <w:noProof/>
+        </w:rPr>
+      </w:r>
+      <w:r>
+        <w:pict w14:anchorId="3404D01E">
+          <v:rect id="Horizontal Line 8" o:spid="_x0000_s2055" style="width:451.3pt;height:1.1pt;visibility:visible;mso-wrap-style:square;mso-left-percent:-10001;mso-top-percent:-10001;mso-position-horizontal:absolute;mso-position-horizontal-relative:char;mso-position-vertical:absolute;mso-position-vertical-relative:line;mso-left-percent:-10001;mso-top-percent:-10001;v-text-anchor:top" o:gfxdata="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" filled="f">
+            <o:lock v:ext="edit" rotation="t" aspectratio="t" verticies="t" text="t" shapetype="t"/>
+            <w10:anchorlock/>
+          </v:rect>
         </w:pict>
       </w:r>
     </w:p>
@@ -3304,8 +3445,6 @@
         </w:rPr>
         <w:t xml:space="preserve">Run the correlation filter against the binary indicator for the </w:t>
       </w:r>
-      <w:proofErr w:type="spellStart"/>
-      <w:proofErr w:type="gramStart"/>
       <w:r>
         <w:rPr>
           <w:rFonts w:ascii="Century Schoolbook" w:hAnsi="Century Schoolbook"/>
@@ -3314,15 +3453,12 @@
         </w:rPr>
         <w:t>comp.graphics</w:t>
       </w:r>
-      <w:proofErr w:type="spellEnd"/>
-      <w:proofErr w:type="gramEnd"/>
       <w:r>
         <w:rPr>
           <w:rFonts w:ascii="Century Schoolbook" w:hAnsi="Century Schoolbook"/>
         </w:rPr>
         <w:t xml:space="preserve"> class. Inspect the top 10 features sorted by </w:t>
       </w:r>
-      <w:proofErr w:type="spellStart"/>
       <w:r>
         <w:rPr>
           <w:rFonts w:ascii="Century Schoolbook" w:hAnsi="Century Schoolbook"/>
@@ -3331,14 +3467,12 @@
         </w:rPr>
         <w:t>pearson_r</w:t>
       </w:r>
-      <w:proofErr w:type="spellEnd"/>
       <w:r>
         <w:rPr>
           <w:rFonts w:ascii="Century Schoolbook" w:hAnsi="Century Schoolbook"/>
         </w:rPr>
         <w:t xml:space="preserve"> and compare them to the top 10 features sorted by </w:t>
       </w:r>
-      <w:proofErr w:type="spellStart"/>
       <w:r>
         <w:rPr>
           <w:rFonts w:ascii="Century Schoolbook" w:hAnsi="Century Schoolbook"/>
@@ -3347,7 +3481,6 @@
         </w:rPr>
         <w:t>spearman_r</w:t>
       </w:r>
-      <w:proofErr w:type="spellEnd"/>
       <w:r>
         <w:rPr>
           <w:rFonts w:ascii="Century Schoolbook" w:hAnsi="Century Schoolbook"/>
@@ -3373,7 +3506,7 @@
     </w:p>
     <w:p>
       <w:pPr>
-        <w:pStyle w:val="ListParagraph"/>
+        <w:pStyle w:val="a9"/>
         <w:numPr>
           <w:ilvl w:val="1"/>
           <w:numId w:val="7"/>
@@ -3392,7 +3525,7 @@
     </w:p>
     <w:p>
       <w:pPr>
-        <w:pStyle w:val="ListParagraph"/>
+        <w:pStyle w:val="a9"/>
         <w:numPr>
           <w:ilvl w:val="1"/>
           <w:numId w:val="7"/>
@@ -3439,7 +3572,7 @@
     </w:p>
     <w:p>
       <w:pPr>
-        <w:pStyle w:val="ListParagraph"/>
+        <w:pStyle w:val="a9"/>
         <w:numPr>
           <w:ilvl w:val="1"/>
           <w:numId w:val="7"/>
@@ -3489,6 +3622,8 @@
         <w:jc w:val="both"/>
         <w:rPr>
           <w:rFonts w:ascii="Century Schoolbook" w:hAnsi="Century Schoolbook"/>
+          <w:b/>
+          <w:bCs/>
         </w:rPr>
       </w:pPr>
       <w:r>
@@ -3502,6 +3637,105 @@
     </w:p>
     <w:p>
       <w:pPr>
+        <w:spacing w:before="100" w:beforeAutospacing="1" w:after="100" w:afterAutospacing="1" w:line="240" w:lineRule="auto"/>
+        <w:rPr>
+          <w:rFonts w:ascii="Century Schoolbook" w:hAnsi="Century Schoolbook"/>
+        </w:rPr>
+      </w:pPr>
+      <w:r>
+        <w:rPr>
+          <w:rFonts w:ascii="Century Schoolbook" w:hAnsi="Century Schoolbook"/>
+        </w:rPr>
+        <w:t>1</w:t>
+      </w:r>
+      <w:r>
+        <w:rPr>
+          <w:rFonts w:ascii="Century Schoolbook" w:hAnsi="Century Schoolbook"/>
+        </w:rPr>
+        <w:t>. Top-correlated words</w:t>
+      </w:r>
+    </w:p>
+    <w:p>
+      <w:pPr>
+        <w:spacing w:before="100" w:beforeAutospacing="1" w:after="100" w:afterAutospacing="1" w:line="240" w:lineRule="auto"/>
+        <w:rPr>
+          <w:rFonts w:ascii="Century Schoolbook" w:hAnsi="Century Schoolbook"/>
+        </w:rPr>
+      </w:pPr>
+      <w:r>
+        <w:rPr>
+          <w:rFonts w:ascii="Century Schoolbook" w:hAnsi="Century Schoolbook"/>
+        </w:rPr>
+        <w:t>The top-correlated words include both domain-specific terms and general words. Pearson identifies words such as "vga," "video," and "card," but also general words like "thanks" and "writes." Spearman identifies more graphics-related terms, such as "graphics," "image," "3d," and "program." This shows that high statistical correlation does not necessarily mean a word is domain-specific.</w:t>
+      </w:r>
+    </w:p>
+    <w:p>
+      <w:pPr>
+        <w:spacing w:before="100" w:beforeAutospacing="1" w:after="100" w:afterAutospacing="1" w:line="240" w:lineRule="auto"/>
+        <w:rPr>
+          <w:rFonts w:ascii="Century Schoolbook" w:hAnsi="Century Schoolbook"/>
+        </w:rPr>
+      </w:pPr>
+      <w:r>
+        <w:rPr>
+          <w:rFonts w:ascii="Century Schoolbook" w:hAnsi="Century Schoolbook"/>
+        </w:rPr>
+        <w:t>2. Pearson vs. Spearman</w:t>
+      </w:r>
+    </w:p>
+    <w:p>
+      <w:pPr>
+        <w:spacing w:before="100" w:beforeAutospacing="1" w:after="100" w:afterAutospacing="1" w:line="240" w:lineRule="auto"/>
+        <w:rPr>
+          <w:rFonts w:ascii="Century Schoolbook" w:hAnsi="Century Schoolbook"/>
+        </w:rPr>
+      </w:pPr>
+      <w:r>
+        <w:rPr>
+          <w:rFonts w:ascii="Century Schoolbook" w:hAnsi="Century Schoolbook"/>
+        </w:rPr>
+        <w:lastRenderedPageBreak/>
+        <w:t>Pearson measures the linear relationship between the original word frequencies and the target category, while Spearman measures the monotonic relationship using ranks. Therefore, Spearman is generally less sensitive to extreme values than Pearson.</w:t>
+      </w:r>
+    </w:p>
+    <w:p>
+      <w:pPr>
+        <w:spacing w:before="100" w:beforeAutospacing="1" w:after="100" w:afterAutospacing="1" w:line="240" w:lineRule="auto"/>
+        <w:rPr>
+          <w:rFonts w:ascii="Century Schoolbook" w:hAnsi="Century Schoolbook"/>
+        </w:rPr>
+      </w:pPr>
+      <w:r>
+        <w:rPr>
+          <w:rFonts w:ascii="Century Schoolbook" w:hAnsi="Century Schoolbook"/>
+        </w:rPr>
+        <w:t>3. When Spearman can be higher than Pearson</w:t>
+      </w:r>
+    </w:p>
+    <w:p>
+      <w:pPr>
+        <w:spacing w:before="100" w:beforeAutospacing="1" w:after="100" w:afterAutospacing="1" w:line="240" w:lineRule="auto"/>
+        <w:rPr>
+          <w:rFonts w:ascii="Century Schoolbook" w:hAnsi="Century Schoolbook"/>
+        </w:rPr>
+      </w:pPr>
+      <w:r>
+        <w:rPr>
+          <w:rFonts w:ascii="Century Schoolbook" w:hAnsi="Century Schoolbook"/>
+        </w:rPr>
+        <w:t>For example, a graphics-related word may appear more frequently in graphics documents, but a few documents may contain extremely high word counts. These extreme values can weaken the Pearson correlation, while Spearman may still capture the overall monotonic relationship. In our results, the word "graphics" has a Pearson correlation of 0.1779 but a Spearman correlation of 0.5211. However, this difference alone does not prove that outliers are present.</w:t>
+      </w:r>
+    </w:p>
+    <w:p>
+      <w:pPr>
+        <w:jc w:val="both"/>
+        <w:rPr>
+          <w:rFonts w:ascii="Century Schoolbook" w:hAnsi="Century Schoolbook"/>
+        </w:rPr>
+      </w:pPr>
+    </w:p>
+    <w:p>
+      <w:pPr>
         <w:jc w:val="both"/>
         <w:rPr>
           <w:rFonts w:ascii="Century Schoolbook" w:hAnsi="Century Schoolbook"/>
@@ -3519,23 +3753,61 @@
         <w:rPr>
           <w:rFonts w:ascii="Century Schoolbook" w:hAnsi="Century Schoolbook"/>
         </w:rPr>
-        <w:t xml:space="preserve"> Yes / No </w:t>
-      </w:r>
-    </w:p>
-    <w:p>
-      <w:pPr>
-        <w:jc w:val="both"/>
-        <w:rPr>
-          <w:rFonts w:ascii="Century Schoolbook" w:hAnsi="Century Schoolbook"/>
-        </w:rPr>
-      </w:pPr>
-      <w:r>
-        <w:rPr>
-          <w:rFonts w:ascii="Century Schoolbook" w:hAnsi="Century Schoolbook"/>
-          <w:b/>
-          <w:bCs/>
-        </w:rPr>
-        <w:t>If yes, how:</w:t>
+        <w:t xml:space="preserve"> Yes </w:t>
+      </w:r>
+    </w:p>
+    <w:p>
+      <w:pPr>
+        <w:jc w:val="both"/>
+        <w:rPr>
+          <w:rFonts w:ascii="Century Schoolbook" w:hAnsi="Century Schoolbook"/>
+        </w:rPr>
+      </w:pPr>
+      <w:r>
+        <w:rPr>
+          <w:rFonts w:ascii="Century Schoolbook" w:hAnsi="Century Schoolbook"/>
+          <w:b/>
+          <w:bCs/>
+        </w:rPr>
+        <w:t>I</w:t>
+      </w:r>
+      <w:r>
+        <w:rPr>
+          <w:rFonts w:ascii="Century Schoolbook" w:hAnsi="Century Schoolbook"/>
+          <w:b/>
+          <w:bCs/>
+        </w:rPr>
+        <w:t xml:space="preserve">f yes, how: </w:t>
+      </w:r>
+    </w:p>
+    <w:p>
+      <w:pPr>
+        <w:jc w:val="both"/>
+        <w:rPr>
+          <w:rFonts w:ascii="Century Schoolbook" w:hAnsi="Century Schoolbook"/>
+        </w:rPr>
+      </w:pPr>
+      <w:r>
+        <w:rPr>
+          <w:rFonts w:ascii="Century Schoolbook" w:hAnsi="Century Schoolbook"/>
+        </w:rPr>
+        <w:t>Concept discussion, interpretation of experimental results, English translation and language editing.</w:t>
+      </w:r>
+    </w:p>
+    <w:p>
+      <w:pPr>
+        <w:jc w:val="both"/>
+        <w:rPr>
+          <w:rFonts w:ascii="Century Schoolbook" w:hAnsi="Century Schoolbook"/>
+        </w:rPr>
+      </w:pPr>
+      <w:r>
+        <w:rPr>
+          <w:rFonts w:ascii="Century Schoolbook" w:hAnsi="Century Schoolbook"/>
+          <w:b/>
+          <w:bCs/>
+        </w:rPr>
+        <w:t>External references (links):</w:t>
       </w:r>
       <w:r>
         <w:rPr>
@@ -3554,10 +3826,93 @@
       <w:r>
         <w:rPr>
           <w:rFonts w:ascii="Century Schoolbook" w:hAnsi="Century Schoolbook"/>
-          <w:b/>
-          <w:bCs/>
-        </w:rPr>
-        <w:t>External references (links):</w:t>
+        </w:rPr>
+        <w:t>https://docs.scipy.org/doc/scipy/reference/generated/scipy.stats.pearsonr.html?utm_source=chatgpt.com</w:t>
+      </w:r>
+    </w:p>
+    <w:p>
+      <w:pPr>
+        <w:jc w:val="both"/>
+        <w:rPr>
+          <w:rFonts w:ascii="Century Schoolbook" w:hAnsi="Century Schoolbook"/>
+        </w:rPr>
+      </w:pPr>
+      <w:r>
+        <w:rPr>
+          <w:noProof/>
+        </w:rPr>
+      </w:r>
+      <w:r>
+        <w:pict w14:anchorId="5590C3AC">
+          <v:rect id="Horizontal Line 9" o:spid="_x0000_s2054" style="width:451.3pt;height:1.1pt;visibility:visible;mso-wrap-style:square;mso-left-percent:-10001;mso-top-percent:-10001;mso-position-horizontal:absolute;mso-position-horizontal-relative:char;mso-position-vertical:absolute;mso-position-vertical-relative:line;mso-left-percent:-10001;mso-top-percent:-10001;v-text-anchor:top" o:gfxdata="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" filled="f">
+            <o:lock v:ext="edit" rotation="t" aspectratio="t" verticies="t" text="t" shapetype="t"/>
+            <w10:anchorlock/>
+          </v:rect>
+        </w:pict>
+      </w:r>
+    </w:p>
+    <w:p>
+      <w:pPr>
+        <w:jc w:val="both"/>
+        <w:rPr>
+          <w:rFonts w:ascii="Century Schoolbook" w:hAnsi="Century Schoolbook"/>
+          <w:b/>
+          <w:bCs/>
+        </w:rPr>
+      </w:pPr>
+      <w:r>
+        <w:rPr>
+          <w:rFonts w:ascii="Century Schoolbook" w:hAnsi="Century Schoolbook"/>
+          <w:b/>
+          <w:bCs/>
+        </w:rPr>
+        <w:t xml:space="preserve">Question 7: </w:t>
+      </w:r>
+      <w:r>
+        <w:rPr>
+          <w:rFonts w:ascii="Century Schoolbook" w:hAnsi="Century Schoolbook"/>
+          <w:b/>
+          <w:bCs/>
+        </w:rPr>
+        <w:t>Frequent Pattern Mining — Algorithm &amp; Parameter Dynamics</w:t>
+      </w:r>
+    </w:p>
+    <w:p>
+      <w:pPr>
+        <w:jc w:val="both"/>
+        <w:rPr>
+          <w:rFonts w:ascii="Century Schoolbook" w:hAnsi="Century Schoolbook"/>
+        </w:rPr>
+      </w:pPr>
+      <w:r>
+        <w:rPr>
+          <w:rFonts w:ascii="Century Schoolbook" w:hAnsi="Century Schoolbook"/>
+          <w:b/>
+          <w:bCs/>
+        </w:rPr>
+        <w:t>Notebook:</w:t>
+      </w:r>
+      <w:r>
+        <w:rPr>
+          <w:rFonts w:ascii="Century Schoolbook" w:hAnsi="Century Schoolbook"/>
+        </w:rPr>
+        <w:t xml:space="preserve"> Section 5.4.2 — Question 7 (take home)</w:t>
+      </w:r>
+    </w:p>
+    <w:p>
+      <w:pPr>
+        <w:jc w:val="both"/>
+        <w:rPr>
+          <w:rFonts w:ascii="Century Schoolbook" w:hAnsi="Century Schoolbook"/>
+        </w:rPr>
+      </w:pPr>
+      <w:r>
+        <w:rPr>
+          <w:rFonts w:ascii="Century Schoolbook" w:hAnsi="Century Schoolbook"/>
+          <w:b/>
+          <w:bCs/>
+        </w:rPr>
+        <w:t>Task:</w:t>
       </w:r>
       <w:r>
         <w:rPr>
@@ -3565,115 +3920,19 @@
         </w:rPr>
         <w:t xml:space="preserve"> </w:t>
       </w:r>
-    </w:p>
-    <w:p>
-      <w:pPr>
-        <w:jc w:val="both"/>
-        <w:rPr>
-          <w:rFonts w:ascii="Century Schoolbook" w:hAnsi="Century Schoolbook"/>
-        </w:rPr>
-      </w:pPr>
-      <w:r>
-        <w:rPr>
-          <w:rFonts w:ascii="Century Schoolbook" w:hAnsi="Century Schoolbook"/>
-        </w:rPr>
-        <w:pict w14:anchorId="446A19DC">
-          <v:rect id="_x0000_i1033" style="width:0;height:1.5pt" o:hralign="center" o:hrstd="t" o:hr="t" fillcolor="#a0a0a0" stroked="f"/>
-        </w:pict>
-      </w:r>
-    </w:p>
-    <w:p>
-      <w:pPr>
-        <w:jc w:val="both"/>
-        <w:rPr>
-          <w:rFonts w:ascii="Century Schoolbook" w:hAnsi="Century Schoolbook"/>
-          <w:b/>
-          <w:bCs/>
-        </w:rPr>
-      </w:pPr>
-      <w:r>
-        <w:rPr>
-          <w:rFonts w:ascii="Century Schoolbook" w:hAnsi="Century Schoolbook"/>
-          <w:b/>
-          <w:bCs/>
-        </w:rPr>
-        <w:t xml:space="preserve">Question 7: </w:t>
-      </w:r>
-      <w:r>
-        <w:rPr>
-          <w:rFonts w:ascii="Century Schoolbook" w:hAnsi="Century Schoolbook"/>
-          <w:b/>
-          <w:bCs/>
-        </w:rPr>
-        <w:t>Frequent Pattern Mining — Algorithm &amp; Parameter Dynamics</w:t>
-      </w:r>
-    </w:p>
-    <w:p>
-      <w:pPr>
-        <w:jc w:val="both"/>
-        <w:rPr>
-          <w:rFonts w:ascii="Century Schoolbook" w:hAnsi="Century Schoolbook"/>
-        </w:rPr>
-      </w:pPr>
-      <w:r>
-        <w:rPr>
-          <w:rFonts w:ascii="Century Schoolbook" w:hAnsi="Century Schoolbook"/>
-          <w:b/>
-          <w:bCs/>
-        </w:rPr>
-        <w:t>Notebook:</w:t>
-      </w:r>
-      <w:r>
-        <w:rPr>
-          <w:rFonts w:ascii="Century Schoolbook" w:hAnsi="Century Schoolbook"/>
-        </w:rPr>
-        <w:t xml:space="preserve"> Section 5.4.2 — Question 7 (take home)</w:t>
-      </w:r>
-    </w:p>
-    <w:p>
-      <w:pPr>
-        <w:jc w:val="both"/>
-        <w:rPr>
-          <w:rFonts w:ascii="Century Schoolbook" w:hAnsi="Century Schoolbook"/>
-        </w:rPr>
-      </w:pPr>
-      <w:r>
-        <w:rPr>
-          <w:rFonts w:ascii="Century Schoolbook" w:hAnsi="Century Schoolbook"/>
-          <w:b/>
-          <w:bCs/>
-        </w:rPr>
-        <w:t>Task:</w:t>
-      </w:r>
-      <w:r>
-        <w:rPr>
-          <w:rFonts w:ascii="Century Schoolbook" w:hAnsi="Century Schoolbook"/>
-        </w:rPr>
-        <w:t xml:space="preserve"> </w:t>
-      </w:r>
       <w:r>
         <w:rPr>
           <w:rFonts w:ascii="Century Schoolbook" w:hAnsi="Century Schoolbook"/>
         </w:rPr>
         <w:t xml:space="preserve">In the Frequent Pattern Mining section, run </w:t>
       </w:r>
-      <w:proofErr w:type="gramStart"/>
-      <w:r>
-        <w:rPr>
-          <w:rFonts w:ascii="Century Schoolbook" w:hAnsi="Century Schoolbook"/>
-          <w:b/>
-          <w:bCs/>
-        </w:rPr>
-        <w:t>Top-K</w:t>
-      </w:r>
-      <w:proofErr w:type="gramEnd"/>
-      <w:r>
-        <w:rPr>
-          <w:rFonts w:ascii="Century Schoolbook" w:hAnsi="Century Schoolbook"/>
-          <w:b/>
-          <w:bCs/>
-        </w:rPr>
-        <w:t xml:space="preserve"> FAE</w:t>
+      <w:r>
+        <w:rPr>
+          <w:rFonts w:ascii="Century Schoolbook" w:hAnsi="Century Schoolbook"/>
+          <w:b/>
+          <w:bCs/>
+        </w:rPr>
+        <w:t>Top-K FAE</w:t>
       </w:r>
       <w:r>
         <w:rPr>
@@ -3695,7 +3954,6 @@
         </w:rPr>
         <w:t xml:space="preserve">. Then, run </w:t>
       </w:r>
-      <w:proofErr w:type="spellStart"/>
       <w:r>
         <w:rPr>
           <w:rFonts w:ascii="Century Schoolbook" w:hAnsi="Century Schoolbook"/>
@@ -3704,48 +3962,19 @@
         </w:rPr>
         <w:t>MaxFPGrowth</w:t>
       </w:r>
-      <w:proofErr w:type="spellEnd"/>
       <w:r>
         <w:rPr>
           <w:rFonts w:ascii="Century Schoolbook" w:hAnsi="Century Schoolbook"/>
         </w:rPr>
         <w:t xml:space="preserve"> using minimum support thresholds </w:t>
       </w:r>
-      <w:proofErr w:type="spellStart"/>
-      <w:r>
-        <w:rPr>
-          <w:rFonts w:ascii="Century Schoolbook" w:hAnsi="Century Schoolbook"/>
-          <w:b/>
-          <w:bCs/>
-        </w:rPr>
-        <w:t>minSup</w:t>
-      </w:r>
-      <w:proofErr w:type="spellEnd"/>
-      <w:r>
-        <w:rPr>
-          <w:rFonts w:ascii="Century Schoolbook" w:hAnsi="Century Schoolbook"/>
-          <w:b/>
-          <w:bCs/>
-        </w:rPr>
-        <w:t xml:space="preserve">=9 and </w:t>
-      </w:r>
-      <w:proofErr w:type="spellStart"/>
-      <w:r>
-        <w:rPr>
-          <w:rFonts w:ascii="Century Schoolbook" w:hAnsi="Century Schoolbook"/>
-          <w:b/>
-          <w:bCs/>
-        </w:rPr>
-        <w:t>minSup</w:t>
-      </w:r>
-      <w:proofErr w:type="spellEnd"/>
-      <w:r>
-        <w:rPr>
-          <w:rFonts w:ascii="Century Schoolbook" w:hAnsi="Century Schoolbook"/>
-          <w:b/>
-          <w:bCs/>
-        </w:rPr>
-        <w:t>= 3</w:t>
+      <w:r>
+        <w:rPr>
+          <w:rFonts w:ascii="Century Schoolbook" w:hAnsi="Century Schoolbook"/>
+          <w:b/>
+          <w:bCs/>
+        </w:rPr>
+        <w:t>minSup=9 and minSup= 3</w:t>
       </w:r>
       <w:r>
         <w:rPr>
@@ -3790,7 +4019,6 @@
         </w:rPr>
         <w:t xml:space="preserve">How does decreasing </w:t>
       </w:r>
-      <w:proofErr w:type="spellStart"/>
       <w:r>
         <w:rPr>
           <w:rFonts w:ascii="Century Schoolbook" w:hAnsi="Century Schoolbook"/>
@@ -3799,14 +4027,12 @@
         </w:rPr>
         <w:t>minSup</w:t>
       </w:r>
-      <w:proofErr w:type="spellEnd"/>
       <w:r>
         <w:rPr>
           <w:rFonts w:ascii="Century Schoolbook" w:hAnsi="Century Schoolbook"/>
         </w:rPr>
         <w:t xml:space="preserve"> (from 9 to 3) in </w:t>
       </w:r>
-      <w:proofErr w:type="spellStart"/>
       <w:r>
         <w:rPr>
           <w:rFonts w:ascii="Century Schoolbook" w:hAnsi="Century Schoolbook"/>
@@ -3815,7 +4041,6 @@
         </w:rPr>
         <w:t>MaxFPGrowth</w:t>
       </w:r>
-      <w:proofErr w:type="spellEnd"/>
       <w:r>
         <w:rPr>
           <w:rFonts w:ascii="Century Schoolbook" w:hAnsi="Century Schoolbook"/>
@@ -3841,23 +4066,13 @@
         </w:rPr>
         <w:t xml:space="preserve">How does the parameter k in </w:t>
       </w:r>
-      <w:proofErr w:type="gramStart"/>
-      <w:r>
-        <w:rPr>
-          <w:rFonts w:ascii="Century Schoolbook" w:hAnsi="Century Schoolbook"/>
-          <w:b/>
-          <w:bCs/>
-        </w:rPr>
-        <w:t>Top-K</w:t>
-      </w:r>
-      <w:proofErr w:type="gramEnd"/>
-      <w:r>
-        <w:rPr>
-          <w:rFonts w:ascii="Century Schoolbook" w:hAnsi="Century Schoolbook"/>
-          <w:b/>
-          <w:bCs/>
-        </w:rPr>
-        <w:t xml:space="preserve"> FAE</w:t>
+      <w:r>
+        <w:rPr>
+          <w:rFonts w:ascii="Century Schoolbook" w:hAnsi="Century Schoolbook"/>
+          <w:b/>
+          <w:bCs/>
+        </w:rPr>
+        <w:t>Top-K FAE</w:t>
       </w:r>
       <w:r>
         <w:rPr>
@@ -3865,7 +4080,6 @@
         </w:rPr>
         <w:t xml:space="preserve"> differ fundamentally from </w:t>
       </w:r>
-      <w:proofErr w:type="spellStart"/>
       <w:r>
         <w:rPr>
           <w:rFonts w:ascii="Century Schoolbook" w:hAnsi="Century Schoolbook"/>
@@ -3874,14 +4088,12 @@
         </w:rPr>
         <w:t>minSup</w:t>
       </w:r>
-      <w:proofErr w:type="spellEnd"/>
       <w:r>
         <w:rPr>
           <w:rFonts w:ascii="Century Schoolbook" w:hAnsi="Century Schoolbook"/>
         </w:rPr>
         <w:t xml:space="preserve"> in </w:t>
       </w:r>
-      <w:proofErr w:type="spellStart"/>
       <w:r>
         <w:rPr>
           <w:rFonts w:ascii="Century Schoolbook" w:hAnsi="Century Schoolbook"/>
@@ -3890,7 +4102,6 @@
         </w:rPr>
         <w:t>MaxFPGrowth</w:t>
       </w:r>
-      <w:proofErr w:type="spellEnd"/>
       <w:r>
         <w:rPr>
           <w:rFonts w:ascii="Century Schoolbook" w:hAnsi="Century Schoolbook"/>
@@ -3919,239 +4130,332 @@
     </w:p>
     <w:p>
       <w:pPr>
-        <w:jc w:val="both"/>
-        <w:rPr>
-          <w:rFonts w:ascii="Century Schoolbook" w:hAnsi="Century Schoolbook"/>
-        </w:rPr>
-      </w:pPr>
-      <w:r>
-        <w:rPr>
-          <w:rFonts w:ascii="Century Schoolbook" w:hAnsi="Century Schoolbook"/>
-          <w:b/>
-          <w:bCs/>
-        </w:rPr>
-        <w:t>Answer (</w:t>
-      </w:r>
-      <w:proofErr w:type="gramStart"/>
-      <w:r>
-        <w:rPr>
-          <w:rFonts w:ascii="Century Schoolbook" w:hAnsi="Century Schoolbook"/>
-          <w:b/>
-          <w:bCs/>
-        </w:rPr>
-        <w:t>1) —</w:t>
-      </w:r>
-      <w:proofErr w:type="gramEnd"/>
-      <w:r>
-        <w:rPr>
-          <w:rFonts w:ascii="Century Schoolbook" w:hAnsi="Century Schoolbook"/>
-          <w:b/>
-          <w:bCs/>
-        </w:rPr>
-        <w:t xml:space="preserve"> Runtime and pattern count when lowering </w:t>
-      </w:r>
-      <w:proofErr w:type="spellStart"/>
-      <w:r>
-        <w:rPr>
-          <w:rFonts w:ascii="Century Schoolbook" w:hAnsi="Century Schoolbook"/>
-          <w:b/>
-          <w:bCs/>
-        </w:rPr>
-        <w:t>minSup</w:t>
-      </w:r>
-      <w:proofErr w:type="spellEnd"/>
-      <w:r>
-        <w:rPr>
-          <w:rFonts w:ascii="Century Schoolbook" w:hAnsi="Century Schoolbook"/>
-          <w:b/>
-          <w:bCs/>
-        </w:rPr>
-        <w:t>:</w:t>
-      </w:r>
-    </w:p>
-    <w:p>
-      <w:pPr>
-        <w:jc w:val="both"/>
-        <w:rPr>
-          <w:rFonts w:ascii="Century Schoolbook" w:hAnsi="Century Schoolbook"/>
-        </w:rPr>
-      </w:pPr>
-      <w:r>
-        <w:rPr>
-          <w:rFonts w:ascii="Century Schoolbook" w:hAnsi="Century Schoolbook"/>
-          <w:b/>
-          <w:bCs/>
-        </w:rPr>
-        <w:t>Answer (</w:t>
-      </w:r>
-      <w:proofErr w:type="gramStart"/>
-      <w:r>
-        <w:rPr>
-          <w:rFonts w:ascii="Century Schoolbook" w:hAnsi="Century Schoolbook"/>
-          <w:b/>
-          <w:bCs/>
-        </w:rPr>
-        <w:t>2) —</w:t>
-      </w:r>
-      <w:proofErr w:type="gramEnd"/>
-      <w:r>
-        <w:rPr>
-          <w:rFonts w:ascii="Century Schoolbook" w:hAnsi="Century Schoolbook"/>
-          <w:b/>
-          <w:bCs/>
-        </w:rPr>
-        <w:t xml:space="preserve"> Top-K k vs </w:t>
-      </w:r>
-      <w:proofErr w:type="spellStart"/>
-      <w:r>
-        <w:rPr>
-          <w:rFonts w:ascii="Century Schoolbook" w:hAnsi="Century Schoolbook"/>
-          <w:b/>
-          <w:bCs/>
-        </w:rPr>
-        <w:t>MaxFPGrowth</w:t>
-      </w:r>
-      <w:proofErr w:type="spellEnd"/>
-      <w:r>
-        <w:rPr>
-          <w:rFonts w:ascii="Century Schoolbook" w:hAnsi="Century Schoolbook"/>
-          <w:b/>
-          <w:bCs/>
+        <w:pStyle w:val="3"/>
+        <w:rPr>
+          <w:rFonts w:ascii="Century Schoolbook" w:eastAsiaTheme="minorEastAsia" w:hAnsi="Century Schoolbook" w:cstheme="minorBidi"/>
+          <w:color w:val="auto"/>
+          <w:sz w:val="22"/>
+          <w:szCs w:val="22"/>
+        </w:rPr>
+      </w:pPr>
+      <w:r>
+        <w:rPr>
+          <w:rFonts w:ascii="Century Schoolbook" w:eastAsiaTheme="minorEastAsia" w:hAnsi="Century Schoolbook" w:cstheme="minorBidi"/>
+          <w:color w:val="auto"/>
+          <w:sz w:val="22"/>
+          <w:szCs w:val="22"/>
+        </w:rPr>
+        <w:t>Answer (1) — Runtime and pattern count when lowering minSup</w:t>
+      </w:r>
+    </w:p>
+    <w:p>
+      <w:pPr>
+        <w:pStyle w:val="Web"/>
+        <w:rPr>
+          <w:rFonts w:ascii="Century Schoolbook" w:eastAsiaTheme="minorEastAsia" w:hAnsi="Century Schoolbook" w:cstheme="minorBidi"/>
+          <w:kern w:val="2"/>
+          <w:sz w:val="22"/>
+          <w:szCs w:val="22"/>
+          <w:lang w:eastAsia="zh-TW"/>
+          <w14:ligatures w14:val="standardContextual"/>
+        </w:rPr>
+      </w:pPr>
+      <w:r>
+        <w:rPr>
+          <w:rFonts w:ascii="Century Schoolbook" w:eastAsiaTheme="minorEastAsia" w:hAnsi="Century Schoolbook" w:cstheme="minorBidi"/>
+          <w:kern w:val="2"/>
+          <w:sz w:val="22"/>
+          <w:szCs w:val="22"/>
+          <w:lang w:eastAsia="zh-TW"/>
+          <w14:ligatures w14:val="standardContextual"/>
+        </w:rPr>
+        <w:t>When minSup decreases from 9 to 3, the number of discovered maximal frequent patterns increases significantly from 710 to 9,547. The runtime also increases from 0.2015 to 0.6287 seconds.</w:t>
+      </w:r>
+    </w:p>
+    <w:p>
+      <w:pPr>
+        <w:pStyle w:val="Web"/>
+        <w:rPr>
+          <w:rFonts w:ascii="Century Schoolbook" w:eastAsiaTheme="minorEastAsia" w:hAnsi="Century Schoolbook" w:cstheme="minorBidi"/>
+          <w:kern w:val="2"/>
+          <w:sz w:val="22"/>
+          <w:szCs w:val="22"/>
+          <w:lang w:eastAsia="zh-TW"/>
+          <w14:ligatures w14:val="standardContextual"/>
+        </w:rPr>
+      </w:pPr>
+      <w:r>
+        <w:rPr>
+          <w:rFonts w:ascii="Century Schoolbook" w:eastAsiaTheme="minorEastAsia" w:hAnsi="Century Schoolbook" w:cstheme="minorBidi"/>
+          <w:kern w:val="2"/>
+          <w:sz w:val="22"/>
+          <w:szCs w:val="22"/>
+          <w:lang w:eastAsia="zh-TW"/>
+          <w14:ligatures w14:val="standardContextual"/>
+        </w:rPr>
+        <w:t xml:space="preserve">This happens because a lower minimum support threshold allows more itemsets to qualify as frequent, expanding the search space and increasing computational effort. In </w:t>
+      </w:r>
+      <w:r>
+        <w:rPr>
+          <w:rFonts w:ascii="Century Schoolbook" w:eastAsiaTheme="minorEastAsia" w:hAnsi="Century Schoolbook" w:cstheme="minorBidi"/>
+          <w:kern w:val="2"/>
+          <w:sz w:val="22"/>
+          <w:szCs w:val="22"/>
+          <w:lang w:eastAsia="zh-TW"/>
+          <w14:ligatures w14:val="standardContextual"/>
+        </w:rPr>
+        <w:lastRenderedPageBreak/>
+        <w:t>this experiment, both the number of discovered patterns and the execution time increased.</w:t>
+      </w:r>
+    </w:p>
+    <w:p>
+      <w:pPr>
+        <w:pStyle w:val="3"/>
+        <w:rPr>
+          <w:rFonts w:ascii="Century Schoolbook" w:eastAsiaTheme="minorEastAsia" w:hAnsi="Century Schoolbook" w:cstheme="minorBidi"/>
+          <w:color w:val="auto"/>
+          <w:sz w:val="22"/>
+          <w:szCs w:val="22"/>
+        </w:rPr>
+      </w:pPr>
+      <w:r>
+        <w:rPr>
+          <w:rFonts w:ascii="Century Schoolbook" w:eastAsiaTheme="minorEastAsia" w:hAnsi="Century Schoolbook" w:cstheme="minorBidi"/>
+          <w:color w:val="auto"/>
+          <w:sz w:val="22"/>
+          <w:szCs w:val="22"/>
+        </w:rPr>
+        <w:t>Answer (2) — Top-K k vs. MaxFPGrowth minSup</w:t>
+      </w:r>
+    </w:p>
+    <w:p>
+      <w:pPr>
+        <w:pStyle w:val="Web"/>
+        <w:rPr>
+          <w:rFonts w:ascii="Century Schoolbook" w:eastAsiaTheme="minorEastAsia" w:hAnsi="Century Schoolbook" w:cstheme="minorBidi"/>
+          <w:kern w:val="2"/>
+          <w:sz w:val="22"/>
+          <w:szCs w:val="22"/>
+          <w:lang w:eastAsia="zh-TW"/>
+          <w14:ligatures w14:val="standardContextual"/>
+        </w:rPr>
+      </w:pPr>
+      <w:r>
+        <w:rPr>
+          <w:rFonts w:ascii="Century Schoolbook" w:eastAsiaTheme="minorEastAsia" w:hAnsi="Century Schoolbook" w:cstheme="minorBidi"/>
+          <w:kern w:val="2"/>
+          <w:sz w:val="22"/>
+          <w:szCs w:val="22"/>
+          <w:lang w:eastAsia="zh-TW"/>
+          <w14:ligatures w14:val="standardContextual"/>
+        </w:rPr>
+        <w:t>The parameter k in Top-K FAE specifies how many of the most frequent patterns to retrieve, ranked by support. In our experiment, setting k to 100 and 500 produced 100 and 500 patterns, respectively.</w:t>
+      </w:r>
+    </w:p>
+    <w:p>
+      <w:pPr>
+        <w:pStyle w:val="Web"/>
+        <w:rPr>
+          <w:rFonts w:ascii="Century Schoolbook" w:eastAsiaTheme="minorEastAsia" w:hAnsi="Century Schoolbook" w:cstheme="minorBidi"/>
+          <w:kern w:val="2"/>
+          <w:sz w:val="22"/>
+          <w:szCs w:val="22"/>
+          <w:lang w:eastAsia="zh-TW"/>
+          <w14:ligatures w14:val="standardContextual"/>
+        </w:rPr>
+      </w:pPr>
+      <w:r>
+        <w:rPr>
+          <w:rFonts w:ascii="Century Schoolbook" w:eastAsiaTheme="minorEastAsia" w:hAnsi="Century Schoolbook" w:cstheme="minorBidi"/>
+          <w:kern w:val="2"/>
+          <w:sz w:val="22"/>
+          <w:szCs w:val="22"/>
+          <w:lang w:eastAsia="zh-TW"/>
+          <w14:ligatures w14:val="standardContextual"/>
+        </w:rPr>
+        <w:t>In contrast, minSup in MaxFPGrowth specifies the minimum number of transactions in which an itemset must appear. The algorithm then identifies maximal frequent patterns that satisfy this threshold. Therefore, k controls the target number of patterns, while minSup controls the minimum frequency required for a pattern to qualify.</w:t>
+      </w:r>
+    </w:p>
+    <w:p>
+      <w:pPr>
+        <w:pStyle w:val="3"/>
+        <w:rPr>
+          <w:rFonts w:ascii="Century Schoolbook" w:eastAsiaTheme="minorEastAsia" w:hAnsi="Century Schoolbook" w:cstheme="minorBidi"/>
+          <w:color w:val="auto"/>
+          <w:sz w:val="22"/>
+          <w:szCs w:val="22"/>
+        </w:rPr>
+      </w:pPr>
+      <w:r>
+        <w:rPr>
+          <w:rFonts w:ascii="Century Schoolbook" w:eastAsiaTheme="minorEastAsia" w:hAnsi="Century Schoolbook" w:cstheme="minorBidi"/>
+          <w:color w:val="auto"/>
+          <w:sz w:val="22"/>
+          <w:szCs w:val="22"/>
+        </w:rPr>
+        <w:t>Answer (3) — Maximal vs. standard frequent patterns</w:t>
+      </w:r>
+    </w:p>
+    <w:p>
+      <w:pPr>
+        <w:pStyle w:val="Web"/>
+        <w:rPr>
+          <w:rFonts w:ascii="Century Schoolbook" w:eastAsiaTheme="minorEastAsia" w:hAnsi="Century Schoolbook" w:cstheme="minorBidi"/>
+          <w:kern w:val="2"/>
+          <w:sz w:val="22"/>
+          <w:szCs w:val="22"/>
+          <w:lang w:eastAsia="zh-TW"/>
+          <w14:ligatures w14:val="standardContextual"/>
+        </w:rPr>
+      </w:pPr>
+      <w:r>
+        <w:rPr>
+          <w:rFonts w:ascii="Century Schoolbook" w:eastAsiaTheme="minorEastAsia" w:hAnsi="Century Schoolbook" w:cstheme="minorBidi"/>
+          <w:kern w:val="2"/>
+          <w:sz w:val="22"/>
+          <w:szCs w:val="22"/>
+          <w:lang w:eastAsia="zh-TW"/>
+          <w14:ligatures w14:val="standardContextual"/>
+        </w:rPr>
+        <w:t>Standard frequent pattern mining can return all itemsets that satisfy the minimum support threshold, including many subsets of larger frequent itemsets.</w:t>
+      </w:r>
+    </w:p>
+    <w:p>
+      <w:pPr>
+        <w:pStyle w:val="Web"/>
+        <w:rPr>
+          <w:rFonts w:ascii="Century Schoolbook" w:eastAsiaTheme="minorEastAsia" w:hAnsi="Century Schoolbook" w:cstheme="minorBidi" w:hint="eastAsia"/>
+          <w:kern w:val="2"/>
+          <w:sz w:val="22"/>
+          <w:szCs w:val="22"/>
+          <w:lang w:eastAsia="zh-TW"/>
+          <w14:ligatures w14:val="standardContextual"/>
+        </w:rPr>
+      </w:pPr>
+      <w:r>
+        <w:rPr>
+          <w:rFonts w:ascii="Century Schoolbook" w:eastAsiaTheme="minorEastAsia" w:hAnsi="Century Schoolbook" w:cstheme="minorBidi"/>
+          <w:kern w:val="2"/>
+          <w:sz w:val="22"/>
+          <w:szCs w:val="22"/>
+          <w:lang w:eastAsia="zh-TW"/>
+          <w14:ligatures w14:val="standardContextual"/>
+        </w:rPr>
+        <w:t>Maximal frequent pattern mining only returns frequent itemsets that are not subsets of any larger frequent itemset. By excluding these redundant subsets, it produces a more concise representation of the frequent patterns. However, the exact support of every excluded subset cannot necessarily be recovered from maximal patterns alone.</w:t>
+      </w:r>
+    </w:p>
+    <w:p>
+      <w:pPr>
+        <w:jc w:val="both"/>
+        <w:rPr>
+          <w:rFonts w:ascii="Century Schoolbook" w:hAnsi="Century Schoolbook"/>
+        </w:rPr>
+      </w:pPr>
+      <w:r>
+        <w:rPr>
+          <w:rFonts w:ascii="Century Schoolbook" w:hAnsi="Century Schoolbook"/>
+          <w:b/>
+          <w:bCs/>
+        </w:rPr>
+        <w:t>AI used for this answer:</w:t>
+      </w:r>
+      <w:r>
+        <w:rPr>
+          <w:rFonts w:ascii="Century Schoolbook" w:hAnsi="Century Schoolbook"/>
+        </w:rPr>
+        <w:t xml:space="preserve"> Yes </w:t>
+      </w:r>
+    </w:p>
+    <w:p>
+      <w:pPr>
+        <w:jc w:val="both"/>
+        <w:rPr>
+          <w:rFonts w:ascii="Century Schoolbook" w:hAnsi="Century Schoolbook"/>
+        </w:rPr>
+      </w:pPr>
+      <w:r>
+        <w:rPr>
+          <w:rFonts w:ascii="Century Schoolbook" w:hAnsi="Century Schoolbook"/>
+        </w:rPr>
+        <w:t>I</w:t>
+      </w:r>
+      <w:r>
+        <w:rPr>
+          <w:rFonts w:ascii="Century Schoolbook" w:hAnsi="Century Schoolbook"/>
+          <w:b/>
+          <w:bCs/>
+        </w:rPr>
+        <w:t xml:space="preserve">f yes, how: </w:t>
+      </w:r>
+    </w:p>
+    <w:p>
+      <w:pPr>
+        <w:jc w:val="both"/>
+        <w:rPr>
+          <w:rFonts w:ascii="Century Schoolbook" w:hAnsi="Century Schoolbook"/>
+        </w:rPr>
+      </w:pPr>
+      <w:r>
+        <w:rPr>
+          <w:rFonts w:ascii="Century Schoolbook" w:hAnsi="Century Schoolbook"/>
+        </w:rPr>
+        <w:t>Concept discussion, interpretation of experimental results, and English drafting and editing based on my understanding.</w:t>
+      </w:r>
+    </w:p>
+    <w:p>
+      <w:pPr>
+        <w:jc w:val="both"/>
+        <w:rPr>
+          <w:rFonts w:ascii="Century Schoolbook" w:hAnsi="Century Schoolbook"/>
+        </w:rPr>
+      </w:pPr>
+      <w:r>
+        <w:rPr>
+          <w:rFonts w:ascii="Century Schoolbook" w:hAnsi="Century Schoolbook"/>
+          <w:b/>
+          <w:bCs/>
+        </w:rPr>
+        <w:t>External references (links):</w:t>
+      </w:r>
+      <w:r>
+        <w:rPr>
+          <w:rFonts w:ascii="Century Schoolbook" w:hAnsi="Century Schoolbook"/>
         </w:rPr>
         <w:t xml:space="preserve"> </w:t>
       </w:r>
-      <w:proofErr w:type="spellStart"/>
-      <w:r>
-        <w:rPr>
-          <w:rFonts w:ascii="Century Schoolbook" w:hAnsi="Century Schoolbook"/>
-          <w:b/>
-          <w:bCs/>
-        </w:rPr>
-        <w:t>minSup</w:t>
-      </w:r>
-      <w:proofErr w:type="spellEnd"/>
-      <w:r>
-        <w:rPr>
-          <w:rFonts w:ascii="Century Schoolbook" w:hAnsi="Century Schoolbook"/>
-          <w:b/>
-          <w:bCs/>
-        </w:rPr>
-        <w:t>:</w:t>
-      </w:r>
-    </w:p>
-    <w:p>
-      <w:pPr>
-        <w:jc w:val="both"/>
-        <w:rPr>
-          <w:rFonts w:ascii="Century Schoolbook" w:hAnsi="Century Schoolbook"/>
-        </w:rPr>
-      </w:pPr>
-      <w:r>
-        <w:rPr>
-          <w:rFonts w:ascii="Century Schoolbook" w:hAnsi="Century Schoolbook"/>
-          <w:b/>
-          <w:bCs/>
-        </w:rPr>
-        <w:t>Answer (</w:t>
-      </w:r>
-      <w:proofErr w:type="gramStart"/>
-      <w:r>
-        <w:rPr>
-          <w:rFonts w:ascii="Century Schoolbook" w:hAnsi="Century Schoolbook"/>
-          <w:b/>
-          <w:bCs/>
-        </w:rPr>
-        <w:t>3) —</w:t>
-      </w:r>
-      <w:proofErr w:type="gramEnd"/>
-      <w:r>
-        <w:rPr>
-          <w:rFonts w:ascii="Century Schoolbook" w:hAnsi="Century Schoolbook"/>
-          <w:b/>
-          <w:bCs/>
-        </w:rPr>
-        <w:t xml:space="preserve"> Maximal vs standard frequent patterns:</w:t>
-      </w:r>
-    </w:p>
-    <w:p>
-      <w:pPr>
-        <w:jc w:val="both"/>
-        <w:rPr>
-          <w:rFonts w:ascii="Century Schoolbook" w:hAnsi="Century Schoolbook"/>
-        </w:rPr>
-      </w:pPr>
-      <w:r>
-        <w:rPr>
-          <w:rFonts w:ascii="Century Schoolbook" w:hAnsi="Century Schoolbook"/>
-          <w:b/>
-          <w:bCs/>
-        </w:rPr>
-        <w:t>AI used for this answer:</w:t>
-      </w:r>
-      <w:r>
-        <w:rPr>
-          <w:rFonts w:ascii="Century Schoolbook" w:hAnsi="Century Schoolbook"/>
-        </w:rPr>
-        <w:t xml:space="preserve"> Yes / No </w:t>
-      </w:r>
-    </w:p>
-    <w:p>
-      <w:pPr>
-        <w:jc w:val="both"/>
-        <w:rPr>
-          <w:rFonts w:ascii="Century Schoolbook" w:hAnsi="Century Schoolbook"/>
-        </w:rPr>
-      </w:pPr>
-      <w:r>
-        <w:rPr>
-          <w:rFonts w:ascii="Century Schoolbook" w:hAnsi="Century Schoolbook"/>
-          <w:b/>
-          <w:bCs/>
-        </w:rPr>
-        <w:t>If yes, how:</w:t>
-      </w:r>
-      <w:r>
-        <w:rPr>
-          <w:rFonts w:ascii="Century Schoolbook" w:hAnsi="Century Schoolbook"/>
-        </w:rPr>
-        <w:t xml:space="preserve"> </w:t>
-      </w:r>
-    </w:p>
-    <w:p>
-      <w:pPr>
-        <w:jc w:val="both"/>
-        <w:rPr>
-          <w:rFonts w:ascii="Century Schoolbook" w:hAnsi="Century Schoolbook"/>
-        </w:rPr>
-      </w:pPr>
-      <w:r>
-        <w:rPr>
-          <w:rFonts w:ascii="Century Schoolbook" w:hAnsi="Century Schoolbook"/>
-          <w:b/>
-          <w:bCs/>
-        </w:rPr>
-        <w:t>External references (links):</w:t>
-      </w:r>
-      <w:r>
-        <w:rPr>
-          <w:rFonts w:ascii="Century Schoolbook" w:hAnsi="Century Schoolbook"/>
-        </w:rPr>
-        <w:t xml:space="preserve"> </w:t>
-      </w:r>
-    </w:p>
-    <w:p>
-      <w:pPr>
-        <w:jc w:val="both"/>
-        <w:rPr>
-          <w:rFonts w:ascii="Century Schoolbook" w:hAnsi="Century Schoolbook"/>
-        </w:rPr>
-      </w:pPr>
-      <w:r>
-        <w:rPr>
-          <w:rFonts w:ascii="Century Schoolbook" w:hAnsi="Century Schoolbook"/>
-        </w:rPr>
-        <w:pict w14:anchorId="356EE7BC">
-          <v:rect id="_x0000_i1034" style="width:0;height:1.5pt" o:hralign="center" o:hrstd="t" o:hr="t" fillcolor="#a0a0a0" stroked="f"/>
+    </w:p>
+    <w:p>
+      <w:pPr>
+        <w:jc w:val="both"/>
+        <w:rPr>
+          <w:rFonts w:ascii="Century Schoolbook" w:hAnsi="Century Schoolbook"/>
+        </w:rPr>
+      </w:pPr>
+      <w:r>
+        <w:rPr>
+          <w:rFonts w:ascii="Century Schoolbook" w:hAnsi="Century Schoolbook"/>
+        </w:rPr>
+        <w:t>https://github.com/UdayLab/PAMI?utm_source=chatgpt.com</w:t>
+      </w:r>
+    </w:p>
+    <w:p>
+      <w:pPr>
+        <w:jc w:val="both"/>
+        <w:rPr>
+          <w:rFonts w:ascii="Century Schoolbook" w:hAnsi="Century Schoolbook"/>
+        </w:rPr>
+      </w:pPr>
+      <w:r>
+        <w:rPr>
+          <w:noProof/>
+        </w:rPr>
+      </w:r>
+      <w:r>
+        <w:pict w14:anchorId="7CD9B433">
+          <v:rect id="Horizontal Line 10" o:spid="_x0000_s2053" style="width:451.3pt;height:1.1pt;visibility:visible;mso-wrap-style:square;mso-left-percent:-10001;mso-top-percent:-10001;mso-position-horizontal:absolute;mso-position-horizontal-relative:char;mso-position-vertical:absolute;mso-position-vertical-relative:line;mso-left-percent:-10001;mso-top-percent:-10001;v-text-anchor:top" o:gfxdata="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" filled="f">
+            <o:lock v:ext="edit" rotation="t" aspectratio="t" verticies="t" text="t" shapetype="t"/>
+            <w10:anchorlock/>
+          </v:rect>
         </w:pict>
       </w:r>
     </w:p>
@@ -4170,7 +4474,6 @@
           <w:b/>
           <w:bCs/>
         </w:rPr>
-        <w:lastRenderedPageBreak/>
         <w:t>Question 8: Dimensionality Reduction — Motivation</w:t>
       </w:r>
     </w:p>
@@ -4219,7 +4522,6 @@
         </w:rPr>
         <w:t xml:space="preserve">After text vectorization, the </w:t>
       </w:r>
-      <w:proofErr w:type="spellStart"/>
       <w:r>
         <w:rPr>
           <w:rFonts w:ascii="Century Schoolbook" w:hAnsi="Century Schoolbook"/>
@@ -4228,7 +4530,6 @@
         </w:rPr>
         <w:t>X_counts</w:t>
       </w:r>
-      <w:proofErr w:type="spellEnd"/>
       <w:r>
         <w:rPr>
           <w:rFonts w:ascii="Century Schoolbook" w:hAnsi="Century Schoolbook"/>
@@ -4254,7 +4555,7 @@
     </w:p>
     <w:p>
       <w:pPr>
-        <w:pStyle w:val="ListParagraph"/>
+        <w:pStyle w:val="a9"/>
         <w:numPr>
           <w:ilvl w:val="0"/>
           <w:numId w:val="20"/>
@@ -4270,7 +4571,6 @@
         </w:rPr>
         <w:t xml:space="preserve">If we want to visually map how these documents group by category on a scatter plot, why is it mathematically and visually impossible to plot the raw </w:t>
       </w:r>
-      <w:proofErr w:type="spellStart"/>
       <w:r>
         <w:rPr>
           <w:rFonts w:ascii="Century Schoolbook" w:hAnsi="Century Schoolbook"/>
@@ -4279,7 +4579,6 @@
         </w:rPr>
         <w:t>X_counts</w:t>
       </w:r>
-      <w:proofErr w:type="spellEnd"/>
       <w:r>
         <w:rPr>
           <w:rFonts w:ascii="Century Schoolbook" w:hAnsi="Century Schoolbook"/>
@@ -4289,7 +4588,7 @@
     </w:p>
     <w:p>
       <w:pPr>
-        <w:pStyle w:val="ListParagraph"/>
+        <w:pStyle w:val="a9"/>
         <w:numPr>
           <w:ilvl w:val="0"/>
           <w:numId w:val="20"/>
@@ -4357,6 +4656,7 @@
           <w:b/>
           <w:bCs/>
         </w:rPr>
+        <w:lastRenderedPageBreak/>
         <w:t>If yes, how:</w:t>
       </w:r>
       <w:r>
@@ -4397,10 +4697,15 @@
       </w:pPr>
       <w:r>
         <w:rPr>
-          <w:rFonts w:ascii="Century Schoolbook" w:hAnsi="Century Schoolbook"/>
-        </w:rPr>
-        <w:pict w14:anchorId="7ABCF6D4">
-          <v:rect id="_x0000_i1035" style="width:0;height:1.5pt" o:hralign="center" o:hrstd="t" o:hr="t" fillcolor="#a0a0a0" stroked="f"/>
+          <w:noProof/>
+        </w:rPr>
+      </w:r>
+      <w:r>
+        <w:pict w14:anchorId="572E96DF">
+          <v:rect id="Horizontal Line 11" o:spid="_x0000_s2052" style="width:451.3pt;height:1.1pt;visibility:visible;mso-wrap-style:square;mso-left-percent:-10001;mso-top-percent:-10001;mso-position-horizontal:absolute;mso-position-horizontal-relative:char;mso-position-vertical:absolute;mso-position-vertical-relative:line;mso-left-percent:-10001;mso-top-percent:-10001;v-text-anchor:top" o:gfxdata="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" filled="f">
+            <o:lock v:ext="edit" rotation="t" aspectratio="t" verticies="t" text="t" shapetype="t"/>
+            <w10:anchorlock/>
+          </v:rect>
         </w:pict>
       </w:r>
     </w:p>
@@ -4536,7 +4841,7 @@
     </w:p>
     <w:p>
       <w:pPr>
-        <w:pStyle w:val="ListParagraph"/>
+        <w:pStyle w:val="a9"/>
         <w:numPr>
           <w:ilvl w:val="0"/>
           <w:numId w:val="21"/>
@@ -4569,7 +4874,7 @@
     </w:p>
     <w:p>
       <w:pPr>
-        <w:pStyle w:val="ListParagraph"/>
+        <w:pStyle w:val="a9"/>
         <w:numPr>
           <w:ilvl w:val="0"/>
           <w:numId w:val="21"/>
@@ -4630,7 +4935,7 @@
     </w:p>
     <w:p>
       <w:pPr>
-        <w:pStyle w:val="ListParagraph"/>
+        <w:pStyle w:val="a9"/>
         <w:numPr>
           <w:ilvl w:val="0"/>
           <w:numId w:val="21"/>
@@ -4792,11 +5097,15 @@
       </w:pPr>
       <w:r>
         <w:rPr>
-          <w:rFonts w:ascii="Century Schoolbook" w:hAnsi="Century Schoolbook"/>
-        </w:rPr>
-        <w:lastRenderedPageBreak/>
-        <w:pict w14:anchorId="3E56138F">
-          <v:rect id="_x0000_i1036" style="width:0;height:1.5pt" o:hralign="center" o:hrstd="t" o:hr="t" fillcolor="#a0a0a0" stroked="f"/>
+          <w:noProof/>
+        </w:rPr>
+      </w:r>
+      <w:r>
+        <w:pict w14:anchorId="49D720E8">
+          <v:rect id="Horizontal Line 12" o:spid="_x0000_s2051" style="width:451.3pt;height:1.1pt;visibility:visible;mso-wrap-style:square;mso-left-percent:-10001;mso-top-percent:-10001;mso-position-horizontal:absolute;mso-position-horizontal-relative:char;mso-position-vertical:absolute;mso-position-vertical-relative:line;mso-left-percent:-10001;mso-top-percent:-10001;v-text-anchor:top" o:gfxdata="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" filled="f">
+            <o:lock v:ext="edit" rotation="t" aspectratio="t" verticies="t" text="t" shapetype="t"/>
+            <w10:anchorlock/>
+          </v:rect>
         </w:pict>
       </w:r>
     </w:p>
@@ -4877,7 +5186,6 @@
         </w:rPr>
         <w:t xml:space="preserve"> (integers 0, 1, 2, 3). Then look at the output of </w:t>
       </w:r>
-      <w:proofErr w:type="spellStart"/>
       <w:r>
         <w:rPr>
           <w:rFonts w:ascii="Century Schoolbook" w:hAnsi="Century Schoolbook"/>
@@ -4886,7 +5194,6 @@
         </w:rPr>
         <w:t>LabelBinarizer</w:t>
       </w:r>
-      <w:proofErr w:type="spellEnd"/>
       <w:r>
         <w:rPr>
           <w:rFonts w:ascii="Century Schoolbook" w:hAnsi="Century Schoolbook"/>
@@ -4912,7 +5219,7 @@
     </w:p>
     <w:p>
       <w:pPr>
-        <w:pStyle w:val="ListParagraph"/>
+        <w:pStyle w:val="a9"/>
         <w:numPr>
           <w:ilvl w:val="0"/>
           <w:numId w:val="23"/>
@@ -4931,7 +5238,7 @@
     </w:p>
     <w:p>
       <w:pPr>
-        <w:pStyle w:val="ListParagraph"/>
+        <w:pStyle w:val="a9"/>
         <w:numPr>
           <w:ilvl w:val="0"/>
           <w:numId w:val="23"/>
@@ -4964,7 +5271,7 @@
     </w:p>
     <w:p>
       <w:pPr>
-        <w:pStyle w:val="ListParagraph"/>
+        <w:pStyle w:val="a9"/>
         <w:numPr>
           <w:ilvl w:val="0"/>
           <w:numId w:val="23"/>
@@ -4983,7 +5290,7 @@
     </w:p>
     <w:p>
       <w:pPr>
-        <w:pStyle w:val="ListParagraph"/>
+        <w:pStyle w:val="a9"/>
         <w:jc w:val="both"/>
         <w:rPr>
           <w:rFonts w:ascii="Century Schoolbook" w:hAnsi="Century Schoolbook"/>
@@ -5081,10 +5388,15 @@
       </w:pPr>
       <w:r>
         <w:rPr>
-          <w:rFonts w:ascii="Century Schoolbook" w:hAnsi="Century Schoolbook"/>
-        </w:rPr>
-        <w:pict w14:anchorId="07392833">
-          <v:rect id="_x0000_i1037" style="width:0;height:1.5pt" o:hralign="center" o:hrstd="t" o:hr="t" fillcolor="#a0a0a0" stroked="f"/>
+          <w:noProof/>
+        </w:rPr>
+      </w:r>
+      <w:r>
+        <w:pict w14:anchorId="497C0E4F">
+          <v:rect id="Horizontal Line 13" o:spid="_x0000_s2050" style="width:451.3pt;height:1.1pt;visibility:visible;mso-wrap-style:square;mso-left-percent:-10001;mso-top-percent:-10001;mso-position-horizontal:absolute;mso-position-horizontal-relative:char;mso-position-vertical:absolute;mso-position-vertical-relative:line;mso-left-percent:-10001;mso-top-percent:-10001;v-text-anchor:top" o:gfxdata="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" filled="f">
+            <o:lock v:ext="edit" rotation="t" aspectratio="t" verticies="t" text="t" shapetype="t"/>
+            <w10:anchorlock/>
+          </v:rect>
         </w:pict>
       </w:r>
     </w:p>
@@ -5099,7 +5411,7 @@
 </file>
 
 <file path=word/endnotes.xml><?xml version="1.0" encoding="utf-8"?>
-<w:endnotes xmlns:wpc="http://schemas.microsoft.com/office/word/2010/wordprocessingCanvas" xmlns:cx="http://schemas.microsoft.com/office/drawing/2014/chartex" xmlns:cx1="http://schemas.microsoft.com/office/drawing/2015/9/8/chartex" xmlns:cx2="http://schemas.microsoft.com/office/drawing/2015/10/21/chartex" xmlns:cx3="http://schemas.microsoft.com/office/drawing/2016/5/9/chartex" xmlns:cx4="http://schemas.microsoft.com/office/drawing/2016/5/10/chartex" xmlns:cx5="http://schemas.microsoft.com/office/drawing/2016/5/11/chartex" xmlns:cx6="http://schemas.microsoft.com/office/drawing/2016/5/12/chartex" xmlns:cx7="http://schemas.microsoft.com/office/drawing/2016/5/13/chartex" xmlns:cx8="http://schemas.microsoft.com/office/drawing/2016/5/14/chartex" xmlns:mc="http://schemas.openxmlformats.org/markup-compatibility/2006" xmlns:aink="http://schemas.microsoft.com/office/drawing/2016/ink" xmlns:am3d="http://schemas.microsoft.com/office/drawing/2017/model3d" xmlns:o="urn:schemas-microsoft-com:office:office" xmlns:oel="http://schemas.microsoft.com/office/2019/extlst" xmlns:r="http://schemas.openxmlformats.org/officeDocument/2006/relationships" xmlns:m="http://schemas.openxmlformats.org/officeDocument/2006/math" xmlns:v="urn:schemas-microsoft-com:vml" xmlns:wp14="http://schemas.microsoft.com/office/word/2010/wordprocessingDrawing" xmlns:wp="http://schemas.openxmlformats.org/drawingml/2006/wordprocessingDrawing" xmlns:w10="urn:schemas-microsoft-com:office:word" xmlns:w="http://schemas.openxmlformats.org/wordprocessingml/2006/main" xmlns:w14="http://schemas.microsoft.com/office/word/2010/wordml" xmlns:w15="http://schemas.microsoft.com/office/word/2012/wordml" xmlns:w16cex="http://schemas.microsoft.com/office/word/2018/wordml/cex" xmlns:w16cid="http://schemas.microsoft.com/office/word/2016/wordml/cid" xmlns:w16="http://schemas.microsoft.com/office/word/2018/wordml" xmlns:w16du="http://schemas.microsoft.com/office/word/2023/wordml/word16du" xmlns:w16sdtdh="http://schemas.microsoft.com/office/word/2020/wordml/sdtdatahash" xmlns:w16sdtfl="http://schemas.microsoft.com/office/word/2024/wordml/sdtformatlock" xmlns:w16se="http://schemas.microsoft.com/office/word/2015/wordml/symex" xmlns:wpg="http://schemas.microsoft.com/office/word/2010/wordprocessingGroup" xmlns:wpi="http://schemas.microsoft.com/office/word/2010/wordprocessingInk" xmlns:wne="http://schemas.microsoft.com/office/word/2006/wordml" xmlns:wps="http://schemas.microsoft.com/office/word/2010/wordprocessingShape" mc:Ignorable="w14 w15 w16se w16cid w16 w16cex w16sdtdh w16sdtfl w16du wp14">
+<w:endnotes xmlns:wpc="http://schemas.microsoft.com/office/word/2010/wordprocessingCanvas" xmlns:cx="http://schemas.microsoft.com/office/drawing/2014/chartex" xmlns:cx1="http://schemas.microsoft.com/office/drawing/2015/9/8/chartex" xmlns:cx2="http://schemas.microsoft.com/office/drawing/2015/10/21/chartex" xmlns:cx3="http://schemas.microsoft.com/office/drawing/2016/5/9/chartex" xmlns:cx4="http://schemas.microsoft.com/office/drawing/2016/5/10/chartex" xmlns:cx5="http://schemas.microsoft.com/office/drawing/2016/5/11/chartex" xmlns:cx6="http://schemas.microsoft.com/office/drawing/2016/5/12/chartex" xmlns:cx7="http://schemas.microsoft.com/office/drawing/2016/5/13/chartex" xmlns:cx8="http://schemas.microsoft.com/office/drawing/2016/5/14/chartex" xmlns:mc="http://schemas.openxmlformats.org/markup-compatibility/2006" xmlns:m="http://schemas.openxmlformats.org/officeDocument/2006/math" xmlns:aink="http://schemas.microsoft.com/office/drawing/2016/ink" xmlns:am3d="http://schemas.microsoft.com/office/drawing/2017/model3d" xmlns:oel="http://schemas.microsoft.com/office/2019/extlst" xmlns:r="http://schemas.openxmlformats.org/officeDocument/2006/relationships" xmlns:wp14="http://schemas.microsoft.com/office/word/2010/wordprocessingDrawing" xmlns:wp="http://schemas.openxmlformats.org/drawingml/2006/wordprocessingDrawing" xmlns:wpg="http://schemas.microsoft.com/office/word/2010/wordprocessingGroup" xmlns:wpi="http://schemas.microsoft.com/office/word/2010/wordprocessingInk" xmlns:wps="http://schemas.microsoft.com/office/word/2010/wordprocessingShape" xmlns:o="urn:schemas-microsoft-com:office:office" xmlns:v="urn:schemas-microsoft-com:vml" xmlns:w10="urn:schemas-microsoft-com:office:word" xmlns:w="http://schemas.openxmlformats.org/wordprocessingml/2006/main" xmlns:w14="http://schemas.microsoft.com/office/word/2010/wordml" xmlns:w15="http://schemas.microsoft.com/office/word/2012/wordml" xmlns:w16cex="http://schemas.microsoft.com/office/word/2018/wordml/cex" xmlns:w16cid="http://schemas.microsoft.com/office/word/2016/wordml/cid" xmlns:w16="http://schemas.microsoft.com/office/word/2018/wordml" xmlns:w16sdtdh="http://schemas.microsoft.com/office/word/2020/wordml/sdtdatahash" xmlns:w16sdtfl="http://schemas.microsoft.com/office/word/2024/wordml/sdtformatlock" xmlns:w16se="http://schemas.microsoft.com/office/word/2015/wordml/symex" xmlns:w16du="http://schemas.microsoft.com/office/word/2023/wordml/word16du" xmlns:wne="http://schemas.microsoft.com/office/word/2006/wordml" mc:Ignorable="w14 w15 w16se w16cid w16 w16cex w16sdtdh w16sdtfl w16du wp14">
   <w:endnote w:type="separator" w:id="-1">
     <w:p>
       <w:pPr>
@@ -5124,7 +5436,7 @@
 </file>
 
 <file path=word/footnotes.xml><?xml version="1.0" encoding="utf-8"?>
-<w:footnotes xmlns:wpc="http://schemas.microsoft.com/office/word/2010/wordprocessingCanvas" xmlns:cx="http://schemas.microsoft.com/office/drawing/2014/chartex" xmlns:cx1="http://schemas.microsoft.com/office/drawing/2015/9/8/chartex" xmlns:cx2="http://schemas.microsoft.com/office/drawing/2015/10/21/chartex" xmlns:cx3="http://schemas.microsoft.com/office/drawing/2016/5/9/chartex" xmlns:cx4="http://schemas.microsoft.com/office/drawing/2016/5/10/chartex" xmlns:cx5="http://schemas.microsoft.com/office/drawing/2016/5/11/chartex" xmlns:cx6="http://schemas.microsoft.com/office/drawing/2016/5/12/chartex" xmlns:cx7="http://schemas.microsoft.com/office/drawing/2016/5/13/chartex" xmlns:cx8="http://schemas.microsoft.com/office/drawing/2016/5/14/chartex" xmlns:mc="http://schemas.openxmlformats.org/markup-compatibility/2006" xmlns:aink="http://schemas.microsoft.com/office/drawing/2016/ink" xmlns:am3d="http://schemas.microsoft.com/office/drawing/2017/model3d" xmlns:o="urn:schemas-microsoft-com:office:office" xmlns:oel="http://schemas.microsoft.com/office/2019/extlst" xmlns:r="http://schemas.openxmlformats.org/officeDocument/2006/relationships" xmlns:m="http://schemas.openxmlformats.org/officeDocument/2006/math" xmlns:v="urn:schemas-microsoft-com:vml" xmlns:wp14="http://schemas.microsoft.com/office/word/2010/wordprocessingDrawing" xmlns:wp="http://schemas.openxmlformats.org/drawingml/2006/wordprocessingDrawing" xmlns:w10="urn:schemas-microsoft-com:office:word" xmlns:w="http://schemas.openxmlformats.org/wordprocessingml/2006/main" xmlns:w14="http://schemas.microsoft.com/office/word/2010/wordml" xmlns:w15="http://schemas.microsoft.com/office/word/2012/wordml" xmlns:w16cex="http://schemas.microsoft.com/office/word/2018/wordml/cex" xmlns:w16cid="http://schemas.microsoft.com/office/word/2016/wordml/cid" xmlns:w16="http://schemas.microsoft.com/office/word/2018/wordml" xmlns:w16du="http://schemas.microsoft.com/office/word/2023/wordml/word16du" xmlns:w16sdtdh="http://schemas.microsoft.com/office/word/2020/wordml/sdtdatahash" xmlns:w16sdtfl="http://schemas.microsoft.com/office/word/2024/wordml/sdtformatlock" xmlns:w16se="http://schemas.microsoft.com/office/word/2015/wordml/symex" xmlns:wpg="http://schemas.microsoft.com/office/word/2010/wordprocessingGroup" xmlns:wpi="http://schemas.microsoft.com/office/word/2010/wordprocessingInk" xmlns:wne="http://schemas.microsoft.com/office/word/2006/wordml" xmlns:wps="http://schemas.microsoft.com/office/word/2010/wordprocessingShape" mc:Ignorable="w14 w15 w16se w16cid w16 w16cex w16sdtdh w16sdtfl w16du wp14">
+<w:footnotes xmlns:wpc="http://schemas.microsoft.com/office/word/2010/wordprocessingCanvas" xmlns:cx="http://schemas.microsoft.com/office/drawing/2014/chartex" xmlns:cx1="http://schemas.microsoft.com/office/drawing/2015/9/8/chartex" xmlns:cx2="http://schemas.microsoft.com/office/drawing/2015/10/21/chartex" xmlns:cx3="http://schemas.microsoft.com/office/drawing/2016/5/9/chartex" xmlns:cx4="http://schemas.microsoft.com/office/drawing/2016/5/10/chartex" xmlns:cx5="http://schemas.microsoft.com/office/drawing/2016/5/11/chartex" xmlns:cx6="http://schemas.microsoft.com/office/drawing/2016/5/12/chartex" xmlns:cx7="http://schemas.microsoft.com/office/drawing/2016/5/13/chartex" xmlns:cx8="http://schemas.microsoft.com/office/drawing/2016/5/14/chartex" xmlns:mc="http://schemas.openxmlformats.org/markup-compatibility/2006" xmlns:m="http://schemas.openxmlformats.org/officeDocument/2006/math" xmlns:aink="http://schemas.microsoft.com/office/drawing/2016/ink" xmlns:am3d="http://schemas.microsoft.com/office/drawing/2017/model3d" xmlns:oel="http://schemas.microsoft.com/office/2019/extlst" xmlns:r="http://schemas.openxmlformats.org/officeDocument/2006/relationships" xmlns:wp14="http://schemas.microsoft.com/office/word/2010/wordprocessingDrawing" xmlns:wp="http://schemas.openxmlformats.org/drawingml/2006/wordprocessingDrawing" xmlns:wpg="http://schemas.microsoft.com/office/word/2010/wordprocessingGroup" xmlns:wpi="http://schemas.microsoft.com/office/word/2010/wordprocessingInk" xmlns:wps="http://schemas.microsoft.com/office/word/2010/wordprocessingShape" xmlns:o="urn:schemas-microsoft-com:office:office" xmlns:v="urn:schemas-microsoft-com:vml" xmlns:w10="urn:schemas-microsoft-com:office:word" xmlns:w="http://schemas.openxmlformats.org/wordprocessingml/2006/main" xmlns:w14="http://schemas.microsoft.com/office/word/2010/wordml" xmlns:w15="http://schemas.microsoft.com/office/word/2012/wordml" xmlns:w16cex="http://schemas.microsoft.com/office/word/2018/wordml/cex" xmlns:w16cid="http://schemas.microsoft.com/office/word/2016/wordml/cid" xmlns:w16="http://schemas.microsoft.com/office/word/2018/wordml" xmlns:w16sdtdh="http://schemas.microsoft.com/office/word/2020/wordml/sdtdatahash" xmlns:w16sdtfl="http://schemas.microsoft.com/office/word/2024/wordml/sdtformatlock" xmlns:w16se="http://schemas.microsoft.com/office/word/2015/wordml/symex" xmlns:w16du="http://schemas.microsoft.com/office/word/2023/wordml/word16du" xmlns:wne="http://schemas.microsoft.com/office/word/2006/wordml" mc:Ignorable="w14 w15 w16se w16cid w16 w16cex w16sdtdh w16sdtfl w16du wp14">
   <w:footnote w:type="separator" w:id="-1">
     <w:p>
       <w:pPr>
@@ -5149,7 +5461,7 @@
 </file>
 
 <file path=word/numbering.xml><?xml version="1.0" encoding="utf-8"?>
-<w:numbering xmlns:wpc="http://schemas.microsoft.com/office/word/2010/wordprocessingCanvas" xmlns:cx="http://schemas.microsoft.com/office/drawing/2014/chartex" xmlns:cx1="http://schemas.microsoft.com/office/drawing/2015/9/8/chartex" xmlns:cx2="http://schemas.microsoft.com/office/drawing/2015/10/21/chartex" xmlns:cx3="http://schemas.microsoft.com/office/drawing/2016/5/9/chartex" xmlns:cx4="http://schemas.microsoft.com/office/drawing/2016/5/10/chartex" xmlns:cx5="http://schemas.microsoft.com/office/drawing/2016/5/11/chartex" xmlns:cx6="http://schemas.microsoft.com/office/drawing/2016/5/12/chartex" xmlns:cx7="http://schemas.microsoft.com/office/drawing/2016/5/13/chartex" xmlns:cx8="http://schemas.microsoft.com/office/drawing/2016/5/14/chartex" xmlns:mc="http://schemas.openxmlformats.org/markup-compatibility/2006" xmlns:aink="http://schemas.microsoft.com/office/drawing/2016/ink" xmlns:am3d="http://schemas.microsoft.com/office/drawing/2017/model3d" xmlns:o="urn:schemas-microsoft-com:office:office" xmlns:oel="http://schemas.microsoft.com/office/2019/extlst" xmlns:r="http://schemas.openxmlformats.org/officeDocument/2006/relationships" xmlns:m="http://schemas.openxmlformats.org/officeDocument/2006/math" xmlns:v="urn:schemas-microsoft-com:vml" xmlns:wp14="http://schemas.microsoft.com/office/word/2010/wordprocessingDrawing" xmlns:wp="http://schemas.openxmlformats.org/drawingml/2006/wordprocessingDrawing" xmlns:w10="urn:schemas-microsoft-com:office:word" xmlns:w="http://schemas.openxmlformats.org/wordprocessingml/2006/main" xmlns:w14="http://schemas.microsoft.com/office/word/2010/wordml" xmlns:w15="http://schemas.microsoft.com/office/word/2012/wordml" xmlns:w16cex="http://schemas.microsoft.com/office/word/2018/wordml/cex" xmlns:w16cid="http://schemas.microsoft.com/office/word/2016/wordml/cid" xmlns:w16="http://schemas.microsoft.com/office/word/2018/wordml" xmlns:w16du="http://schemas.microsoft.com/office/word/2023/wordml/word16du" xmlns:w16sdtdh="http://schemas.microsoft.com/office/word/2020/wordml/sdtdatahash" xmlns:w16sdtfl="http://schemas.microsoft.com/office/word/2024/wordml/sdtformatlock" xmlns:w16se="http://schemas.microsoft.com/office/word/2015/wordml/symex" xmlns:wpg="http://schemas.microsoft.com/office/word/2010/wordprocessingGroup" xmlns:wpi="http://schemas.microsoft.com/office/word/2010/wordprocessingInk" xmlns:wne="http://schemas.microsoft.com/office/word/2006/wordml" xmlns:wps="http://schemas.microsoft.com/office/word/2010/wordprocessingShape" mc:Ignorable="w14 w15 w16se w16cid w16 w16cex w16sdtdh w16sdtfl w16du wp14">
+<w:numbering xmlns:wpc="http://schemas.microsoft.com/office/word/2010/wordprocessingCanvas" xmlns:cx="http://schemas.microsoft.com/office/drawing/2014/chartex" xmlns:cx1="http://schemas.microsoft.com/office/drawing/2015/9/8/chartex" xmlns:cx2="http://schemas.microsoft.com/office/drawing/2015/10/21/chartex" xmlns:cx3="http://schemas.microsoft.com/office/drawing/2016/5/9/chartex" xmlns:cx4="http://schemas.microsoft.com/office/drawing/2016/5/10/chartex" xmlns:cx5="http://schemas.microsoft.com/office/drawing/2016/5/11/chartex" xmlns:cx6="http://schemas.microsoft.com/office/drawing/2016/5/12/chartex" xmlns:cx7="http://schemas.microsoft.com/office/drawing/2016/5/13/chartex" xmlns:cx8="http://schemas.microsoft.com/office/drawing/2016/5/14/chartex" xmlns:mc="http://schemas.openxmlformats.org/markup-compatibility/2006" xmlns:m="http://schemas.openxmlformats.org/officeDocument/2006/math" xmlns:aink="http://schemas.microsoft.com/office/drawing/2016/ink" xmlns:am3d="http://schemas.microsoft.com/office/drawing/2017/model3d" xmlns:oel="http://schemas.microsoft.com/office/2019/extlst" xmlns:r="http://schemas.openxmlformats.org/officeDocument/2006/relationships" xmlns:wp14="http://schemas.microsoft.com/office/word/2010/wordprocessingDrawing" xmlns:wp="http://schemas.openxmlformats.org/drawingml/2006/wordprocessingDrawing" xmlns:wpg="http://schemas.microsoft.com/office/word/2010/wordprocessingGroup" xmlns:wpi="http://schemas.microsoft.com/office/word/2010/wordprocessingInk" xmlns:wps="http://schemas.microsoft.com/office/word/2010/wordprocessingShape" xmlns:o="urn:schemas-microsoft-com:office:office" xmlns:v="urn:schemas-microsoft-com:vml" xmlns:w10="urn:schemas-microsoft-com:office:word" xmlns:w="http://schemas.openxmlformats.org/wordprocessingml/2006/main" xmlns:w14="http://schemas.microsoft.com/office/word/2010/wordml" xmlns:w15="http://schemas.microsoft.com/office/word/2012/wordml" xmlns:w16cex="http://schemas.microsoft.com/office/word/2018/wordml/cex" xmlns:w16cid="http://schemas.microsoft.com/office/word/2016/wordml/cid" xmlns:w16="http://schemas.microsoft.com/office/word/2018/wordml" xmlns:w16sdtdh="http://schemas.microsoft.com/office/word/2020/wordml/sdtdatahash" xmlns:w16sdtfl="http://schemas.microsoft.com/office/word/2024/wordml/sdtformatlock" xmlns:w16se="http://schemas.microsoft.com/office/word/2015/wordml/symex" xmlns:w16du="http://schemas.microsoft.com/office/word/2023/wordml/word16du" xmlns:wne="http://schemas.microsoft.com/office/word/2006/wordml" mc:Ignorable="w14 w15 w16se w16cid w16 w16cex w16sdtdh w16sdtfl w16du wp14">
   <w:abstractNum w:abstractNumId="0" w15:restartNumberingAfterBreak="0">
     <w:nsid w:val="02604484"/>
     <w:multiLevelType w:val="multilevel"/>
@@ -8160,7 +8472,7 @@
 </file>
 
 <file path=word/styles.xml><?xml version="1.0" encoding="utf-8"?>
-<w:styles xmlns:mc="http://schemas.openxmlformats.org/markup-compatibility/2006" xmlns:r="http://schemas.openxmlformats.org/officeDocument/2006/relationships" xmlns:w="http://schemas.openxmlformats.org/wordprocessingml/2006/main" xmlns:w14="http://schemas.microsoft.com/office/word/2010/wordml" xmlns:w15="http://schemas.microsoft.com/office/word/2012/wordml" xmlns:w16cex="http://schemas.microsoft.com/office/word/2018/wordml/cex" xmlns:w16cid="http://schemas.microsoft.com/office/word/2016/wordml/cid" xmlns:w16="http://schemas.microsoft.com/office/word/2018/wordml" xmlns:w16du="http://schemas.microsoft.com/office/word/2023/wordml/word16du" xmlns:w16sdtdh="http://schemas.microsoft.com/office/word/2020/wordml/sdtdatahash" xmlns:w16sdtfl="http://schemas.microsoft.com/office/word/2024/wordml/sdtformatlock" xmlns:w16se="http://schemas.microsoft.com/office/word/2015/wordml/symex" mc:Ignorable="w14 w15 w16se w16cid w16 w16cex w16sdtdh w16sdtfl w16du">
+<w:styles xmlns:mc="http://schemas.openxmlformats.org/markup-compatibility/2006" xmlns:r="http://schemas.openxmlformats.org/officeDocument/2006/relationships" xmlns:w="http://schemas.openxmlformats.org/wordprocessingml/2006/main" xmlns:w14="http://schemas.microsoft.com/office/word/2010/wordml" xmlns:w15="http://schemas.microsoft.com/office/word/2012/wordml" xmlns:w16cex="http://schemas.microsoft.com/office/word/2018/wordml/cex" xmlns:w16cid="http://schemas.microsoft.com/office/word/2016/wordml/cid" xmlns:w16="http://schemas.microsoft.com/office/word/2018/wordml" xmlns:w16sdtdh="http://schemas.microsoft.com/office/word/2020/wordml/sdtdatahash" xmlns:w16sdtfl="http://schemas.microsoft.com/office/word/2024/wordml/sdtformatlock" xmlns:w16se="http://schemas.microsoft.com/office/word/2015/wordml/symex" xmlns:w16du="http://schemas.microsoft.com/office/word/2023/wordml/word16du" mc:Ignorable="w14 w15 w16se w16cid w16 w16cex w16sdtdh w16sdtfl w16du">
   <w:docDefaults>
     <w:rPrDefault>
       <w:rPr>
@@ -8556,15 +8868,15 @@
     <w:lsdException w:name="Unresolved Mention" w:semiHidden="1" w:unhideWhenUsed="1"/>
     <w:lsdException w:name="Smart Link" w:semiHidden="1" w:unhideWhenUsed="1"/>
   </w:latentStyles>
-  <w:style w:type="paragraph" w:default="1" w:styleId="Normal">
+  <w:style w:type="paragraph" w:default="1" w:styleId="a">
     <w:name w:val="Normal"/>
     <w:qFormat/>
   </w:style>
-  <w:style w:type="paragraph" w:styleId="Heading1">
+  <w:style w:type="paragraph" w:styleId="1">
     <w:name w:val="heading 1"/>
-    <w:basedOn w:val="Normal"/>
-    <w:next w:val="Normal"/>
-    <w:link w:val="Heading1Char"/>
+    <w:basedOn w:val="a"/>
+    <w:next w:val="a"/>
+    <w:link w:val="10"/>
     <w:uiPriority w:val="9"/>
     <w:qFormat/>
     <w:rsid w:val="0018685D"/>
@@ -8581,11 +8893,11 @@
       <w:szCs w:val="40"/>
     </w:rPr>
   </w:style>
-  <w:style w:type="paragraph" w:styleId="Heading2">
+  <w:style w:type="paragraph" w:styleId="2">
     <w:name w:val="heading 2"/>
-    <w:basedOn w:val="Normal"/>
-    <w:next w:val="Normal"/>
-    <w:link w:val="Heading2Char"/>
+    <w:basedOn w:val="a"/>
+    <w:next w:val="a"/>
+    <w:link w:val="20"/>
     <w:uiPriority w:val="9"/>
     <w:semiHidden/>
     <w:unhideWhenUsed/>
@@ -8604,11 +8916,11 @@
       <w:szCs w:val="32"/>
     </w:rPr>
   </w:style>
-  <w:style w:type="paragraph" w:styleId="Heading3">
+  <w:style w:type="paragraph" w:styleId="3">
     <w:name w:val="heading 3"/>
-    <w:basedOn w:val="Normal"/>
-    <w:next w:val="Normal"/>
-    <w:link w:val="Heading3Char"/>
+    <w:basedOn w:val="a"/>
+    <w:next w:val="a"/>
+    <w:link w:val="30"/>
     <w:uiPriority w:val="9"/>
     <w:semiHidden/>
     <w:unhideWhenUsed/>
@@ -8627,11 +8939,11 @@
       <w:szCs w:val="28"/>
     </w:rPr>
   </w:style>
-  <w:style w:type="paragraph" w:styleId="Heading4">
+  <w:style w:type="paragraph" w:styleId="4">
     <w:name w:val="heading 4"/>
-    <w:basedOn w:val="Normal"/>
-    <w:next w:val="Normal"/>
-    <w:link w:val="Heading4Char"/>
+    <w:basedOn w:val="a"/>
+    <w:next w:val="a"/>
+    <w:link w:val="40"/>
     <w:uiPriority w:val="9"/>
     <w:semiHidden/>
     <w:unhideWhenUsed/>
@@ -8650,11 +8962,11 @@
       <w:color w:val="0F4761" w:themeColor="accent1" w:themeShade="BF"/>
     </w:rPr>
   </w:style>
-  <w:style w:type="paragraph" w:styleId="Heading5">
+  <w:style w:type="paragraph" w:styleId="5">
     <w:name w:val="heading 5"/>
-    <w:basedOn w:val="Normal"/>
-    <w:next w:val="Normal"/>
-    <w:link w:val="Heading5Char"/>
+    <w:basedOn w:val="a"/>
+    <w:next w:val="a"/>
+    <w:link w:val="50"/>
     <w:uiPriority w:val="9"/>
     <w:semiHidden/>
     <w:unhideWhenUsed/>
@@ -8671,11 +8983,11 @@
       <w:color w:val="0F4761" w:themeColor="accent1" w:themeShade="BF"/>
     </w:rPr>
   </w:style>
-  <w:style w:type="paragraph" w:styleId="Heading6">
+  <w:style w:type="paragraph" w:styleId="6">
     <w:name w:val="heading 6"/>
-    <w:basedOn w:val="Normal"/>
-    <w:next w:val="Normal"/>
-    <w:link w:val="Heading6Char"/>
+    <w:basedOn w:val="a"/>
+    <w:next w:val="a"/>
+    <w:link w:val="60"/>
     <w:uiPriority w:val="9"/>
     <w:semiHidden/>
     <w:unhideWhenUsed/>
@@ -8694,11 +9006,11 @@
       <w:color w:val="595959" w:themeColor="text1" w:themeTint="A6"/>
     </w:rPr>
   </w:style>
-  <w:style w:type="paragraph" w:styleId="Heading7">
+  <w:style w:type="paragraph" w:styleId="7">
     <w:name w:val="heading 7"/>
-    <w:basedOn w:val="Normal"/>
-    <w:next w:val="Normal"/>
-    <w:link w:val="Heading7Char"/>
+    <w:basedOn w:val="a"/>
+    <w:next w:val="a"/>
+    <w:link w:val="70"/>
     <w:uiPriority w:val="9"/>
     <w:semiHidden/>
     <w:unhideWhenUsed/>
@@ -8715,11 +9027,11 @@
       <w:color w:val="595959" w:themeColor="text1" w:themeTint="A6"/>
     </w:rPr>
   </w:style>
-  <w:style w:type="paragraph" w:styleId="Heading8">
+  <w:style w:type="paragraph" w:styleId="8">
     <w:name w:val="heading 8"/>
-    <w:basedOn w:val="Normal"/>
-    <w:next w:val="Normal"/>
-    <w:link w:val="Heading8Char"/>
+    <w:basedOn w:val="a"/>
+    <w:next w:val="a"/>
+    <w:link w:val="80"/>
     <w:uiPriority w:val="9"/>
     <w:semiHidden/>
     <w:unhideWhenUsed/>
@@ -8738,11 +9050,11 @@
       <w:color w:val="272727" w:themeColor="text1" w:themeTint="D8"/>
     </w:rPr>
   </w:style>
-  <w:style w:type="paragraph" w:styleId="Heading9">
+  <w:style w:type="paragraph" w:styleId="9">
     <w:name w:val="heading 9"/>
-    <w:basedOn w:val="Normal"/>
-    <w:next w:val="Normal"/>
-    <w:link w:val="Heading9Char"/>
+    <w:basedOn w:val="a"/>
+    <w:next w:val="a"/>
+    <w:link w:val="90"/>
     <w:uiPriority w:val="9"/>
     <w:semiHidden/>
     <w:unhideWhenUsed/>
@@ -8759,12 +9071,13 @@
       <w:color w:val="272727" w:themeColor="text1" w:themeTint="D8"/>
     </w:rPr>
   </w:style>
-  <w:style w:type="character" w:default="1" w:styleId="DefaultParagraphFont">
+  <w:style w:type="character" w:default="1" w:styleId="a0">
     <w:name w:val="Default Paragraph Font"/>
     <w:uiPriority w:val="1"/>
+    <w:semiHidden/>
     <w:unhideWhenUsed/>
   </w:style>
-  <w:style w:type="table" w:default="1" w:styleId="TableNormal">
+  <w:style w:type="table" w:default="1" w:styleId="a1">
     <w:name w:val="Normal Table"/>
     <w:uiPriority w:val="99"/>
     <w:semiHidden/>
@@ -8779,16 +9092,16 @@
       </w:tblCellMar>
     </w:tblPr>
   </w:style>
-  <w:style w:type="numbering" w:default="1" w:styleId="NoList">
+  <w:style w:type="numbering" w:default="1" w:styleId="a2">
     <w:name w:val="No List"/>
     <w:uiPriority w:val="99"/>
     <w:semiHidden/>
     <w:unhideWhenUsed/>
   </w:style>
-  <w:style w:type="character" w:customStyle="1" w:styleId="Heading1Char">
-    <w:name w:val="Heading 1 Char"/>
-    <w:basedOn w:val="DefaultParagraphFont"/>
-    <w:link w:val="Heading1"/>
+  <w:style w:type="character" w:customStyle="1" w:styleId="10">
+    <w:name w:val="標題 1 字元"/>
+    <w:basedOn w:val="a0"/>
+    <w:link w:val="1"/>
     <w:uiPriority w:val="9"/>
     <w:rsid w:val="0018685D"/>
     <w:rPr>
@@ -8798,10 +9111,10 @@
       <w:szCs w:val="40"/>
     </w:rPr>
   </w:style>
-  <w:style w:type="character" w:customStyle="1" w:styleId="Heading2Char">
-    <w:name w:val="Heading 2 Char"/>
-    <w:basedOn w:val="DefaultParagraphFont"/>
-    <w:link w:val="Heading2"/>
+  <w:style w:type="character" w:customStyle="1" w:styleId="20">
+    <w:name w:val="標題 2 字元"/>
+    <w:basedOn w:val="a0"/>
+    <w:link w:val="2"/>
     <w:uiPriority w:val="9"/>
     <w:semiHidden/>
     <w:rsid w:val="0018685D"/>
@@ -8812,10 +9125,10 @@
       <w:szCs w:val="32"/>
     </w:rPr>
   </w:style>
-  <w:style w:type="character" w:customStyle="1" w:styleId="Heading3Char">
-    <w:name w:val="Heading 3 Char"/>
-    <w:basedOn w:val="DefaultParagraphFont"/>
-    <w:link w:val="Heading3"/>
+  <w:style w:type="character" w:customStyle="1" w:styleId="30">
+    <w:name w:val="標題 3 字元"/>
+    <w:basedOn w:val="a0"/>
+    <w:link w:val="3"/>
     <w:uiPriority w:val="9"/>
     <w:semiHidden/>
     <w:rsid w:val="0018685D"/>
@@ -8826,10 +9139,10 @@
       <w:szCs w:val="28"/>
     </w:rPr>
   </w:style>
-  <w:style w:type="character" w:customStyle="1" w:styleId="Heading4Char">
-    <w:name w:val="Heading 4 Char"/>
-    <w:basedOn w:val="DefaultParagraphFont"/>
-    <w:link w:val="Heading4"/>
+  <w:style w:type="character" w:customStyle="1" w:styleId="40">
+    <w:name w:val="標題 4 字元"/>
+    <w:basedOn w:val="a0"/>
+    <w:link w:val="4"/>
     <w:uiPriority w:val="9"/>
     <w:semiHidden/>
     <w:rsid w:val="0018685D"/>
@@ -8840,10 +9153,10 @@
       <w:color w:val="0F4761" w:themeColor="accent1" w:themeShade="BF"/>
     </w:rPr>
   </w:style>
-  <w:style w:type="character" w:customStyle="1" w:styleId="Heading5Char">
-    <w:name w:val="Heading 5 Char"/>
-    <w:basedOn w:val="DefaultParagraphFont"/>
-    <w:link w:val="Heading5"/>
+  <w:style w:type="character" w:customStyle="1" w:styleId="50">
+    <w:name w:val="標題 5 字元"/>
+    <w:basedOn w:val="a0"/>
+    <w:link w:val="5"/>
     <w:uiPriority w:val="9"/>
     <w:semiHidden/>
     <w:rsid w:val="0018685D"/>
@@ -8852,10 +9165,10 @@
       <w:color w:val="0F4761" w:themeColor="accent1" w:themeShade="BF"/>
     </w:rPr>
   </w:style>
-  <w:style w:type="character" w:customStyle="1" w:styleId="Heading6Char">
-    <w:name w:val="Heading 6 Char"/>
-    <w:basedOn w:val="DefaultParagraphFont"/>
-    <w:link w:val="Heading6"/>
+  <w:style w:type="character" w:customStyle="1" w:styleId="60">
+    <w:name w:val="標題 6 字元"/>
+    <w:basedOn w:val="a0"/>
+    <w:link w:val="6"/>
     <w:uiPriority w:val="9"/>
     <w:semiHidden/>
     <w:rsid w:val="0018685D"/>
@@ -8866,10 +9179,10 @@
       <w:color w:val="595959" w:themeColor="text1" w:themeTint="A6"/>
     </w:rPr>
   </w:style>
-  <w:style w:type="character" w:customStyle="1" w:styleId="Heading7Char">
-    <w:name w:val="Heading 7 Char"/>
-    <w:basedOn w:val="DefaultParagraphFont"/>
-    <w:link w:val="Heading7"/>
+  <w:style w:type="character" w:customStyle="1" w:styleId="70">
+    <w:name w:val="標題 7 字元"/>
+    <w:basedOn w:val="a0"/>
+    <w:link w:val="7"/>
     <w:uiPriority w:val="9"/>
     <w:semiHidden/>
     <w:rsid w:val="0018685D"/>
@@ -8878,10 +9191,10 @@
       <w:color w:val="595959" w:themeColor="text1" w:themeTint="A6"/>
     </w:rPr>
   </w:style>
-  <w:style w:type="character" w:customStyle="1" w:styleId="Heading8Char">
-    <w:name w:val="Heading 8 Char"/>
-    <w:basedOn w:val="DefaultParagraphFont"/>
-    <w:link w:val="Heading8"/>
+  <w:style w:type="character" w:customStyle="1" w:styleId="80">
+    <w:name w:val="標題 8 字元"/>
+    <w:basedOn w:val="a0"/>
+    <w:link w:val="8"/>
     <w:uiPriority w:val="9"/>
     <w:semiHidden/>
     <w:rsid w:val="0018685D"/>
@@ -8892,10 +9205,10 @@
       <w:color w:val="272727" w:themeColor="text1" w:themeTint="D8"/>
     </w:rPr>
   </w:style>
-  <w:style w:type="character" w:customStyle="1" w:styleId="Heading9Char">
-    <w:name w:val="Heading 9 Char"/>
-    <w:basedOn w:val="DefaultParagraphFont"/>
-    <w:link w:val="Heading9"/>
+  <w:style w:type="character" w:customStyle="1" w:styleId="90">
+    <w:name w:val="標題 9 字元"/>
+    <w:basedOn w:val="a0"/>
+    <w:link w:val="9"/>
     <w:uiPriority w:val="9"/>
     <w:semiHidden/>
     <w:rsid w:val="0018685D"/>
@@ -8904,11 +9217,11 @@
       <w:color w:val="272727" w:themeColor="text1" w:themeTint="D8"/>
     </w:rPr>
   </w:style>
-  <w:style w:type="paragraph" w:styleId="Title">
+  <w:style w:type="paragraph" w:styleId="a3">
     <w:name w:val="Title"/>
-    <w:basedOn w:val="Normal"/>
-    <w:next w:val="Normal"/>
-    <w:link w:val="TitleChar"/>
+    <w:basedOn w:val="a"/>
+    <w:next w:val="a"/>
+    <w:link w:val="a4"/>
     <w:uiPriority w:val="10"/>
     <w:qFormat/>
     <w:rsid w:val="0018685D"/>
@@ -8924,10 +9237,10 @@
       <w:szCs w:val="56"/>
     </w:rPr>
   </w:style>
-  <w:style w:type="character" w:customStyle="1" w:styleId="TitleChar">
-    <w:name w:val="Title Char"/>
-    <w:basedOn w:val="DefaultParagraphFont"/>
-    <w:link w:val="Title"/>
+  <w:style w:type="character" w:customStyle="1" w:styleId="a4">
+    <w:name w:val="標題 字元"/>
+    <w:basedOn w:val="a0"/>
+    <w:link w:val="a3"/>
     <w:uiPriority w:val="10"/>
     <w:rsid w:val="0018685D"/>
     <w:rPr>
@@ -8938,11 +9251,11 @@
       <w:szCs w:val="56"/>
     </w:rPr>
   </w:style>
-  <w:style w:type="paragraph" w:styleId="Subtitle">
+  <w:style w:type="paragraph" w:styleId="a5">
     <w:name w:val="Subtitle"/>
-    <w:basedOn w:val="Normal"/>
-    <w:next w:val="Normal"/>
-    <w:link w:val="SubtitleChar"/>
+    <w:basedOn w:val="a"/>
+    <w:next w:val="a"/>
+    <w:link w:val="a6"/>
     <w:uiPriority w:val="11"/>
     <w:qFormat/>
     <w:rsid w:val="0018685D"/>
@@ -8959,10 +9272,10 @@
       <w:szCs w:val="28"/>
     </w:rPr>
   </w:style>
-  <w:style w:type="character" w:customStyle="1" w:styleId="SubtitleChar">
-    <w:name w:val="Subtitle Char"/>
-    <w:basedOn w:val="DefaultParagraphFont"/>
-    <w:link w:val="Subtitle"/>
+  <w:style w:type="character" w:customStyle="1" w:styleId="a6">
+    <w:name w:val="副標題 字元"/>
+    <w:basedOn w:val="a0"/>
+    <w:link w:val="a5"/>
     <w:uiPriority w:val="11"/>
     <w:rsid w:val="0018685D"/>
     <w:rPr>
@@ -8973,11 +9286,11 @@
       <w:szCs w:val="28"/>
     </w:rPr>
   </w:style>
-  <w:style w:type="paragraph" w:styleId="Quote">
+  <w:style w:type="paragraph" w:styleId="a7">
     <w:name w:val="Quote"/>
-    <w:basedOn w:val="Normal"/>
-    <w:next w:val="Normal"/>
-    <w:link w:val="QuoteChar"/>
+    <w:basedOn w:val="a"/>
+    <w:next w:val="a"/>
+    <w:link w:val="a8"/>
     <w:uiPriority w:val="29"/>
     <w:qFormat/>
     <w:rsid w:val="0018685D"/>
@@ -8991,10 +9304,10 @@
       <w:color w:val="404040" w:themeColor="text1" w:themeTint="BF"/>
     </w:rPr>
   </w:style>
-  <w:style w:type="character" w:customStyle="1" w:styleId="QuoteChar">
-    <w:name w:val="Quote Char"/>
-    <w:basedOn w:val="DefaultParagraphFont"/>
-    <w:link w:val="Quote"/>
+  <w:style w:type="character" w:customStyle="1" w:styleId="a8">
+    <w:name w:val="引文 字元"/>
+    <w:basedOn w:val="a0"/>
+    <w:link w:val="a7"/>
     <w:uiPriority w:val="29"/>
     <w:rsid w:val="0018685D"/>
     <w:rPr>
@@ -9003,9 +9316,9 @@
       <w:color w:val="404040" w:themeColor="text1" w:themeTint="BF"/>
     </w:rPr>
   </w:style>
-  <w:style w:type="paragraph" w:styleId="ListParagraph">
+  <w:style w:type="paragraph" w:styleId="a9">
     <w:name w:val="List Paragraph"/>
-    <w:basedOn w:val="Normal"/>
+    <w:basedOn w:val="a"/>
     <w:uiPriority w:val="34"/>
     <w:qFormat/>
     <w:rsid w:val="0018685D"/>
@@ -9014,9 +9327,9 @@
       <w:contextualSpacing/>
     </w:pPr>
   </w:style>
-  <w:style w:type="character" w:styleId="IntenseEmphasis">
+  <w:style w:type="character" w:styleId="aa">
     <w:name w:val="Intense Emphasis"/>
-    <w:basedOn w:val="DefaultParagraphFont"/>
+    <w:basedOn w:val="a0"/>
     <w:uiPriority w:val="21"/>
     <w:qFormat/>
     <w:rsid w:val="0018685D"/>
@@ -9026,11 +9339,11 @@
       <w:color w:val="0F4761" w:themeColor="accent1" w:themeShade="BF"/>
     </w:rPr>
   </w:style>
-  <w:style w:type="paragraph" w:styleId="IntenseQuote">
+  <w:style w:type="paragraph" w:styleId="ab">
     <w:name w:val="Intense Quote"/>
-    <w:basedOn w:val="Normal"/>
-    <w:next w:val="Normal"/>
-    <w:link w:val="IntenseQuoteChar"/>
+    <w:basedOn w:val="a"/>
+    <w:next w:val="a"/>
+    <w:link w:val="ac"/>
     <w:uiPriority w:val="30"/>
     <w:qFormat/>
     <w:rsid w:val="0018685D"/>
@@ -9049,10 +9362,10 @@
       <w:color w:val="0F4761" w:themeColor="accent1" w:themeShade="BF"/>
     </w:rPr>
   </w:style>
-  <w:style w:type="character" w:customStyle="1" w:styleId="IntenseQuoteChar">
-    <w:name w:val="Intense Quote Char"/>
-    <w:basedOn w:val="DefaultParagraphFont"/>
-    <w:link w:val="IntenseQuote"/>
+  <w:style w:type="character" w:customStyle="1" w:styleId="ac">
+    <w:name w:val="鮮明引文 字元"/>
+    <w:basedOn w:val="a0"/>
+    <w:link w:val="ab"/>
     <w:uiPriority w:val="30"/>
     <w:rsid w:val="0018685D"/>
     <w:rPr>
@@ -9061,9 +9374,9 @@
       <w:color w:val="0F4761" w:themeColor="accent1" w:themeShade="BF"/>
     </w:rPr>
   </w:style>
-  <w:style w:type="character" w:styleId="IntenseReference">
+  <w:style w:type="character" w:styleId="ad">
     <w:name w:val="Intense Reference"/>
-    <w:basedOn w:val="DefaultParagraphFont"/>
+    <w:basedOn w:val="a0"/>
     <w:uiPriority w:val="32"/>
     <w:qFormat/>
     <w:rsid w:val="0018685D"/>
@@ -9075,11 +9388,10 @@
       <w:spacing w:val="5"/>
     </w:rPr>
   </w:style>
-  <w:style w:type="paragraph" w:styleId="NormalWeb">
+  <w:style w:type="paragraph" w:styleId="Web">
     <w:name w:val="Normal (Web)"/>
-    <w:basedOn w:val="Normal"/>
+    <w:basedOn w:val="a"/>
     <w:uiPriority w:val="99"/>
-    <w:semiHidden/>
     <w:unhideWhenUsed/>
     <w:rsid w:val="00C44A9E"/>
     <w:pPr>
@@ -9094,10 +9406,10 @@
       <w14:ligatures w14:val="none"/>
     </w:rPr>
   </w:style>
-  <w:style w:type="paragraph" w:styleId="Header">
+  <w:style w:type="paragraph" w:styleId="ae">
     <w:name w:val="header"/>
-    <w:basedOn w:val="Normal"/>
-    <w:link w:val="HeaderChar"/>
+    <w:basedOn w:val="a"/>
+    <w:link w:val="af"/>
     <w:uiPriority w:val="99"/>
     <w:unhideWhenUsed/>
     <w:rsid w:val="00B11B3A"/>
@@ -9109,17 +9421,17 @@
       <w:spacing w:after="0" w:line="240" w:lineRule="auto"/>
     </w:pPr>
   </w:style>
-  <w:style w:type="character" w:customStyle="1" w:styleId="HeaderChar">
-    <w:name w:val="Header Char"/>
-    <w:basedOn w:val="DefaultParagraphFont"/>
-    <w:link w:val="Header"/>
+  <w:style w:type="character" w:customStyle="1" w:styleId="af">
+    <w:name w:val="頁首 字元"/>
+    <w:basedOn w:val="a0"/>
+    <w:link w:val="ae"/>
     <w:uiPriority w:val="99"/>
     <w:rsid w:val="00B11B3A"/>
   </w:style>
-  <w:style w:type="paragraph" w:styleId="Footer">
+  <w:style w:type="paragraph" w:styleId="af0">
     <w:name w:val="footer"/>
-    <w:basedOn w:val="Normal"/>
-    <w:link w:val="FooterChar"/>
+    <w:basedOn w:val="a"/>
+    <w:link w:val="af1"/>
     <w:uiPriority w:val="99"/>
     <w:unhideWhenUsed/>
     <w:rsid w:val="00B11B3A"/>
@@ -9131,12 +9443,41 @@
       <w:spacing w:after="0" w:line="240" w:lineRule="auto"/>
     </w:pPr>
   </w:style>
-  <w:style w:type="character" w:customStyle="1" w:styleId="FooterChar">
-    <w:name w:val="Footer Char"/>
-    <w:basedOn w:val="DefaultParagraphFont"/>
-    <w:link w:val="Footer"/>
+  <w:style w:type="character" w:customStyle="1" w:styleId="af1">
+    <w:name w:val="頁尾 字元"/>
+    <w:basedOn w:val="a0"/>
+    <w:link w:val="af0"/>
     <w:uiPriority w:val="99"/>
     <w:rsid w:val="00B11B3A"/>
+  </w:style>
+  <w:style w:type="character" w:customStyle="1" w:styleId="apple-converted-space">
+    <w:name w:val="apple-converted-space"/>
+    <w:basedOn w:val="a0"/>
+    <w:rsid w:val="00EC50EC"/>
+  </w:style>
+  <w:style w:type="character" w:styleId="HTML">
+    <w:name w:val="HTML Code"/>
+    <w:basedOn w:val="a0"/>
+    <w:uiPriority w:val="99"/>
+    <w:semiHidden/>
+    <w:unhideWhenUsed/>
+    <w:rsid w:val="00CE6EA4"/>
+    <w:rPr>
+      <w:rFonts w:ascii="細明體" w:eastAsia="細明體" w:hAnsi="細明體" w:cs="細明體"/>
+      <w:sz w:val="24"/>
+      <w:szCs w:val="24"/>
+    </w:rPr>
+  </w:style>
+  <w:style w:type="character" w:styleId="af2">
+    <w:name w:val="Strong"/>
+    <w:basedOn w:val="a0"/>
+    <w:uiPriority w:val="22"/>
+    <w:qFormat/>
+    <w:rsid w:val="000C2019"/>
+    <w:rPr>
+      <w:b/>
+      <w:bCs/>
+    </w:rPr>
   </w:style>
 </w:styles>
 </file>

</xml_diff>